<commit_message>
Add shared circular imprint mark to book openings
Co-authored-by: arena-agent <297053741+arena-agent@users.noreply.github.com>
</commit_message>
<xml_diff>
--- a/public/books/python-absolute-beginners/edition-01/Python-for-Absolute-Beginners-The-First-Code-Series-Book-1.docx
+++ b/public/books/python-absolute-beginners/edition-01/Python-for-Absolute-Beginners-The-First-Code-Series-Book-1.docx
@@ -4,7 +4,53 @@
   <w:body>
     <w:p>
       <w:pPr>
-        <w:spacing w:after="160" w:before="1400"/>
+        <w:spacing w:after="260" w:before="900"/>
+        <w:jc w:val="center"/>
+      </w:pPr>
+      <w:r>
+        <w:drawing>
+          <wp:inline distT="0" distB="0" distL="0" distR="0">
+            <wp:extent cx="914400" cy="914400"/>
+            <wp:effectExtent t="0" r="0" b="0" l="0"/>
+            <wp:docPr id="1" name="Publisher mark" descr="Circular publisher mark showing a young scholar writing in an open book." title="Sarva Gyana Koshah Books publisher mark"/>
+            <wp:cNvGraphicFramePr>
+              <a:graphicFrameLocks xmlns:a="http://schemas.openxmlformats.org/drawingml/2006/main" noChangeAspect="1"/>
+            </wp:cNvGraphicFramePr>
+            <a:graphic xmlns:a="http://schemas.openxmlformats.org/drawingml/2006/main">
+              <a:graphicData uri="http://schemas.openxmlformats.org/drawingml/2006/picture">
+                <pic:pic xmlns:pic="http://schemas.openxmlformats.org/drawingml/2006/picture">
+                  <pic:nvPicPr>
+                    <pic:cNvPr id="0" name="" descr=""/>
+                    <pic:cNvPicPr>
+                      <a:picLocks noChangeAspect="1" noChangeArrowheads="1"/>
+                    </pic:cNvPicPr>
+                  </pic:nvPicPr>
+                  <pic:blipFill>
+                    <a:blip r:embed="rId9" cstate="none"/>
+                    <a:srcRect/>
+                    <a:stretch>
+                      <a:fillRect/>
+                    </a:stretch>
+                  </pic:blipFill>
+                  <pic:spPr bwMode="auto">
+                    <a:xfrm>
+                      <a:off x="0" y="0"/>
+                      <a:ext cx="914400" cy="914400"/>
+                    </a:xfrm>
+                    <a:prstGeom prst="rect">
+                      <a:avLst/>
+                    </a:prstGeom>
+                  </pic:spPr>
+                </pic:pic>
+              </a:graphicData>
+            </a:graphic>
+          </wp:inline>
+        </w:drawing>
+      </w:r>
+    </w:p>
+    <w:p>
+      <w:pPr>
+        <w:spacing w:after="160"/>
         <w:jc w:val="center"/>
       </w:pPr>
       <w:r>
@@ -256,7 +302,7 @@
                     </pic:cNvPicPr>
                   </pic:nvPicPr>
                   <pic:blipFill>
-                    <a:blip r:embed="rId9" cstate="none"/>
+                    <a:blip r:embed="rId10" cstate="none"/>
                     <a:srcRect/>
                     <a:stretch>
                       <a:fillRect/>
@@ -679,7 +725,7 @@
       </w:r>
     </w:p>
     <w:p>
-      <w:hyperlink w:history="1" r:id="rId882bg4gizuvvvyoft79ca">
+      <w:hyperlink w:history="1" r:id="rIdo9qhnpq_zggdrwkvbsxzq">
         <w:r>
           <w:rPr>
             <w:rStyle w:val="Hyperlink"/>
@@ -697,7 +743,7 @@
       </w:r>
     </w:p>
     <w:p>
-      <w:hyperlink w:history="1" r:id="rIdafnj-aqube8p5alouc0bz">
+      <w:hyperlink w:history="1" r:id="rId_mq_1omevfs7hrqbkfhr5">
         <w:r>
           <w:rPr>
             <w:rStyle w:val="Hyperlink"/>
@@ -808,7 +854,7 @@
                     </pic:cNvPicPr>
                   </pic:nvPicPr>
                   <pic:blipFill>
-                    <a:blip r:embed="rId10" cstate="none"/>
+                    <a:blip r:embed="rId11" cstate="none"/>
                     <a:srcRect/>
                     <a:stretch>
                       <a:fillRect/>
@@ -1233,7 +1279,7 @@
                     </pic:cNvPicPr>
                   </pic:nvPicPr>
                   <pic:blipFill>
-                    <a:blip r:embed="rId11" cstate="none"/>
+                    <a:blip r:embed="rId12" cstate="none"/>
                     <a:srcRect/>
                     <a:stretch>
                       <a:fillRect/>
@@ -2950,7 +2996,7 @@
       </w:r>
     </w:p>
     <w:p>
-      <w:hyperlink w:history="1" r:id="rIdwxqnndpw2qcndilvhfnsz">
+      <w:hyperlink w:history="1" r:id="rIdulxk9r0wyibov-a7no6f2">
         <w:r>
           <w:rPr>
             <w:rStyle w:val="Hyperlink"/>
@@ -2968,7 +3014,7 @@
       </w:r>
     </w:p>
     <w:p>
-      <w:hyperlink w:history="1" r:id="rId8t4yhp89mtl4uxdx8y3zf">
+      <w:hyperlink w:history="1" r:id="rIdepebibnbmaprvke-miypc">
         <w:r>
           <w:rPr>
             <w:rStyle w:val="Hyperlink"/>
@@ -3091,7 +3137,7 @@
                     </pic:cNvPicPr>
                   </pic:nvPicPr>
                   <pic:blipFill>
-                    <a:blip r:embed="rId12" cstate="none"/>
+                    <a:blip r:embed="rId13" cstate="none"/>
                     <a:srcRect/>
                     <a:stretch>
                       <a:fillRect/>
@@ -3548,7 +3594,7 @@
                     </pic:cNvPicPr>
                   </pic:nvPicPr>
                   <pic:blipFill>
-                    <a:blip r:embed="rId13" cstate="none"/>
+                    <a:blip r:embed="rId14" cstate="none"/>
                     <a:srcRect/>
                     <a:stretch>
                       <a:fillRect/>
@@ -6741,7 +6787,7 @@
       </w:r>
     </w:p>
     <w:p>
-      <w:hyperlink w:history="1" r:id="rIdh7uhiz8-qjikdm6fql8ig">
+      <w:hyperlink w:history="1" r:id="rIdfw11-vzn4q8lhh5mu5s7s">
         <w:r>
           <w:rPr>
             <w:rStyle w:val="Hyperlink"/>
@@ -6759,7 +6805,7 @@
       </w:r>
     </w:p>
     <w:p>
-      <w:hyperlink w:history="1" r:id="rIdd5icorvcmkr5wm9bxbwhf">
+      <w:hyperlink w:history="1" r:id="rIdral01ek5sq20z1tt-tpxw">
         <w:r>
           <w:rPr>
             <w:rStyle w:val="Hyperlink"/>
@@ -6777,7 +6823,7 @@
       </w:r>
     </w:p>
     <w:p>
-      <w:hyperlink w:history="1" r:id="rIdrvlctozazx5wek3hk7a9p">
+      <w:hyperlink w:history="1" r:id="rIdvsrcay309iocowdkcn1ok">
         <w:r>
           <w:rPr>
             <w:rStyle w:val="Hyperlink"/>
@@ -6900,7 +6946,7 @@
                     </pic:cNvPicPr>
                   </pic:nvPicPr>
                   <pic:blipFill>
-                    <a:blip r:embed="rId14" cstate="none"/>
+                    <a:blip r:embed="rId15" cstate="none"/>
                     <a:srcRect/>
                     <a:stretch>
                       <a:fillRect/>
@@ -7329,7 +7375,7 @@
                     </pic:cNvPicPr>
                   </pic:nvPicPr>
                   <pic:blipFill>
-                    <a:blip r:embed="rId15" cstate="none"/>
+                    <a:blip r:embed="rId16" cstate="none"/>
                     <a:srcRect/>
                     <a:stretch>
                       <a:fillRect/>
@@ -8735,7 +8781,7 @@
       </w:r>
     </w:p>
     <w:p>
-      <w:hyperlink w:history="1" r:id="rIdqmaiav19fx4tkyha5wmfh">
+      <w:hyperlink w:history="1" r:id="rIdqz_af2fkv0dxuibrqfllu">
         <w:r>
           <w:rPr>
             <w:rStyle w:val="Hyperlink"/>
@@ -8753,7 +8799,7 @@
       </w:r>
     </w:p>
     <w:p>
-      <w:hyperlink w:history="1" r:id="rIdljqpsnpsvbp7-giupq19b">
+      <w:hyperlink w:history="1" r:id="rIdnzennhjsxr-n18g2dgzdl">
         <w:r>
           <w:rPr>
             <w:rStyle w:val="Hyperlink"/>
@@ -8876,7 +8922,7 @@
                     </pic:cNvPicPr>
                   </pic:nvPicPr>
                   <pic:blipFill>
-                    <a:blip r:embed="rId16" cstate="none"/>
+                    <a:blip r:embed="rId17" cstate="none"/>
                     <a:srcRect/>
                     <a:stretch>
                       <a:fillRect/>
@@ -9471,7 +9517,7 @@
                     </pic:cNvPicPr>
                   </pic:nvPicPr>
                   <pic:blipFill>
-                    <a:blip r:embed="rId17" cstate="none"/>
+                    <a:blip r:embed="rId18" cstate="none"/>
                     <a:srcRect/>
                     <a:stretch>
                       <a:fillRect/>
@@ -11410,7 +11456,7 @@
       </w:r>
     </w:p>
     <w:p>
-      <w:hyperlink w:history="1" r:id="rIdfvqnh8v8j82qsp3udf6fs">
+      <w:hyperlink w:history="1" r:id="rIdxreh1quom3g01gks3c5s1">
         <w:r>
           <w:rPr>
             <w:rStyle w:val="Hyperlink"/>

</xml_diff>

<commit_message>
Replace ambiguous Python origin infographic
Co-authored-by: arena-agent <297053741+arena-agent@users.noreply.github.com>
</commit_message>
<xml_diff>
--- a/public/books/python-absolute-beginners/edition-01/Python-for-Absolute-Beginners-The-First-Code-Series-Book-1.docx
+++ b/public/books/python-absolute-beginners/edition-01/Python-for-Absolute-Beginners-The-First-Code-Series-Book-1.docx
@@ -288,7 +288,7 @@
           <wp:inline distT="0" distB="0" distL="0" distR="0">
             <wp:extent cx="5334000" cy="3552825"/>
             <wp:effectExtent t="0" r="0" b="0" l="0"/>
-            <wp:docPr id="1" name="A difficult choice leads to a simpler Python bridge and then many kinds of useful work." descr="A difficult choice leads to a simpler Python bridge and then many kinds of useful work." title="A difficult choice leads to a simpler Python bridge and then many kinds of useful work."/>
+            <wp:docPr id="1" name="A three-step infographic contrasts quick shell scripts and powerful C programs, presents Python as a readable middle path that connects to existing tools, and branches to automation, web backends, data, science and AI." descr="A three-step infographic contrasts quick shell scripts and powerful C programs, presents Python as a readable middle path that connects to existing tools, and branches to automation, web backends, data, science and AI." title="A three-step infographic contrasts quick shell scripts and powerful C programs, presents Python as a readable middle path that connects to existing tools, and branches to automation, web backends, data, science and AI."/>
             <wp:cNvGraphicFramePr>
               <a:graphicFrameLocks xmlns:a="http://schemas.openxmlformats.org/drawingml/2006/main" noChangeAspect="1"/>
             </wp:cNvGraphicFramePr>
@@ -337,71 +337,7 @@
           <w:sz w:val="19"/>
           <w:szCs w:val="19"/>
         </w:rPr>
-        <w:t xml:space="preserve">Python filled the missing middle path.</w:t>
-      </w:r>
-    </w:p>
-    <w:p>
-      <w:pPr>
-        <w:spacing w:after="120" w:line="300"/>
-      </w:pPr>
-      <w:r>
-        <w:rPr>
-          <w:b/>
-          <w:bCs/>
-          <w:color w:val="4659A7"/>
-        </w:rPr>
-        <w:t xml:space="preserve">1  </w:t>
-      </w:r>
-      <w:r>
-        <w:t xml:space="preserve">Quick scripts were useful, but some jobs outgrew them.</w:t>
-      </w:r>
-    </w:p>
-    <w:p>
-      <w:pPr>
-        <w:spacing w:after="120" w:line="300"/>
-      </w:pPr>
-      <w:r>
-        <w:rPr>
-          <w:b/>
-          <w:bCs/>
-          <w:color w:val="4659A7"/>
-        </w:rPr>
-        <w:t xml:space="preserve">2  </w:t>
-      </w:r>
-      <w:r>
-        <w:t xml:space="preserve">C offered more control, but small tools could take much more code.</w:t>
-      </w:r>
-    </w:p>
-    <w:p>
-      <w:pPr>
-        <w:spacing w:after="120" w:line="300"/>
-      </w:pPr>
-      <w:r>
-        <w:rPr>
-          <w:b/>
-          <w:bCs/>
-          <w:color w:val="4659A7"/>
-        </w:rPr>
-        <w:t xml:space="preserve">3  </w:t>
-      </w:r>
-      <w:r>
-        <w:t xml:space="preserve">Python made many everyday programs easier to read and build.</w:t>
-      </w:r>
-    </w:p>
-    <w:p>
-      <w:pPr>
-        <w:spacing w:after="120" w:line="300"/>
-      </w:pPr>
-      <w:r>
-        <w:rPr>
-          <w:b/>
-          <w:bCs/>
-          <w:color w:val="4659A7"/>
-        </w:rPr>
-        <w:t xml:space="preserve">4  </w:t>
-      </w:r>
-      <w:r>
-        <w:t xml:space="preserve">The same language now supports automation, websites, data, science and AI.</w:t>
+        <w:t xml:space="preserve">Python offered a clearer middle path for many useful programs while keeping access to powerful tools.</w:t>
       </w:r>
     </w:p>
     <w:p>
@@ -725,7 +661,7 @@
       </w:r>
     </w:p>
     <w:p>
-      <w:hyperlink w:history="1" r:id="rIdo9qhnpq_zggdrwkvbsxzq">
+      <w:hyperlink w:history="1" r:id="rIdxlpuht7o2mvhsxgmegga8">
         <w:r>
           <w:rPr>
             <w:rStyle w:val="Hyperlink"/>
@@ -743,7 +679,7 @@
       </w:r>
     </w:p>
     <w:p>
-      <w:hyperlink w:history="1" r:id="rId_mq_1omevfs7hrqbkfhr5">
+      <w:hyperlink w:history="1" r:id="rIdlok73qotefpwrk0krm9pc">
         <w:r>
           <w:rPr>
             <w:rStyle w:val="Hyperlink"/>
@@ -2996,7 +2932,7 @@
       </w:r>
     </w:p>
     <w:p>
-      <w:hyperlink w:history="1" r:id="rIdulxk9r0wyibov-a7no6f2">
+      <w:hyperlink w:history="1" r:id="rIdmsu5r7edrqbkehl1vjp5v">
         <w:r>
           <w:rPr>
             <w:rStyle w:val="Hyperlink"/>
@@ -3014,7 +2950,7 @@
       </w:r>
     </w:p>
     <w:p>
-      <w:hyperlink w:history="1" r:id="rIdepebibnbmaprvke-miypc">
+      <w:hyperlink w:history="1" r:id="rIdd6t22bx_dj5dihyayzt9y">
         <w:r>
           <w:rPr>
             <w:rStyle w:val="Hyperlink"/>
@@ -6787,7 +6723,7 @@
       </w:r>
     </w:p>
     <w:p>
-      <w:hyperlink w:history="1" r:id="rIdfw11-vzn4q8lhh5mu5s7s">
+      <w:hyperlink w:history="1" r:id="rIdsdkn0lkj8efbxq7sylfa6">
         <w:r>
           <w:rPr>
             <w:rStyle w:val="Hyperlink"/>
@@ -6805,7 +6741,7 @@
       </w:r>
     </w:p>
     <w:p>
-      <w:hyperlink w:history="1" r:id="rIdral01ek5sq20z1tt-tpxw">
+      <w:hyperlink w:history="1" r:id="rId2xc6bxtlhbdokqciax5l8">
         <w:r>
           <w:rPr>
             <w:rStyle w:val="Hyperlink"/>
@@ -6823,7 +6759,7 @@
       </w:r>
     </w:p>
     <w:p>
-      <w:hyperlink w:history="1" r:id="rIdvsrcay309iocowdkcn1ok">
+      <w:hyperlink w:history="1" r:id="rId5mi2dpaxd0d6arl9b6psf">
         <w:r>
           <w:rPr>
             <w:rStyle w:val="Hyperlink"/>
@@ -8781,7 +8717,7 @@
       </w:r>
     </w:p>
     <w:p>
-      <w:hyperlink w:history="1" r:id="rIdqz_af2fkv0dxuibrqfllu">
+      <w:hyperlink w:history="1" r:id="rId08nd5tu-zuffsw3iqfwsc">
         <w:r>
           <w:rPr>
             <w:rStyle w:val="Hyperlink"/>
@@ -8799,7 +8735,7 @@
       </w:r>
     </w:p>
     <w:p>
-      <w:hyperlink w:history="1" r:id="rIdnzennhjsxr-n18g2dgzdl">
+      <w:hyperlink w:history="1" r:id="rId--r3btjdocnqnxafpenhk">
         <w:r>
           <w:rPr>
             <w:rStyle w:val="Hyperlink"/>
@@ -11456,7 +11392,7 @@
       </w:r>
     </w:p>
     <w:p>
-      <w:hyperlink w:history="1" r:id="rIdxreh1quom3g01gks3c5s1">
+      <w:hyperlink w:history="1" r:id="rIdiyp2bssxgl0g6ggs-xmkf">
         <w:r>
           <w:rPr>
             <w:rStyle w:val="Hyperlink"/>

</xml_diff>

<commit_message>
Improve Preface readability and remove usage page
Co-authored-by: arena-agent <297053741+arena-agent@users.noreply.github.com>
</commit_message>
<xml_diff>
--- a/public/books/python-absolute-beginners/edition-01/Python-for-Absolute-Beginners-The-First-Code-Series-Book-1.docx
+++ b/public/books/python-absolute-beginners/edition-01/Python-for-Absolute-Beginners-The-First-Code-Series-Book-1.docx
@@ -173,7 +173,7 @@
           <w:iCs/>
           <w:color w:val="4659A7"/>
         </w:rPr>
-        <w:t xml:space="preserve">To my parents and grandparents — whose love, patience, and unwavering belief made this journey possible. Everything I build carries your blessings. This first book is for you.</w:t>
+        <w:t xml:space="preserve">To my parents and grandparents, whose love, patience, and unwavering belief made this journey possible. Everything I build carries your blessings. This first book is for you.</w:t>
       </w:r>
     </w:p>
     <w:p>
@@ -276,7 +276,7 @@
           <w:bCs/>
           <w:color w:val="4659A7"/>
         </w:rPr>
-        <w:t xml:space="preserve">Preface — Why Was Python Needed?</w:t>
+        <w:t xml:space="preserve">Preface: Why Was Python Needed?</w:t>
       </w:r>
     </w:p>
     <w:p>
@@ -286,9 +286,9 @@
       <w:r>
         <w:drawing>
           <wp:inline distT="0" distB="0" distL="0" distR="0">
-            <wp:extent cx="5334000" cy="3552825"/>
+            <wp:extent cx="5334000" cy="2667000"/>
             <wp:effectExtent t="0" r="0" b="0" l="0"/>
-            <wp:docPr id="1" name="A three-step infographic contrasts quick shell scripts and powerful C programs, presents Python as a readable middle path that connects to existing tools, and branches to automation, web backends, data, science and AI." descr="A three-step infographic contrasts quick shell scripts and powerful C programs, presents Python as a readable middle path that connects to existing tools, and branches to automation, web backends, data, science and AI." title="A three-step infographic contrasts quick shell scripts and powerful C programs, presents Python as a readable middle path that connects to existing tools, and branches to automation, web backends, data, science and AI."/>
+            <wp:docPr id="1" name="Shell scripts are quick for small system tasks but harder to grow. C programs provide control and speed but can require more code for small tools. An arrow leads to Python, which offers readable code, reusable modules and connections to existing tools." descr="Shell scripts are quick for small system tasks but harder to grow. C programs provide control and speed but can require more code for small tools. An arrow leads to Python, which offers readable code, reusable modules and connections to existing tools." title="Shell scripts are quick for small system tasks but harder to grow. C programs provide control and speed but can require more code for small tools. An arrow leads to Python, which offers readable code, reusable modules and connections to existing tools."/>
             <wp:cNvGraphicFramePr>
               <a:graphicFrameLocks xmlns:a="http://schemas.openxmlformats.org/drawingml/2006/main" noChangeAspect="1"/>
             </wp:cNvGraphicFramePr>
@@ -311,7 +311,7 @@
                   <pic:spPr bwMode="auto">
                     <a:xfrm>
                       <a:off x="0" y="0"/>
-                      <a:ext cx="5334000" cy="3552825"/>
+                      <a:ext cx="5334000" cy="2667000"/>
                     </a:xfrm>
                     <a:prstGeom prst="rect">
                       <a:avLst/>
@@ -337,7 +337,7 @@
           <w:sz w:val="19"/>
           <w:szCs w:val="19"/>
         </w:rPr>
-        <w:t xml:space="preserve">Python offered a clearer middle path for many useful programs while keeping access to powerful tools.</w:t>
+        <w:t xml:space="preserve">Python offered a practical middle path between quick scripts and larger systems programs.</w:t>
       </w:r>
     </w:p>
     <w:p>
@@ -509,6 +509,67 @@
     </w:tbl>
     <w:p>
       <w:pPr>
+        <w:jc w:val="center"/>
+      </w:pPr>
+      <w:r>
+        <w:drawing>
+          <wp:inline distT="0" distB="0" distL="0" distR="0">
+            <wp:extent cx="5334000" cy="1952625"/>
+            <wp:effectExtent t="0" r="0" b="0" l="0"/>
+            <wp:docPr id="1" name="Five large labeled cards show areas Python can support: automation, web backends, data, science and artificial intelligence. A note explains that specialized tools are added after learning the language." descr="Five large labeled cards show areas Python can support: automation, web backends, data, science and artificial intelligence. A note explains that specialized tools are added after learning the language." title="Five large labeled cards show areas Python can support: automation, web backends, data, science and artificial intelligence. A note explains that specialized tools are added after learning the language."/>
+            <wp:cNvGraphicFramePr>
+              <a:graphicFrameLocks xmlns:a="http://schemas.openxmlformats.org/drawingml/2006/main" noChangeAspect="1"/>
+            </wp:cNvGraphicFramePr>
+            <a:graphic xmlns:a="http://schemas.openxmlformats.org/drawingml/2006/main">
+              <a:graphicData uri="http://schemas.openxmlformats.org/drawingml/2006/picture">
+                <pic:pic xmlns:pic="http://schemas.openxmlformats.org/drawingml/2006/picture">
+                  <pic:nvPicPr>
+                    <pic:cNvPr id="0" name="" descr=""/>
+                    <pic:cNvPicPr>
+                      <a:picLocks noChangeAspect="1" noChangeArrowheads="1"/>
+                    </pic:cNvPicPr>
+                  </pic:nvPicPr>
+                  <pic:blipFill>
+                    <a:blip r:embed="rId11" cstate="none"/>
+                    <a:srcRect/>
+                    <a:stretch>
+                      <a:fillRect/>
+                    </a:stretch>
+                  </pic:blipFill>
+                  <pic:spPr bwMode="auto">
+                    <a:xfrm>
+                      <a:off x="0" y="0"/>
+                      <a:ext cx="5334000" cy="1952625"/>
+                    </a:xfrm>
+                    <a:prstGeom prst="rect">
+                      <a:avLst/>
+                    </a:prstGeom>
+                  </pic:spPr>
+                </pic:pic>
+              </a:graphicData>
+            </a:graphic>
+          </wp:inline>
+        </w:drawing>
+      </w:r>
+    </w:p>
+    <w:p>
+      <w:pPr>
+        <w:spacing w:after="120" w:line="300"/>
+        <w:jc w:val="center"/>
+      </w:pPr>
+      <w:r>
+        <w:rPr>
+          <w:i/>
+          <w:iCs/>
+          <w:color w:val="5B6575"/>
+          <w:sz w:val="19"/>
+          <w:szCs w:val="19"/>
+        </w:rPr>
+        <w:t xml:space="preserve">Python starts as a language and gains specialized capabilities through libraries and packages.</w:t>
+      </w:r>
+    </w:p>
+    <w:p>
+      <w:pPr>
         <w:pStyle w:val="Heading2"/>
         <w:keepNext/>
         <w:spacing w:after="100" w:before="240"/>
@@ -661,7 +722,7 @@
       </w:r>
     </w:p>
     <w:p>
-      <w:hyperlink w:history="1" r:id="rIdxlpuht7o2mvhsxgmegga8">
+      <w:hyperlink w:history="1" r:id="rIdl5w4qt8chopxsct0cwsl7">
         <w:r>
           <w:rPr>
             <w:rStyle w:val="Hyperlink"/>
@@ -675,11 +736,11 @@
           <w:sz w:val="18"/>
           <w:szCs w:val="18"/>
         </w:rPr>
-        <w:t xml:space="preserve"> — https://docs.python.org/3/faq/general.html</w:t>
-      </w:r>
-    </w:p>
-    <w:p>
-      <w:hyperlink w:history="1" r:id="rIdlok73qotefpwrk0krm9pc">
+        <w:t xml:space="preserve">: https://docs.python.org/3/faq/general.html</w:t>
+      </w:r>
+    </w:p>
+    <w:p>
+      <w:hyperlink w:history="1" r:id="rIdwuoxaudxjaidgcoy6fg7d">
         <w:r>
           <w:rPr>
             <w:rStyle w:val="Hyperlink"/>
@@ -693,51 +754,7 @@
           <w:sz w:val="18"/>
           <w:szCs w:val="18"/>
         </w:rPr>
-        <w:t xml:space="preserve"> — https://www.python.org/doc/essays/omg-darpa-mcc-position/</w:t>
-      </w:r>
-    </w:p>
-    <w:p>
-      <w:r>
-        <w:br w:type="page"/>
-      </w:r>
-    </w:p>
-    <w:p>
-      <w:pPr>
-        <w:pStyle w:val="Heading1"/>
-        <w:keepNext/>
-        <w:spacing w:after="100" w:before="240"/>
-      </w:pPr>
-      <w:r>
-        <w:rPr>
-          <w:b/>
-          <w:bCs/>
-          <w:color w:val="4659A7"/>
-        </w:rPr>
-        <w:t xml:space="preserve">How to use this book</w:t>
-      </w:r>
-    </w:p>
-    <w:p>
-      <w:pPr>
-        <w:spacing w:after="120" w:line="300"/>
-      </w:pPr>
-      <w:r>
-        <w:t xml:space="preserve">First, make a guess. Then run the code. Finally, compare what happened with your guess.</w:t>
-      </w:r>
-    </w:p>
-    <w:p>
-      <w:pPr>
-        <w:spacing w:after="120" w:line="300"/>
-      </w:pPr>
-      <w:r>
-        <w:t xml:space="preserve">In Web View, buttons reveal answers and visualizers move one step at a time. In Book View, every answer and every step is already visible.</w:t>
-      </w:r>
-    </w:p>
-    <w:p>
-      <w:pPr>
-        <w:spacing w:after="120" w:line="300"/>
-      </w:pPr>
-      <w:r>
-        <w:t xml:space="preserve">Type the code yourself. Small typing mistakes teach you how Python responds.</w:t>
+        <w:t xml:space="preserve">: https://www.python.org/doc/essays/omg-darpa-mcc-position/</w:t>
       </w:r>
     </w:p>
     <w:p>
@@ -751,7 +768,7 @@
           <w:bCs/>
           <w:color w:val="263A67"/>
         </w:rPr>
-        <w:t xml:space="preserve">Lesson 1: Your First Program — Hello, World!</w:t>
+        <w:t xml:space="preserve">Lesson 1: Your First Program: Hello, World!</w:t>
       </w:r>
     </w:p>
     <w:p>
@@ -764,7 +781,7 @@
           <w:iCs/>
           <w:color w:val="596579"/>
         </w:rPr>
-        <w:t xml:space="preserve">We begin with an empty file and end with a real result—understanding every character we typed.</w:t>
+        <w:t xml:space="preserve">We begin with an empty file and end with a real result, understanding every character we typed.</w:t>
       </w:r>
     </w:p>
     <w:p>
@@ -790,7 +807,7 @@
                     </pic:cNvPicPr>
                   </pic:nvPicPr>
                   <pic:blipFill>
-                    <a:blip r:embed="rId11" cstate="none"/>
+                    <a:blip r:embed="rId12" cstate="none"/>
                     <a:srcRect/>
                     <a:stretch>
                       <a:fillRect/>
@@ -1038,7 +1055,7 @@
               <w:t xml:space="preserve">Answer: </w:t>
             </w:r>
             <w:r>
-              <w:t xml:space="preserve">We wrap the characters in quotes. Quotes turn Hello into a string—a piece of text.</w:t>
+              <w:t xml:space="preserve">We wrap the characters in quotes. Quotes turn Hello into a string, a piece of text.</w:t>
             </w:r>
           </w:p>
         </w:tc>
@@ -1056,7 +1073,7 @@
           <w:bCs/>
           <w:color w:val="4659A7"/>
         </w:rPr>
-        <w:t xml:space="preserve">Step 1 — What is a program?</w:t>
+        <w:t xml:space="preserve">Step 1: What is a program?</w:t>
       </w:r>
     </w:p>
     <w:p>
@@ -1163,7 +1180,7 @@
           <w:bCs/>
           <w:color w:val="4659A7"/>
         </w:rPr>
-        <w:t xml:space="preserve">Step 2 — Meet every character</w:t>
+        <w:t xml:space="preserve">Step 2: Meet every character</w:t>
       </w:r>
     </w:p>
     <w:p>
@@ -1189,7 +1206,7 @@
         <w:t xml:space="preserve">built-in function</w:t>
       </w:r>
       <w:r>
-        <w:t xml:space="preserve">—a ready-made action supplied by Python. The round brackets call that action. The quotes mark text. The exclamation mark and comma inside the quotes are ordinary characters, so Python displays them too.</w:t>
+        <w:t xml:space="preserve">, a ready-made action supplied by Python. The round brackets call that action. The quotes mark text. The exclamation mark and comma inside the quotes are ordinary characters, so Python displays them too.</w:t>
       </w:r>
     </w:p>
     <w:p>
@@ -1215,7 +1232,7 @@
                     </pic:cNvPicPr>
                   </pic:nvPicPr>
                   <pic:blipFill>
-                    <a:blip r:embed="rId12" cstate="none"/>
+                    <a:blip r:embed="rId13" cstate="none"/>
                     <a:srcRect/>
                     <a:stretch>
                       <a:fillRect/>
@@ -1542,7 +1559,7 @@
           <w:bCs/>
           <w:color w:val="4659A7"/>
         </w:rPr>
-        <w:t xml:space="preserve">Step 3 — Plan before we type</w:t>
+        <w:t xml:space="preserve">Step 3: Plan before we type</w:t>
       </w:r>
     </w:p>
     <w:p>
@@ -1660,7 +1677,7 @@
           <w:bCs/>
           <w:color w:val="4659A7"/>
         </w:rPr>
-        <w:t xml:space="preserve">Step 4 — Write the code</w:t>
+        <w:t xml:space="preserve">Step 4: Write the code</w:t>
       </w:r>
     </w:p>
     <w:p>
@@ -1858,7 +1875,7 @@
           <w:bCs/>
           <w:color w:val="4659A7"/>
         </w:rPr>
-        <w:t xml:space="preserve">Step 5 — Watch the instruction become output</w:t>
+        <w:t xml:space="preserve">Step 5: Watch the instruction become output</w:t>
       </w:r>
     </w:p>
     <w:p>
@@ -2197,7 +2214,7 @@
                 <w:bCs/>
                 <w:color w:val="168A8A"/>
               </w:rPr>
-              <w:t xml:space="preserve">We did not ask the computer to understand a greeting. We gave Python one exact value and one exact action—and a visible result came back.</w:t>
+              <w:t xml:space="preserve">We did not ask the computer to understand a greeting. We gave Python one exact value and one exact action, and a visible result came back.</w:t>
             </w:r>
           </w:p>
         </w:tc>
@@ -2215,7 +2232,7 @@
           <w:bCs/>
           <w:color w:val="4659A7"/>
         </w:rPr>
-        <w:t xml:space="preserve">Step 6 — Make it yours</w:t>
+        <w:t xml:space="preserve">Step 6: Make it yours</w:t>
       </w:r>
     </w:p>
     <w:p>
@@ -2332,7 +2349,7 @@
           <w:bCs/>
           <w:color w:val="4659A7"/>
         </w:rPr>
-        <w:t xml:space="preserve">Step 7 — Learn from the mistakes</w:t>
+        <w:t xml:space="preserve">Step 7: Learn from the mistakes</w:t>
       </w:r>
     </w:p>
     <w:tbl>
@@ -2932,7 +2949,7 @@
       </w:r>
     </w:p>
     <w:p>
-      <w:hyperlink w:history="1" r:id="rIdmsu5r7edrqbkehl1vjp5v">
+      <w:hyperlink w:history="1" r:id="rId7jk3-slydeqp1nmcnfgj5">
         <w:r>
           <w:rPr>
             <w:rStyle w:val="Hyperlink"/>
@@ -2946,11 +2963,11 @@
           <w:sz w:val="18"/>
           <w:szCs w:val="18"/>
         </w:rPr>
-        <w:t xml:space="preserve"> — https://docs.python.org/3/tutorial/introduction.html</w:t>
-      </w:r>
-    </w:p>
-    <w:p>
-      <w:hyperlink w:history="1" r:id="rIdd6t22bx_dj5dihyayzt9y">
+        <w:t xml:space="preserve">: https://docs.python.org/3/tutorial/introduction.html</w:t>
+      </w:r>
+    </w:p>
+    <w:p>
+      <w:hyperlink w:history="1" r:id="rIdztxyitys2e9ocrbmcta52">
         <w:r>
           <w:rPr>
             <w:rStyle w:val="Hyperlink"/>
@@ -2964,7 +2981,7 @@
           <w:sz w:val="18"/>
           <w:szCs w:val="18"/>
         </w:rPr>
-        <w:t xml:space="preserve"> — https://docs.python.org/3/library/functions.html#print</w:t>
+        <w:t xml:space="preserve">: https://docs.python.org/3/library/functions.html#print</w:t>
       </w:r>
     </w:p>
     <w:tbl>
@@ -3073,7 +3090,7 @@
                     </pic:cNvPicPr>
                   </pic:nvPicPr>
                   <pic:blipFill>
-                    <a:blip r:embed="rId13" cstate="none"/>
+                    <a:blip r:embed="rId14" cstate="none"/>
                     <a:srcRect/>
                     <a:stretch>
                       <a:fillRect/>
@@ -3530,7 +3547,7 @@
                     </pic:cNvPicPr>
                   </pic:nvPicPr>
                   <pic:blipFill>
-                    <a:blip r:embed="rId14" cstate="none"/>
+                    <a:blip r:embed="rId15" cstate="none"/>
                     <a:srcRect/>
                     <a:stretch>
                       <a:fillRect/>
@@ -3729,7 +3746,7 @@
           <w:bCs/>
           <w:color w:val="4659A7"/>
         </w:rPr>
-        <w:t xml:space="preserve">Now compare three routes—one at a time</w:t>
+        <w:t xml:space="preserve">Now compare three routes, one at a time</w:t>
       </w:r>
     </w:p>
     <w:p>
@@ -6723,7 +6740,7 @@
       </w:r>
     </w:p>
     <w:p>
-      <w:hyperlink w:history="1" r:id="rIdsdkn0lkj8efbxq7sylfa6">
+      <w:hyperlink w:history="1" r:id="rIdboxs-a7bn3j4u7qqmv7ng">
         <w:r>
           <w:rPr>
             <w:rStyle w:val="Hyperlink"/>
@@ -6737,16 +6754,16 @@
           <w:sz w:val="18"/>
           <w:szCs w:val="18"/>
         </w:rPr>
-        <w:t xml:space="preserve"> — https://docs.python.org/3/faq/general.html#what-is-python</w:t>
-      </w:r>
-    </w:p>
-    <w:p>
-      <w:hyperlink w:history="1" r:id="rId2xc6bxtlhbdokqciax5l8">
+        <w:t xml:space="preserve">: https://docs.python.org/3/faq/general.html#what-is-python</w:t>
+      </w:r>
+    </w:p>
+    <w:p>
+      <w:hyperlink w:history="1" r:id="rId2-xv5jmwxyn_na1rqgs8g">
         <w:r>
           <w:rPr>
             <w:rStyle w:val="Hyperlink"/>
           </w:rPr>
-          <w:t xml:space="preserve">Python bytecode tool—save this for later</w:t>
+          <w:t xml:space="preserve">Python bytecode tool, save this for later</w:t>
         </w:r>
       </w:hyperlink>
       <w:r>
@@ -6755,16 +6772,16 @@
           <w:sz w:val="18"/>
           <w:szCs w:val="18"/>
         </w:rPr>
-        <w:t xml:space="preserve"> — https://docs.python.org/3/library/dis.html</w:t>
-      </w:r>
-    </w:p>
-    <w:p>
-      <w:hyperlink w:history="1" r:id="rId5mi2dpaxd0d6arl9b6psf">
+        <w:t xml:space="preserve">: https://docs.python.org/3/library/dis.html</w:t>
+      </w:r>
+    </w:p>
+    <w:p>
+      <w:hyperlink w:history="1" r:id="rIdv9eglbdcubsunpo76dbkr">
         <w:r>
           <w:rPr>
             <w:rStyle w:val="Hyperlink"/>
           </w:rPr>
-          <w:t xml:space="preserve">GCC build stages—reference for later</w:t>
+          <w:t xml:space="preserve">GCC build stages, reference for later</w:t>
         </w:r>
       </w:hyperlink>
       <w:r>
@@ -6773,7 +6790,7 @@
           <w:sz w:val="18"/>
           <w:szCs w:val="18"/>
         </w:rPr>
-        <w:t xml:space="preserve"> — https://gcc.gnu.org/onlinedocs/gcc/Overall-Options.html</w:t>
+        <w:t xml:space="preserve">: https://gcc.gnu.org/onlinedocs/gcc/Overall-Options.html</w:t>
       </w:r>
     </w:p>
     <w:tbl>
@@ -6818,7 +6835,7 @@
                 <w:bCs/>
                 <w:color w:val="263A67"/>
               </w:rPr>
-              <w:t xml:space="preserve">NEXT DISCOVERY · The program can run—but where does it keep a score?</w:t>
+              <w:t xml:space="preserve">NEXT DISCOVERY · The program can run, but where does it keep a score?</w:t>
             </w:r>
           </w:p>
           <w:p>
@@ -6882,7 +6899,7 @@
                     </pic:cNvPicPr>
                   </pic:nvPicPr>
                   <pic:blipFill>
-                    <a:blip r:embed="rId15" cstate="none"/>
+                    <a:blip r:embed="rId16" cstate="none"/>
                     <a:srcRect/>
                     <a:stretch>
                       <a:fillRect/>
@@ -7311,7 +7328,7 @@
                     </pic:cNvPicPr>
                   </pic:nvPicPr>
                   <pic:blipFill>
-                    <a:blip r:embed="rId16" cstate="none"/>
+                    <a:blip r:embed="rId17" cstate="none"/>
                     <a:srcRect/>
                     <a:stretch>
                       <a:fillRect/>
@@ -8717,7 +8734,7 @@
       </w:r>
     </w:p>
     <w:p>
-      <w:hyperlink w:history="1" r:id="rId08nd5tu-zuffsw3iqfwsc">
+      <w:hyperlink w:history="1" r:id="rIdcs8pnf7zntqeftb4_ga1q">
         <w:r>
           <w:rPr>
             <w:rStyle w:val="Hyperlink"/>
@@ -8731,11 +8748,11 @@
           <w:sz w:val="18"/>
           <w:szCs w:val="18"/>
         </w:rPr>
-        <w:t xml:space="preserve"> — https://docs.python.org/3/reference/simple_stmts.html#assignment-statements</w:t>
-      </w:r>
-    </w:p>
-    <w:p>
-      <w:hyperlink w:history="1" r:id="rId--r3btjdocnqnxafpenhk">
+        <w:t xml:space="preserve">: https://docs.python.org/3/reference/simple_stmts.html#assignment-statements</w:t>
+      </w:r>
+    </w:p>
+    <w:p>
+      <w:hyperlink w:history="1" r:id="rId-pszg_cvxqvunz2xioauh">
         <w:r>
           <w:rPr>
             <w:rStyle w:val="Hyperlink"/>
@@ -8749,7 +8766,7 @@
           <w:sz w:val="18"/>
           <w:szCs w:val="18"/>
         </w:rPr>
-        <w:t xml:space="preserve"> — https://docs.python.org/3/reference/lexical_analysis.html#identifiers</w:t>
+        <w:t xml:space="preserve">: https://docs.python.org/3/reference/lexical_analysis.html#identifiers</w:t>
       </w:r>
     </w:p>
     <w:tbl>
@@ -8832,7 +8849,7 @@
           <w:iCs/>
           <w:color w:val="596579"/>
         </w:rPr>
-        <w:t xml:space="preserve">Meet strings, integers, floats and booleans—and see why type changes what Python can do.</w:t>
+        <w:t xml:space="preserve">Meet strings, integers, floats and booleans, and see why type changes what Python can do.</w:t>
       </w:r>
     </w:p>
     <w:p>
@@ -8858,7 +8875,7 @@
                     </pic:cNvPicPr>
                   </pic:nvPicPr>
                   <pic:blipFill>
-                    <a:blip r:embed="rId17" cstate="none"/>
+                    <a:blip r:embed="rId18" cstate="none"/>
                     <a:srcRect/>
                     <a:stretch>
                       <a:fillRect/>
@@ -9453,7 +9470,7 @@
                     </pic:cNvPicPr>
                   </pic:nvPicPr>
                   <pic:blipFill>
-                    <a:blip r:embed="rId18" cstate="none"/>
+                    <a:blip r:embed="rId19" cstate="none"/>
                     <a:srcRect/>
                     <a:stretch>
                       <a:fillRect/>
@@ -11392,7 +11409,7 @@
       </w:r>
     </w:p>
     <w:p>
-      <w:hyperlink w:history="1" r:id="rIdiyp2bssxgl0g6ggs-xmkf">
+      <w:hyperlink w:history="1" r:id="rIdvghqnnoaecup2v0od_lnp">
         <w:r>
           <w:rPr>
             <w:rStyle w:val="Hyperlink"/>
@@ -11406,7 +11423,7 @@
           <w:sz w:val="18"/>
           <w:szCs w:val="18"/>
         </w:rPr>
-        <w:t xml:space="preserve"> — https://docs.python.org/3/library/stdtypes.html</w:t>
+        <w:t xml:space="preserve">: https://docs.python.org/3/library/stdtypes.html</w:t>
       </w:r>
     </w:p>
     <w:tbl>
@@ -11491,15 +11508,15 @@
         <w:t xml:space="preserve">Akshat Sinha</w:t>
       </w:r>
       <w:r>
-        <w:t xml:space="preserve"> is the founder of The Sinha Family Group and the creator of Sarva Gyana Koshah — the treasury of all knowledge — which teaches through books, videos, and hands-on learning.</w:t>
-      </w:r>
-    </w:p>
-    <w:p>
-      <w:pPr>
-        <w:spacing w:after="120" w:line="300"/>
-      </w:pPr>
-      <w:r>
-        <w:t xml:space="preserve">This book was written for the reader who has never written a line of code, and wants to finally understand what the computer is doing — not just copy-paste.</w:t>
+        <w:t xml:space="preserve"> is the founder of The Sinha Family Group and the creator of Sarva Gyana Koshah, the treasury of all knowledge, which teaches through books, videos, and hands-on learning.</w:t>
+      </w:r>
+    </w:p>
+    <w:p>
+      <w:pPr>
+        <w:spacing w:after="120" w:line="300"/>
+      </w:pPr>
+      <w:r>
+        <w:t xml:space="preserve">This book was written for the reader who has never written a line of code and wants to finally understand what the computer is doing, not just copy and paste.</w:t>
       </w:r>
     </w:p>
     <w:p>

</xml_diff>

<commit_message>
Preserve infographic aspect ratios
Co-authored-by: arena-agent <297053741+arena-agent@users.noreply.github.com>
</commit_message>
<xml_diff>
--- a/public/books/python-absolute-beginners/edition-01/Python-for-Absolute-Beginners-The-First-Code-Series-Book-1.docx
+++ b/public/books/python-absolute-beginners/edition-01/Python-for-Absolute-Beginners-The-First-Code-Series-Book-1.docx
@@ -722,7 +722,7 @@
       </w:r>
     </w:p>
     <w:p>
-      <w:hyperlink w:history="1" r:id="rIdl5w4qt8chopxsct0cwsl7">
+      <w:hyperlink w:history="1" r:id="rId6fhusw3okekwx30n1ijap">
         <w:r>
           <w:rPr>
             <w:rStyle w:val="Hyperlink"/>
@@ -740,7 +740,7 @@
       </w:r>
     </w:p>
     <w:p>
-      <w:hyperlink w:history="1" r:id="rIdwuoxaudxjaidgcoy6fg7d">
+      <w:hyperlink w:history="1" r:id="rIdoa-piahbvg8zyvs4s9ayq">
         <w:r>
           <w:rPr>
             <w:rStyle w:val="Hyperlink"/>
@@ -2949,7 +2949,7 @@
       </w:r>
     </w:p>
     <w:p>
-      <w:hyperlink w:history="1" r:id="rId7jk3-slydeqp1nmcnfgj5">
+      <w:hyperlink w:history="1" r:id="rIdaleiloeskwmq4elv3xsvc">
         <w:r>
           <w:rPr>
             <w:rStyle w:val="Hyperlink"/>
@@ -2967,7 +2967,7 @@
       </w:r>
     </w:p>
     <w:p>
-      <w:hyperlink w:history="1" r:id="rIdztxyitys2e9ocrbmcta52">
+      <w:hyperlink w:history="1" r:id="rIdq7vlae6zx7xnbb7q6s66n">
         <w:r>
           <w:rPr>
             <w:rStyle w:val="Hyperlink"/>
@@ -6740,7 +6740,7 @@
       </w:r>
     </w:p>
     <w:p>
-      <w:hyperlink w:history="1" r:id="rIdboxs-a7bn3j4u7qqmv7ng">
+      <w:hyperlink w:history="1" r:id="rIdn4f1t0fawdz8igu7ai-vl">
         <w:r>
           <w:rPr>
             <w:rStyle w:val="Hyperlink"/>
@@ -6758,7 +6758,7 @@
       </w:r>
     </w:p>
     <w:p>
-      <w:hyperlink w:history="1" r:id="rId2-xv5jmwxyn_na1rqgs8g">
+      <w:hyperlink w:history="1" r:id="rIdfrmkfrlviqhfefhwiukaf">
         <w:r>
           <w:rPr>
             <w:rStyle w:val="Hyperlink"/>
@@ -6776,7 +6776,7 @@
       </w:r>
     </w:p>
     <w:p>
-      <w:hyperlink w:history="1" r:id="rIdv9eglbdcubsunpo76dbkr">
+      <w:hyperlink w:history="1" r:id="rIdpyxuns1toarrrzo7qni_n">
         <w:r>
           <w:rPr>
             <w:rStyle w:val="Hyperlink"/>
@@ -8734,7 +8734,7 @@
       </w:r>
     </w:p>
     <w:p>
-      <w:hyperlink w:history="1" r:id="rIdcs8pnf7zntqeftb4_ga1q">
+      <w:hyperlink w:history="1" r:id="rId8a0v2d7rovimhuvfapfmk">
         <w:r>
           <w:rPr>
             <w:rStyle w:val="Hyperlink"/>
@@ -8752,7 +8752,7 @@
       </w:r>
     </w:p>
     <w:p>
-      <w:hyperlink w:history="1" r:id="rId-pszg_cvxqvunz2xioauh">
+      <w:hyperlink w:history="1" r:id="rIdeaweoo0eqpyv9mc_74iqq">
         <w:r>
           <w:rPr>
             <w:rStyle w:val="Hyperlink"/>
@@ -11409,7 +11409,7 @@
       </w:r>
     </w:p>
     <w:p>
-      <w:hyperlink w:history="1" r:id="rIdvghqnnoaecup2v0od_lnp">
+      <w:hyperlink w:history="1" r:id="rIdrikajxkxlnt9v7cjqfhop">
         <w:r>
           <w:rPr>
             <w:rStyle w:val="Hyperlink"/>

</xml_diff>

<commit_message>
Add mission reading guide and clarify print flow
Co-authored-by: arena-agent <297053741+arena-agent@users.noreply.github.com>
</commit_message>
<xml_diff>
--- a/public/books/python-absolute-beginners/edition-01/Python-for-Absolute-Beginners-The-First-Code-Series-Book-1.docx
+++ b/public/books/python-absolute-beginners/edition-01/Python-for-Absolute-Beginners-The-First-Code-Series-Book-1.docx
@@ -722,7 +722,7 @@
       </w:r>
     </w:p>
     <w:p>
-      <w:hyperlink w:history="1" r:id="rId6fhusw3okekwx30n1ijap">
+      <w:hyperlink w:history="1" r:id="rIdztz0p9wx_becsktbm0jcd">
         <w:r>
           <w:rPr>
             <w:rStyle w:val="Hyperlink"/>
@@ -740,7 +740,7 @@
       </w:r>
     </w:p>
     <w:p>
-      <w:hyperlink w:history="1" r:id="rIdoa-piahbvg8zyvs4s9ayq">
+      <w:hyperlink w:history="1" r:id="rIdapyvdc5g8fxzbolnczvld">
         <w:r>
           <w:rPr>
             <w:rStyle w:val="Hyperlink"/>
@@ -757,6 +757,263 @@
         <w:t xml:space="preserve">: https://www.python.org/doc/essays/omg-darpa-mcc-position/</w:t>
       </w:r>
     </w:p>
+    <w:p>
+      <w:r>
+        <w:br w:type="page"/>
+      </w:r>
+    </w:p>
+    <w:p>
+      <w:pPr>
+        <w:pStyle w:val="Heading1"/>
+        <w:keepNext/>
+        <w:spacing w:after="100" w:before="240"/>
+      </w:pPr>
+      <w:r>
+        <w:rPr>
+          <w:b/>
+          <w:bCs/>
+          <w:color w:val="4659A7"/>
+        </w:rPr>
+        <w:t xml:space="preserve">How to read this book</w:t>
+      </w:r>
+    </w:p>
+    <w:p>
+      <w:pPr>
+        <w:spacing w:after="120" w:line="300"/>
+      </w:pPr>
+      <w:r>
+        <w:t xml:space="preserve">Each lesson gives us one clear </w:t>
+      </w:r>
+      <w:r>
+        <w:rPr>
+          <w:b/>
+          <w:bCs/>
+        </w:rPr>
+        <w:t xml:space="preserve">mission</w:t>
+      </w:r>
+      <w:r>
+        <w:t xml:space="preserve">. We begin with a result we want, such as making the computer display a message or remember a score. Then we learn only the ideas and tools needed to complete that mission.</w:t>
+      </w:r>
+    </w:p>
+    <w:p>
+      <w:pPr>
+        <w:pStyle w:val="Heading2"/>
+        <w:keepNext/>
+        <w:spacing w:after="100" w:before="240"/>
+      </w:pPr>
+      <w:r>
+        <w:rPr>
+          <w:b/>
+          <w:bCs/>
+          <w:color w:val="4659A7"/>
+        </w:rPr>
+        <w:t xml:space="preserve">How each mission works</w:t>
+      </w:r>
+    </w:p>
+    <w:p>
+      <w:pPr>
+        <w:pStyle w:val="ListParagraph"/>
+        <w:numPr>
+          <w:ilvl w:val="0"/>
+          <w:numId w:val="3"/>
+        </w:numPr>
+        <w:spacing w:after="120" w:line="300"/>
+      </w:pPr>
+      <w:r>
+        <w:rPr>
+          <w:b/>
+          <w:bCs/>
+        </w:rPr>
+        <w:t xml:space="preserve">Meet the mission.</w:t>
+      </w:r>
+      <w:r>
+        <w:t xml:space="preserve"> See what we already know and what we still need to discover.</w:t>
+      </w:r>
+    </w:p>
+    <w:p>
+      <w:pPr>
+        <w:pStyle w:val="ListParagraph"/>
+        <w:numPr>
+          <w:ilvl w:val="0"/>
+          <w:numId w:val="3"/>
+        </w:numPr>
+        <w:spacing w:after="120" w:line="300"/>
+      </w:pPr>
+      <w:r>
+        <w:rPr>
+          <w:b/>
+          <w:bCs/>
+        </w:rPr>
+        <w:t xml:space="preserve">Pause and predict.</w:t>
+      </w:r>
+      <w:r>
+        <w:t xml:space="preserve"> Think about the next result before the explanation appears.</w:t>
+      </w:r>
+    </w:p>
+    <w:p>
+      <w:pPr>
+        <w:pStyle w:val="ListParagraph"/>
+        <w:numPr>
+          <w:ilvl w:val="0"/>
+          <w:numId w:val="3"/>
+        </w:numPr>
+        <w:spacing w:after="120" w:line="300"/>
+      </w:pPr>
+      <w:r>
+        <w:rPr>
+          <w:b/>
+          <w:bCs/>
+        </w:rPr>
+        <w:t xml:space="preserve">Learn one idea.</w:t>
+      </w:r>
+      <w:r>
+        <w:t xml:space="preserve"> Read a short explanation and connect it to a visual example.</w:t>
+      </w:r>
+    </w:p>
+    <w:p>
+      <w:pPr>
+        <w:pStyle w:val="ListParagraph"/>
+        <w:numPr>
+          <w:ilvl w:val="0"/>
+          <w:numId w:val="3"/>
+        </w:numPr>
+        <w:spacing w:after="120" w:line="300"/>
+      </w:pPr>
+      <w:r>
+        <w:rPr>
+          <w:b/>
+          <w:bCs/>
+        </w:rPr>
+        <w:t xml:space="preserve">Build the solution.</w:t>
+      </w:r>
+      <w:r>
+        <w:t xml:space="preserve"> Write the code in small, understandable steps.</w:t>
+      </w:r>
+    </w:p>
+    <w:p>
+      <w:pPr>
+        <w:pStyle w:val="ListParagraph"/>
+        <w:numPr>
+          <w:ilvl w:val="0"/>
+          <w:numId w:val="3"/>
+        </w:numPr>
+        <w:spacing w:after="120" w:line="300"/>
+      </w:pPr>
+      <w:r>
+        <w:rPr>
+          <w:b/>
+          <w:bCs/>
+        </w:rPr>
+        <w:t xml:space="preserve">Run and observe.</w:t>
+      </w:r>
+      <w:r>
+        <w:t xml:space="preserve"> Follow what Python does and compare the output with your prediction.</w:t>
+      </w:r>
+    </w:p>
+    <w:p>
+      <w:pPr>
+        <w:pStyle w:val="ListParagraph"/>
+        <w:numPr>
+          <w:ilvl w:val="0"/>
+          <w:numId w:val="3"/>
+        </w:numPr>
+        <w:spacing w:after="120" w:line="300"/>
+      </w:pPr>
+      <w:r>
+        <w:rPr>
+          <w:b/>
+          <w:bCs/>
+        </w:rPr>
+        <w:t xml:space="preserve">Test the mission.</w:t>
+      </w:r>
+      <w:r>
+        <w:t xml:space="preserve"> Change the code, find mistakes and answer a few questions.</w:t>
+      </w:r>
+    </w:p>
+    <w:p>
+      <w:pPr>
+        <w:pStyle w:val="ListParagraph"/>
+        <w:numPr>
+          <w:ilvl w:val="0"/>
+          <w:numId w:val="3"/>
+        </w:numPr>
+        <w:spacing w:after="120" w:line="300"/>
+      </w:pPr>
+      <w:r>
+        <w:rPr>
+          <w:b/>
+          <w:bCs/>
+        </w:rPr>
+        <w:t xml:space="preserve">Carry the discovery forward.</w:t>
+      </w:r>
+      <w:r>
+        <w:t xml:space="preserve"> Use what we learned as the starting point for the next mission.</w:t>
+      </w:r>
+    </w:p>
+    <w:tbl>
+      <w:tblPr>
+        <w:tblW w:type="pct" w:w="100%"/>
+        <w:tblBorders>
+          <w:top w:val="single" w:color="auto" w:sz="4"/>
+          <w:left w:val="single" w:color="auto" w:sz="4"/>
+          <w:bottom w:val="single" w:color="auto" w:sz="4"/>
+          <w:right w:val="single" w:color="auto" w:sz="4"/>
+          <w:insideH w:val="single" w:color="auto" w:sz="4"/>
+          <w:insideV w:val="single" w:color="auto" w:sz="4"/>
+        </w:tblBorders>
+      </w:tblPr>
+      <w:tblGrid>
+        <w:gridCol w:w="100"/>
+      </w:tblGrid>
+      <w:tr>
+        <w:tc>
+          <w:tcPr>
+            <w:tcBorders>
+              <w:top w:val="single" w:color="D9E0EA" w:sz="2"/>
+              <w:left w:val="single" w:color="D9E0EA" w:sz="2"/>
+              <w:bottom w:val="single" w:color="D9E0EA" w:sz="2"/>
+              <w:right w:val="single" w:color="D9E0EA" w:sz="2"/>
+            </w:tcBorders>
+            <w:shd w:fill="F2F4FA" w:val="clear"/>
+            <w:tcMar>
+              <w:top w:type="dxa" w:w="130"/>
+              <w:left w:type="dxa" w:w="160"/>
+              <w:bottom w:type="dxa" w:w="130"/>
+              <w:right w:type="dxa" w:w="160"/>
+            </w:tcMar>
+          </w:tcPr>
+          <w:p>
+            <w:pPr>
+              <w:spacing w:after="120" w:line="300"/>
+            </w:pPr>
+            <w:r>
+              <w:rPr>
+                <w:b/>
+                <w:bCs/>
+                <w:color w:val="263A67"/>
+              </w:rPr>
+              <w:t xml:space="preserve">The goal is understanding</w:t>
+            </w:r>
+          </w:p>
+          <w:p>
+            <w:pPr>
+              <w:spacing w:after="120" w:line="300"/>
+            </w:pPr>
+            <w:r>
+              <w:t xml:space="preserve">Do not rush to copy every answer. Stop at each prediction, make your own guess and then check it.</w:t>
+            </w:r>
+          </w:p>
+          <w:p>
+            <w:pPr>
+              <w:spacing w:after="120" w:line="300"/>
+            </w:pPr>
+            <w:r>
+              <w:t xml:space="preserve">A wrong guess is useful. It shows us exactly which idea to examine before moving forward.</w:t>
+            </w:r>
+          </w:p>
+        </w:tc>
+      </w:tr>
+    </w:tbl>
     <w:p>
       <w:pPr>
         <w:pStyle w:val="Heading1"/>
@@ -1362,7 +1619,7 @@
           <w:bCs/>
           <w:color w:val="4659A7"/>
         </w:rPr>
-        <w:t xml:space="preserve">Input → Process → Output</w:t>
+        <w:t xml:space="preserve">What actually happens when print() runs?</w:t>
       </w:r>
     </w:p>
     <w:tbl>
@@ -1380,18 +1637,18 @@
       <w:tblGrid>
         <w:gridCol w:w="100"/>
         <w:gridCol w:w="100"/>
-        <w:gridCol w:w="100"/>
       </w:tblGrid>
       <w:tr>
         <w:tc>
           <w:tcPr>
+            <w:tcW w:type="pct" w:w="12%"/>
             <w:tcBorders>
               <w:top w:val="single" w:color="D9E0EA" w:sz="2"/>
               <w:left w:val="single" w:color="D9E0EA" w:sz="2"/>
               <w:bottom w:val="single" w:color="D9E0EA" w:sz="2"/>
               <w:right w:val="single" w:color="D9E0EA" w:sz="2"/>
             </w:tcBorders>
-            <w:shd w:fill="F5F7FB" w:val="clear"/>
+            <w:shd w:fill="EEF1FA" w:val="clear"/>
           </w:tcPr>
           <w:p>
             <w:pPr>
@@ -1403,15 +1660,7 @@
                 <w:bCs/>
                 <w:color w:val="4659A7"/>
               </w:rPr>
-              <w:t xml:space="preserve">Value</w:t>
-            </w:r>
-          </w:p>
-          <w:p>
-            <w:pPr>
-              <w:spacing w:after="120" w:line="300"/>
-            </w:pPr>
-            <w:r>
-              <w:t xml:space="preserve">"Hello, World!"</w:t>
+              <w:t xml:space="preserve">1</w:t>
             </w:r>
           </w:p>
         </w:tc>
@@ -1434,16 +1683,58 @@
                 <w:b/>
                 <w:bCs/>
                 <w:color w:val="4659A7"/>
-              </w:rPr>
-              <w:t xml:space="preserve">Function call</w:t>
-            </w:r>
-          </w:p>
-          <w:p>
-            <w:pPr>
-              <w:spacing w:after="120" w:line="300"/>
-            </w:pPr>
-            <w:r>
-              <w:t xml:space="preserve">print(...)</w:t>
+                <w:sz w:val="18"/>
+                <w:szCs w:val="18"/>
+              </w:rPr>
+              <w:t xml:space="preserve">SOURCE CODE</w:t>
+            </w:r>
+          </w:p>
+          <w:p>
+            <w:pPr>
+              <w:spacing w:after="120" w:line="300"/>
+            </w:pPr>
+            <w:r>
+              <w:rPr>
+                <w:b/>
+                <w:bCs/>
+                <w:color w:val="263A67"/>
+              </w:rPr>
+              <w:t xml:space="preserve">Python reaches the instruction</w:t>
+            </w:r>
+          </w:p>
+          <w:p>
+            <w:pPr>
+              <w:spacing w:after="120" w:line="300"/>
+            </w:pPr>
+            <w:r>
+              <w:t xml:space="preserve">Python executes print("Hello, World!") in hello.py.</w:t>
+            </w:r>
+          </w:p>
+        </w:tc>
+      </w:tr>
+      <w:tr>
+        <w:tc>
+          <w:tcPr>
+            <w:tcW w:type="pct" w:w="12%"/>
+            <w:tcBorders>
+              <w:top w:val="single" w:color="D9E0EA" w:sz="2"/>
+              <w:left w:val="single" w:color="D9E0EA" w:sz="2"/>
+              <w:bottom w:val="single" w:color="D9E0EA" w:sz="2"/>
+              <w:right w:val="single" w:color="D9E0EA" w:sz="2"/>
+            </w:tcBorders>
+            <w:shd w:fill="EEF1FA" w:val="clear"/>
+          </w:tcPr>
+          <w:p>
+            <w:pPr>
+              <w:spacing w:after="120" w:line="300"/>
+            </w:pPr>
+            <w:r>
+              <w:rPr>
+                <w:b/>
+                <w:bCs/>
+                <w:color w:val="4659A7"/>
+              </w:rPr>
+              <w:t xml:space="preserve">2</w:t>
             </w:r>
           </w:p>
         </w:tc>
@@ -1466,21 +1757,200 @@
                 <w:b/>
                 <w:bCs/>
                 <w:color w:val="4659A7"/>
-              </w:rPr>
-              <w:t xml:space="preserve">stdout</w:t>
-            </w:r>
-          </w:p>
-          <w:p>
-            <w:pPr>
-              <w:spacing w:after="120" w:line="300"/>
-            </w:pPr>
-            <w:r>
-              <w:t xml:space="preserve">Hello, World!</w:t>
+                <w:sz w:val="18"/>
+                <w:szCs w:val="18"/>
+              </w:rPr>
+              <w:t xml:space="preserve">VALUE</w:t>
+            </w:r>
+          </w:p>
+          <w:p>
+            <w:pPr>
+              <w:spacing w:after="120" w:line="300"/>
+            </w:pPr>
+            <w:r>
+              <w:rPr>
+                <w:b/>
+                <w:bCs/>
+                <w:color w:val="263A67"/>
+              </w:rPr>
+              <w:t xml:space="preserve">Python creates the string</w:t>
+            </w:r>
+          </w:p>
+          <w:p>
+            <w:pPr>
+              <w:spacing w:after="120" w:line="300"/>
+            </w:pPr>
+            <w:r>
+              <w:t xml:space="preserve">The characters inside the quotes become one text value: Hello, World!</w:t>
+            </w:r>
+          </w:p>
+        </w:tc>
+      </w:tr>
+      <w:tr>
+        <w:tc>
+          <w:tcPr>
+            <w:tcW w:type="pct" w:w="12%"/>
+            <w:tcBorders>
+              <w:top w:val="single" w:color="D9E0EA" w:sz="2"/>
+              <w:left w:val="single" w:color="D9E0EA" w:sz="2"/>
+              <w:bottom w:val="single" w:color="D9E0EA" w:sz="2"/>
+              <w:right w:val="single" w:color="D9E0EA" w:sz="2"/>
+            </w:tcBorders>
+            <w:shd w:fill="EEF1FA" w:val="clear"/>
+          </w:tcPr>
+          <w:p>
+            <w:pPr>
+              <w:spacing w:after="120" w:line="300"/>
+            </w:pPr>
+            <w:r>
+              <w:rPr>
+                <w:b/>
+                <w:bCs/>
+                <w:color w:val="4659A7"/>
+              </w:rPr>
+              <w:t xml:space="preserve">3</w:t>
+            </w:r>
+          </w:p>
+        </w:tc>
+        <w:tc>
+          <w:tcPr>
+            <w:tcBorders>
+              <w:top w:val="single" w:color="D9E0EA" w:sz="2"/>
+              <w:left w:val="single" w:color="D9E0EA" w:sz="2"/>
+              <w:bottom w:val="single" w:color="D9E0EA" w:sz="2"/>
+              <w:right w:val="single" w:color="D9E0EA" w:sz="2"/>
+            </w:tcBorders>
+            <w:shd w:fill="F5F7FB" w:val="clear"/>
+          </w:tcPr>
+          <w:p>
+            <w:pPr>
+              <w:spacing w:after="120" w:line="300"/>
+            </w:pPr>
+            <w:r>
+              <w:rPr>
+                <w:b/>
+                <w:bCs/>
+                <w:color w:val="4659A7"/>
+                <w:sz w:val="18"/>
+                <w:szCs w:val="18"/>
+              </w:rPr>
+              <w:t xml:space="preserve">FUNCTION CALL</w:t>
+            </w:r>
+          </w:p>
+          <w:p>
+            <w:pPr>
+              <w:spacing w:after="120" w:line="300"/>
+            </w:pPr>
+            <w:r>
+              <w:rPr>
+                <w:b/>
+                <w:bCs/>
+                <w:color w:val="263A67"/>
+              </w:rPr>
+              <w:t xml:space="preserve">print() writes the value</w:t>
+            </w:r>
+          </w:p>
+          <w:p>
+            <w:pPr>
+              <w:spacing w:after="120" w:line="300"/>
+            </w:pPr>
+            <w:r>
+              <w:t xml:space="preserve">The built-in print function sends the text and a new-line character to standard output, also called stdout.</w:t>
+            </w:r>
+          </w:p>
+        </w:tc>
+      </w:tr>
+      <w:tr>
+        <w:tc>
+          <w:tcPr>
+            <w:tcW w:type="pct" w:w="12%"/>
+            <w:tcBorders>
+              <w:top w:val="single" w:color="D9E0EA" w:sz="2"/>
+              <w:left w:val="single" w:color="D9E0EA" w:sz="2"/>
+              <w:bottom w:val="single" w:color="D9E0EA" w:sz="2"/>
+              <w:right w:val="single" w:color="D9E0EA" w:sz="2"/>
+            </w:tcBorders>
+            <w:shd w:fill="EEF1FA" w:val="clear"/>
+          </w:tcPr>
+          <w:p>
+            <w:pPr>
+              <w:spacing w:after="120" w:line="300"/>
+            </w:pPr>
+            <w:r>
+              <w:rPr>
+                <w:b/>
+                <w:bCs/>
+                <w:color w:val="4659A7"/>
+              </w:rPr>
+              <w:t xml:space="preserve">4</w:t>
+            </w:r>
+          </w:p>
+        </w:tc>
+        <w:tc>
+          <w:tcPr>
+            <w:tcBorders>
+              <w:top w:val="single" w:color="D9E0EA" w:sz="2"/>
+              <w:left w:val="single" w:color="D9E0EA" w:sz="2"/>
+              <w:bottom w:val="single" w:color="D9E0EA" w:sz="2"/>
+              <w:right w:val="single" w:color="D9E0EA" w:sz="2"/>
+            </w:tcBorders>
+            <w:shd w:fill="F5F7FB" w:val="clear"/>
+          </w:tcPr>
+          <w:p>
+            <w:pPr>
+              <w:spacing w:after="120" w:line="300"/>
+            </w:pPr>
+            <w:r>
+              <w:rPr>
+                <w:b/>
+                <w:bCs/>
+                <w:color w:val="4659A7"/>
+                <w:sz w:val="18"/>
+                <w:szCs w:val="18"/>
+              </w:rPr>
+              <w:t xml:space="preserve">TERMINAL</w:t>
+            </w:r>
+          </w:p>
+          <w:p>
+            <w:pPr>
+              <w:spacing w:after="120" w:line="300"/>
+            </w:pPr>
+            <w:r>
+              <w:rPr>
+                <w:b/>
+                <w:bCs/>
+                <w:color w:val="263A67"/>
+              </w:rPr>
+              <w:t xml:space="preserve">The terminal displays the result</w:t>
+            </w:r>
+          </w:p>
+          <w:p>
+            <w:pPr>
+              <w:spacing w:after="120" w:line="300"/>
+            </w:pPr>
+            <w:r>
+              <w:t xml:space="preserve">In this run, stdout is connected to the terminal. The terminal draws Hello, World! on the screen.</w:t>
             </w:r>
           </w:p>
         </w:tc>
       </w:tr>
     </w:tbl>
+    <w:p>
+      <w:pPr>
+        <w:spacing w:after="120" w:line="300"/>
+        <w:jc w:val="center"/>
+      </w:pPr>
+      <w:r>
+        <w:rPr>
+          <w:i/>
+          <w:iCs/>
+          <w:color w:val="596579"/>
+          <w:sz w:val="19"/>
+          <w:szCs w:val="19"/>
+        </w:rPr>
+        <w:t xml:space="preserve">This is the visible route for our first program. Python and the operating system perform more work inside, which we explore in the next lesson.</w:t>
+      </w:r>
+    </w:p>
     <w:tbl>
       <w:tblPr>
         <w:tblW w:type="pct" w:w="100%"/>
@@ -2949,7 +3419,7 @@
       </w:r>
     </w:p>
     <w:p>
-      <w:hyperlink w:history="1" r:id="rIdaleiloeskwmq4elv3xsvc">
+      <w:hyperlink w:history="1" r:id="rId6oquuwzfqtnpvd04abk0b">
         <w:r>
           <w:rPr>
             <w:rStyle w:val="Hyperlink"/>
@@ -2967,7 +3437,7 @@
       </w:r>
     </w:p>
     <w:p>
-      <w:hyperlink w:history="1" r:id="rIdq7vlae6zx7xnbb7q6s66n">
+      <w:hyperlink w:history="1" r:id="rIdswm6lbujvh7iiaotvnsxl">
         <w:r>
           <w:rPr>
             <w:rStyle w:val="Hyperlink"/>
@@ -3405,18 +3875,18 @@
       <w:tblGrid>
         <w:gridCol w:w="100"/>
         <w:gridCol w:w="100"/>
-        <w:gridCol w:w="100"/>
       </w:tblGrid>
       <w:tr>
         <w:tc>
           <w:tcPr>
+            <w:tcW w:type="pct" w:w="12%"/>
             <w:tcBorders>
               <w:top w:val="single" w:color="D9E0EA" w:sz="2"/>
               <w:left w:val="single" w:color="D9E0EA" w:sz="2"/>
               <w:bottom w:val="single" w:color="D9E0EA" w:sz="2"/>
               <w:right w:val="single" w:color="D9E0EA" w:sz="2"/>
             </w:tcBorders>
-            <w:shd w:fill="F5F7FB" w:val="clear"/>
+            <w:shd w:fill="EEF1FA" w:val="clear"/>
           </w:tcPr>
           <w:p>
             <w:pPr>
@@ -3428,15 +3898,7 @@
                 <w:bCs/>
                 <w:color w:val="4659A7"/>
               </w:rPr>
-              <w:t xml:space="preserve">Our file</w:t>
-            </w:r>
-          </w:p>
-          <w:p>
-            <w:pPr>
-              <w:spacing w:after="120" w:line="300"/>
-            </w:pPr>
-            <w:r>
-              <w:t xml:space="preserve">instructions we can read</w:t>
+              <w:t xml:space="preserve">1</w:t>
             </w:r>
           </w:p>
         </w:tc>
@@ -3459,16 +3921,58 @@
                 <w:b/>
                 <w:bCs/>
                 <w:color w:val="4659A7"/>
-              </w:rPr>
-              <w:t xml:space="preserve">Language helper</w:t>
-            </w:r>
-          </w:p>
-          <w:p>
-            <w:pPr>
-              <w:spacing w:after="120" w:line="300"/>
-            </w:pPr>
-            <w:r>
-              <w:t xml:space="preserve">prepares and runs them</w:t>
+                <w:sz w:val="18"/>
+                <w:szCs w:val="18"/>
+              </w:rPr>
+              <w:t xml:space="preserve">INPUT</w:t>
+            </w:r>
+          </w:p>
+          <w:p>
+            <w:pPr>
+              <w:spacing w:after="120" w:line="300"/>
+            </w:pPr>
+            <w:r>
+              <w:rPr>
+                <w:b/>
+                <w:bCs/>
+                <w:color w:val="263A67"/>
+              </w:rPr>
+              <w:t xml:space="preserve">Our file</w:t>
+            </w:r>
+          </w:p>
+          <w:p>
+            <w:pPr>
+              <w:spacing w:after="120" w:line="300"/>
+            </w:pPr>
+            <w:r>
+              <w:t xml:space="preserve">instructions we can read</w:t>
+            </w:r>
+          </w:p>
+        </w:tc>
+      </w:tr>
+      <w:tr>
+        <w:tc>
+          <w:tcPr>
+            <w:tcW w:type="pct" w:w="12%"/>
+            <w:tcBorders>
+              <w:top w:val="single" w:color="D9E0EA" w:sz="2"/>
+              <w:left w:val="single" w:color="D9E0EA" w:sz="2"/>
+              <w:bottom w:val="single" w:color="D9E0EA" w:sz="2"/>
+              <w:right w:val="single" w:color="D9E0EA" w:sz="2"/>
+            </w:tcBorders>
+            <w:shd w:fill="EEF1FA" w:val="clear"/>
+          </w:tcPr>
+          <w:p>
+            <w:pPr>
+              <w:spacing w:after="120" w:line="300"/>
+            </w:pPr>
+            <w:r>
+              <w:rPr>
+                <w:b/>
+                <w:bCs/>
+                <w:color w:val="4659A7"/>
+              </w:rPr>
+              <w:t xml:space="preserve">2</w:t>
             </w:r>
           </w:p>
         </w:tc>
@@ -3491,6 +3995,95 @@
                 <w:b/>
                 <w:bCs/>
                 <w:color w:val="4659A7"/>
+                <w:sz w:val="18"/>
+                <w:szCs w:val="18"/>
+              </w:rPr>
+              <w:t xml:space="preserve">PROCESS</w:t>
+            </w:r>
+          </w:p>
+          <w:p>
+            <w:pPr>
+              <w:spacing w:after="120" w:line="300"/>
+            </w:pPr>
+            <w:r>
+              <w:rPr>
+                <w:b/>
+                <w:bCs/>
+                <w:color w:val="263A67"/>
+              </w:rPr>
+              <w:t xml:space="preserve">Language helper</w:t>
+            </w:r>
+          </w:p>
+          <w:p>
+            <w:pPr>
+              <w:spacing w:after="120" w:line="300"/>
+            </w:pPr>
+            <w:r>
+              <w:t xml:space="preserve">prepares and runs them</w:t>
+            </w:r>
+          </w:p>
+        </w:tc>
+      </w:tr>
+      <w:tr>
+        <w:tc>
+          <w:tcPr>
+            <w:tcW w:type="pct" w:w="12%"/>
+            <w:tcBorders>
+              <w:top w:val="single" w:color="D9E0EA" w:sz="2"/>
+              <w:left w:val="single" w:color="D9E0EA" w:sz="2"/>
+              <w:bottom w:val="single" w:color="D9E0EA" w:sz="2"/>
+              <w:right w:val="single" w:color="D9E0EA" w:sz="2"/>
+            </w:tcBorders>
+            <w:shd w:fill="EEF1FA" w:val="clear"/>
+          </w:tcPr>
+          <w:p>
+            <w:pPr>
+              <w:spacing w:after="120" w:line="300"/>
+            </w:pPr>
+            <w:r>
+              <w:rPr>
+                <w:b/>
+                <w:bCs/>
+                <w:color w:val="4659A7"/>
+              </w:rPr>
+              <w:t xml:space="preserve">3</w:t>
+            </w:r>
+          </w:p>
+        </w:tc>
+        <w:tc>
+          <w:tcPr>
+            <w:tcBorders>
+              <w:top w:val="single" w:color="D9E0EA" w:sz="2"/>
+              <w:left w:val="single" w:color="D9E0EA" w:sz="2"/>
+              <w:bottom w:val="single" w:color="D9E0EA" w:sz="2"/>
+              <w:right w:val="single" w:color="D9E0EA" w:sz="2"/>
+            </w:tcBorders>
+            <w:shd w:fill="F5F7FB" w:val="clear"/>
+          </w:tcPr>
+          <w:p>
+            <w:pPr>
+              <w:spacing w:after="120" w:line="300"/>
+            </w:pPr>
+            <w:r>
+              <w:rPr>
+                <w:b/>
+                <w:bCs/>
+                <w:color w:val="4659A7"/>
+                <w:sz w:val="18"/>
+                <w:szCs w:val="18"/>
+              </w:rPr>
+              <w:t xml:space="preserve">OUTPUT</w:t>
+            </w:r>
+          </w:p>
+          <w:p>
+            <w:pPr>
+              <w:spacing w:after="120" w:line="300"/>
+            </w:pPr>
+            <w:r>
+              <w:rPr>
+                <w:b/>
+                <w:bCs/>
+                <w:color w:val="263A67"/>
               </w:rPr>
               <w:t xml:space="preserve">Computer result</w:t>
             </w:r>
@@ -6740,7 +7333,7 @@
       </w:r>
     </w:p>
     <w:p>
-      <w:hyperlink w:history="1" r:id="rIdn4f1t0fawdz8igu7ai-vl">
+      <w:hyperlink w:history="1" r:id="rIdkgw3hau4r0negrcjmmpnw">
         <w:r>
           <w:rPr>
             <w:rStyle w:val="Hyperlink"/>
@@ -6758,7 +7351,7 @@
       </w:r>
     </w:p>
     <w:p>
-      <w:hyperlink w:history="1" r:id="rIdfrmkfrlviqhfefhwiukaf">
+      <w:hyperlink w:history="1" r:id="rIdlxqblsq9dk3cowaqiwii2">
         <w:r>
           <w:rPr>
             <w:rStyle w:val="Hyperlink"/>
@@ -6776,7 +7369,7 @@
       </w:r>
     </w:p>
     <w:p>
-      <w:hyperlink w:history="1" r:id="rIdpyxuns1toarrrzo7qni_n">
+      <w:hyperlink w:history="1" r:id="rIdc38yiny4zibrpkgl4jug8">
         <w:r>
           <w:rPr>
             <w:rStyle w:val="Hyperlink"/>
@@ -8734,7 +9327,7 @@
       </w:r>
     </w:p>
     <w:p>
-      <w:hyperlink w:history="1" r:id="rId8a0v2d7rovimhuvfapfmk">
+      <w:hyperlink w:history="1" r:id="rId_2g7lv_uqvomi9ft1dgr0">
         <w:r>
           <w:rPr>
             <w:rStyle w:val="Hyperlink"/>
@@ -8752,7 +9345,7 @@
       </w:r>
     </w:p>
     <w:p>
-      <w:hyperlink w:history="1" r:id="rIdeaweoo0eqpyv9mc_74iqq">
+      <w:hyperlink w:history="1" r:id="rIdigt6n5fsywcpq4ugby4t_">
         <w:r>
           <w:rPr>
             <w:rStyle w:val="Hyperlink"/>
@@ -9700,18 +10293,18 @@
       <w:tblGrid>
         <w:gridCol w:w="100"/>
         <w:gridCol w:w="100"/>
-        <w:gridCol w:w="100"/>
       </w:tblGrid>
       <w:tr>
         <w:tc>
           <w:tcPr>
+            <w:tcW w:type="pct" w:w="12%"/>
             <w:tcBorders>
               <w:top w:val="single" w:color="D9E0EA" w:sz="2"/>
               <w:left w:val="single" w:color="D9E0EA" w:sz="2"/>
               <w:bottom w:val="single" w:color="D9E0EA" w:sz="2"/>
               <w:right w:val="single" w:color="D9E0EA" w:sz="2"/>
             </w:tcBorders>
-            <w:shd w:fill="F5F7FB" w:val="clear"/>
+            <w:shd w:fill="EEF1FA" w:val="clear"/>
           </w:tcPr>
           <w:p>
             <w:pPr>
@@ -9723,15 +10316,7 @@
                 <w:bCs/>
                 <w:color w:val="4659A7"/>
               </w:rPr>
-              <w:t xml:space="preserve">Values</w:t>
-            </w:r>
-          </w:p>
-          <w:p>
-            <w:pPr>
-              <w:spacing w:after="120" w:line="300"/>
-            </w:pPr>
-            <w:r>
-              <w:t xml:space="preserve">"Asha", 12, 1.52, True</w:t>
+              <w:t xml:space="preserve">1</w:t>
             </w:r>
           </w:p>
         </w:tc>
@@ -9754,16 +10339,58 @@
                 <w:b/>
                 <w:bCs/>
                 <w:color w:val="4659A7"/>
-              </w:rPr>
-              <w:t xml:space="preserve">Python</w:t>
-            </w:r>
-          </w:p>
-          <w:p>
-            <w:pPr>
-              <w:spacing w:after="120" w:line="300"/>
-            </w:pPr>
-            <w:r>
-              <w:t xml:space="preserve">keeps each type</w:t>
+                <w:sz w:val="18"/>
+                <w:szCs w:val="18"/>
+              </w:rPr>
+              <w:t xml:space="preserve">INPUT</w:t>
+            </w:r>
+          </w:p>
+          <w:p>
+            <w:pPr>
+              <w:spacing w:after="120" w:line="300"/>
+            </w:pPr>
+            <w:r>
+              <w:rPr>
+                <w:b/>
+                <w:bCs/>
+                <w:color w:val="263A67"/>
+              </w:rPr>
+              <w:t xml:space="preserve">Values</w:t>
+            </w:r>
+          </w:p>
+          <w:p>
+            <w:pPr>
+              <w:spacing w:after="120" w:line="300"/>
+            </w:pPr>
+            <w:r>
+              <w:t xml:space="preserve">"Asha", 12, 1.52, True</w:t>
+            </w:r>
+          </w:p>
+        </w:tc>
+      </w:tr>
+      <w:tr>
+        <w:tc>
+          <w:tcPr>
+            <w:tcW w:type="pct" w:w="12%"/>
+            <w:tcBorders>
+              <w:top w:val="single" w:color="D9E0EA" w:sz="2"/>
+              <w:left w:val="single" w:color="D9E0EA" w:sz="2"/>
+              <w:bottom w:val="single" w:color="D9E0EA" w:sz="2"/>
+              <w:right w:val="single" w:color="D9E0EA" w:sz="2"/>
+            </w:tcBorders>
+            <w:shd w:fill="EEF1FA" w:val="clear"/>
+          </w:tcPr>
+          <w:p>
+            <w:pPr>
+              <w:spacing w:after="120" w:line="300"/>
+            </w:pPr>
+            <w:r>
+              <w:rPr>
+                <w:b/>
+                <w:bCs/>
+                <w:color w:val="4659A7"/>
+              </w:rPr>
+              <w:t xml:space="preserve">2</w:t>
             </w:r>
           </w:p>
         </w:tc>
@@ -9786,6 +10413,95 @@
                 <w:b/>
                 <w:bCs/>
                 <w:color w:val="4659A7"/>
+                <w:sz w:val="18"/>
+                <w:szCs w:val="18"/>
+              </w:rPr>
+              <w:t xml:space="preserve">PROCESS</w:t>
+            </w:r>
+          </w:p>
+          <w:p>
+            <w:pPr>
+              <w:spacing w:after="120" w:line="300"/>
+            </w:pPr>
+            <w:r>
+              <w:rPr>
+                <w:b/>
+                <w:bCs/>
+                <w:color w:val="263A67"/>
+              </w:rPr>
+              <w:t xml:space="preserve">Python</w:t>
+            </w:r>
+          </w:p>
+          <w:p>
+            <w:pPr>
+              <w:spacing w:after="120" w:line="300"/>
+            </w:pPr>
+            <w:r>
+              <w:t xml:space="preserve">keeps each type</w:t>
+            </w:r>
+          </w:p>
+        </w:tc>
+      </w:tr>
+      <w:tr>
+        <w:tc>
+          <w:tcPr>
+            <w:tcW w:type="pct" w:w="12%"/>
+            <w:tcBorders>
+              <w:top w:val="single" w:color="D9E0EA" w:sz="2"/>
+              <w:left w:val="single" w:color="D9E0EA" w:sz="2"/>
+              <w:bottom w:val="single" w:color="D9E0EA" w:sz="2"/>
+              <w:right w:val="single" w:color="D9E0EA" w:sz="2"/>
+            </w:tcBorders>
+            <w:shd w:fill="EEF1FA" w:val="clear"/>
+          </w:tcPr>
+          <w:p>
+            <w:pPr>
+              <w:spacing w:after="120" w:line="300"/>
+            </w:pPr>
+            <w:r>
+              <w:rPr>
+                <w:b/>
+                <w:bCs/>
+                <w:color w:val="4659A7"/>
+              </w:rPr>
+              <w:t xml:space="preserve">3</w:t>
+            </w:r>
+          </w:p>
+        </w:tc>
+        <w:tc>
+          <w:tcPr>
+            <w:tcBorders>
+              <w:top w:val="single" w:color="D9E0EA" w:sz="2"/>
+              <w:left w:val="single" w:color="D9E0EA" w:sz="2"/>
+              <w:bottom w:val="single" w:color="D9E0EA" w:sz="2"/>
+              <w:right w:val="single" w:color="D9E0EA" w:sz="2"/>
+            </w:tcBorders>
+            <w:shd w:fill="F5F7FB" w:val="clear"/>
+          </w:tcPr>
+          <w:p>
+            <w:pPr>
+              <w:spacing w:after="120" w:line="300"/>
+            </w:pPr>
+            <w:r>
+              <w:rPr>
+                <w:b/>
+                <w:bCs/>
+                <w:color w:val="4659A7"/>
+                <w:sz w:val="18"/>
+                <w:szCs w:val="18"/>
+              </w:rPr>
+              <w:t xml:space="preserve">OUTPUT</w:t>
+            </w:r>
+          </w:p>
+          <w:p>
+            <w:pPr>
+              <w:spacing w:after="120" w:line="300"/>
+            </w:pPr>
+            <w:r>
+              <w:rPr>
+                <w:b/>
+                <w:bCs/>
+                <w:color w:val="263A67"/>
               </w:rPr>
               <w:t xml:space="preserve">Safe operations</w:t>
             </w:r>
@@ -11409,7 +12125,7 @@
       </w:r>
     </w:p>
     <w:p>
-      <w:hyperlink w:history="1" r:id="rIdrikajxkxlnt9v7cjqfhop">
+      <w:hyperlink w:history="1" r:id="rIdgwib6oqmf_pxlznxdawpd">
         <w:r>
           <w:rPr>
             <w:rStyle w:val="Hyperlink"/>

</xml_diff>

<commit_message>
Clarify chapter missions and visualize bytecode
Co-authored-by: arena-agent <297053741+arena-agent@users.noreply.github.com>
</commit_message>
<xml_diff>
--- a/public/books/python-absolute-beginners/edition-01/Python-for-Absolute-Beginners-The-First-Code-Series-Book-1.docx
+++ b/public/books/python-absolute-beginners/edition-01/Python-for-Absolute-Beginners-The-First-Code-Series-Book-1.docx
@@ -722,7 +722,7 @@
       </w:r>
     </w:p>
     <w:p>
-      <w:hyperlink w:history="1" r:id="rIdztz0p9wx_becsktbm0jcd">
+      <w:hyperlink w:history="1" r:id="rIdkw9kerdluhgyoez9dece_">
         <w:r>
           <w:rPr>
             <w:rStyle w:val="Hyperlink"/>
@@ -740,7 +740,7 @@
       </w:r>
     </w:p>
     <w:p>
-      <w:hyperlink w:history="1" r:id="rIdapyvdc5g8fxzbolnczvld">
+      <w:hyperlink w:history="1" r:id="rIdskspjuixub53bno1uselp">
         <w:r>
           <w:rPr>
             <w:rStyle w:val="Hyperlink"/>
@@ -1024,6 +1024,8 @@
           <w:b/>
           <w:bCs/>
           <w:color w:val="263A67"/>
+          <w:sz w:val="48"/>
+          <w:szCs w:val="48"/>
         </w:rPr>
         <w:t xml:space="preserve">Lesson 1: Your First Program: Hello, World!</w:t>
       </w:r>
@@ -1041,6 +1043,92 @@
         <w:t xml:space="preserve">We begin with an empty file and end with a real result, understanding every character we typed.</w:t>
       </w:r>
     </w:p>
+    <w:tbl>
+      <w:tblPr>
+        <w:tblW w:type="pct" w:w="100%"/>
+        <w:tblBorders>
+          <w:top w:val="single" w:color="auto" w:sz="4"/>
+          <w:left w:val="single" w:color="auto" w:sz="4"/>
+          <w:bottom w:val="single" w:color="auto" w:sz="4"/>
+          <w:right w:val="single" w:color="auto" w:sz="4"/>
+          <w:insideH w:val="single" w:color="auto" w:sz="4"/>
+          <w:insideV w:val="single" w:color="auto" w:sz="4"/>
+        </w:tblBorders>
+      </w:tblPr>
+      <w:tblGrid>
+        <w:gridCol w:w="100"/>
+      </w:tblGrid>
+      <w:tr>
+        <w:tc>
+          <w:tcPr>
+            <w:tcBorders>
+              <w:top w:val="single" w:color="D9E0EA" w:sz="2"/>
+              <w:left w:val="single" w:color="D9E0EA" w:sz="2"/>
+              <w:bottom w:val="single" w:color="D9E0EA" w:sz="2"/>
+              <w:right w:val="single" w:color="D9E0EA" w:sz="2"/>
+            </w:tcBorders>
+            <w:shd w:fill="EEF5FA" w:val="clear"/>
+            <w:tcMar>
+              <w:top w:type="dxa" w:w="130"/>
+              <w:left w:type="dxa" w:w="160"/>
+              <w:bottom w:type="dxa" w:w="130"/>
+              <w:right w:type="dxa" w:w="160"/>
+            </w:tcMar>
+          </w:tcPr>
+          <w:p>
+            <w:pPr>
+              <w:spacing w:after="120" w:line="300"/>
+            </w:pPr>
+            <w:r>
+              <w:rPr>
+                <w:b/>
+                <w:bCs/>
+                <w:color w:val="263A67"/>
+              </w:rPr>
+              <w:t xml:space="preserve">OUR MISSION · Make the silent machine answer us</w:t>
+            </w:r>
+          </w:p>
+          <w:p>
+            <w:pPr>
+              <w:spacing w:after="120" w:line="300"/>
+            </w:pPr>
+            <w:r>
+              <w:t xml:space="preserve">We start with no code and no hidden knowledge. Our first win is simple: ask the computer to show one exact message.</w:t>
+            </w:r>
+          </w:p>
+          <w:p>
+            <w:pPr>
+              <w:spacing w:after="120" w:line="300"/>
+            </w:pPr>
+            <w:r>
+              <w:rPr>
+                <w:b/>
+                <w:bCs/>
+              </w:rPr>
+              <w:t xml:space="preserve">What we know: </w:t>
+            </w:r>
+            <w:r>
+              <w:t xml:space="preserve">A computer follows precise instructions. • It will not guess what we meant.</w:t>
+            </w:r>
+          </w:p>
+          <w:p>
+            <w:pPr>
+              <w:spacing w:after="120" w:line="300"/>
+            </w:pPr>
+            <w:r>
+              <w:rPr>
+                <w:b/>
+                <w:bCs/>
+              </w:rPr>
+              <w:t xml:space="preserve">What we need: </w:t>
+            </w:r>
+            <w:r>
+              <w:t xml:space="preserve">A way to mark text. • An action that sends text to the screen. • A command that starts our program.</w:t>
+            </w:r>
+          </w:p>
+        </w:tc>
+      </w:tr>
+    </w:tbl>
     <w:p>
       <w:pPr>
         <w:jc w:val="center"/>
@@ -1185,92 +1273,6 @@
               <w:bottom w:val="single" w:color="D9E0EA" w:sz="2"/>
               <w:right w:val="single" w:color="D9E0EA" w:sz="2"/>
             </w:tcBorders>
-            <w:shd w:fill="EEF5FA" w:val="clear"/>
-            <w:tcMar>
-              <w:top w:type="dxa" w:w="130"/>
-              <w:left w:type="dxa" w:w="160"/>
-              <w:bottom w:type="dxa" w:w="130"/>
-              <w:right w:type="dxa" w:w="160"/>
-            </w:tcMar>
-          </w:tcPr>
-          <w:p>
-            <w:pPr>
-              <w:spacing w:after="120" w:line="300"/>
-            </w:pPr>
-            <w:r>
-              <w:rPr>
-                <w:b/>
-                <w:bCs/>
-                <w:color w:val="263A67"/>
-              </w:rPr>
-              <w:t xml:space="preserve">OUR MISSION · Make the silent machine answer us</w:t>
-            </w:r>
-          </w:p>
-          <w:p>
-            <w:pPr>
-              <w:spacing w:after="120" w:line="300"/>
-            </w:pPr>
-            <w:r>
-              <w:t xml:space="preserve">We start with no code and no hidden knowledge. Our first win is simple: ask the computer to show one exact message.</w:t>
-            </w:r>
-          </w:p>
-          <w:p>
-            <w:pPr>
-              <w:spacing w:after="120" w:line="300"/>
-            </w:pPr>
-            <w:r>
-              <w:rPr>
-                <w:b/>
-                <w:bCs/>
-              </w:rPr>
-              <w:t xml:space="preserve">What we know: </w:t>
-            </w:r>
-            <w:r>
-              <w:t xml:space="preserve">A computer follows precise instructions. • It will not guess what we meant.</w:t>
-            </w:r>
-          </w:p>
-          <w:p>
-            <w:pPr>
-              <w:spacing w:after="120" w:line="300"/>
-            </w:pPr>
-            <w:r>
-              <w:rPr>
-                <w:b/>
-                <w:bCs/>
-              </w:rPr>
-              <w:t xml:space="preserve">What we need: </w:t>
-            </w:r>
-            <w:r>
-              <w:t xml:space="preserve">A way to mark text. • An action that sends text to the screen. • A command that starts our program.</w:t>
-            </w:r>
-          </w:p>
-        </w:tc>
-      </w:tr>
-    </w:tbl>
-    <w:tbl>
-      <w:tblPr>
-        <w:tblW w:type="pct" w:w="100%"/>
-        <w:tblBorders>
-          <w:top w:val="single" w:color="auto" w:sz="4"/>
-          <w:left w:val="single" w:color="auto" w:sz="4"/>
-          <w:bottom w:val="single" w:color="auto" w:sz="4"/>
-          <w:right w:val="single" w:color="auto" w:sz="4"/>
-          <w:insideH w:val="single" w:color="auto" w:sz="4"/>
-          <w:insideV w:val="single" w:color="auto" w:sz="4"/>
-        </w:tblBorders>
-      </w:tblPr>
-      <w:tblGrid>
-        <w:gridCol w:w="100"/>
-      </w:tblGrid>
-      <w:tr>
-        <w:tc>
-          <w:tcPr>
-            <w:tcBorders>
-              <w:top w:val="single" w:color="D9E0EA" w:sz="2"/>
-              <w:left w:val="single" w:color="D9E0EA" w:sz="2"/>
-              <w:bottom w:val="single" w:color="D9E0EA" w:sz="2"/>
-              <w:right w:val="single" w:color="D9E0EA" w:sz="2"/>
-            </w:tcBorders>
             <w:shd w:fill="FFF8E8" w:val="clear"/>
             <w:tcMar>
               <w:top w:type="dxa" w:w="130"/>
@@ -1619,432 +1621,7 @@
           <w:bCs/>
           <w:color w:val="4659A7"/>
         </w:rPr>
-        <w:t xml:space="preserve">What actually happens when print() runs?</w:t>
-      </w:r>
-    </w:p>
-    <w:tbl>
-      <w:tblPr>
-        <w:tblW w:type="pct" w:w="100%"/>
-        <w:tblBorders>
-          <w:top w:val="single" w:color="auto" w:sz="4"/>
-          <w:left w:val="single" w:color="auto" w:sz="4"/>
-          <w:bottom w:val="single" w:color="auto" w:sz="4"/>
-          <w:right w:val="single" w:color="auto" w:sz="4"/>
-          <w:insideH w:val="single" w:color="auto" w:sz="4"/>
-          <w:insideV w:val="single" w:color="auto" w:sz="4"/>
-        </w:tblBorders>
-      </w:tblPr>
-      <w:tblGrid>
-        <w:gridCol w:w="100"/>
-        <w:gridCol w:w="100"/>
-      </w:tblGrid>
-      <w:tr>
-        <w:tc>
-          <w:tcPr>
-            <w:tcW w:type="pct" w:w="12%"/>
-            <w:tcBorders>
-              <w:top w:val="single" w:color="D9E0EA" w:sz="2"/>
-              <w:left w:val="single" w:color="D9E0EA" w:sz="2"/>
-              <w:bottom w:val="single" w:color="D9E0EA" w:sz="2"/>
-              <w:right w:val="single" w:color="D9E0EA" w:sz="2"/>
-            </w:tcBorders>
-            <w:shd w:fill="EEF1FA" w:val="clear"/>
-          </w:tcPr>
-          <w:p>
-            <w:pPr>
-              <w:spacing w:after="120" w:line="300"/>
-            </w:pPr>
-            <w:r>
-              <w:rPr>
-                <w:b/>
-                <w:bCs/>
-                <w:color w:val="4659A7"/>
-              </w:rPr>
-              <w:t xml:space="preserve">1</w:t>
-            </w:r>
-          </w:p>
-        </w:tc>
-        <w:tc>
-          <w:tcPr>
-            <w:tcBorders>
-              <w:top w:val="single" w:color="D9E0EA" w:sz="2"/>
-              <w:left w:val="single" w:color="D9E0EA" w:sz="2"/>
-              <w:bottom w:val="single" w:color="D9E0EA" w:sz="2"/>
-              <w:right w:val="single" w:color="D9E0EA" w:sz="2"/>
-            </w:tcBorders>
-            <w:shd w:fill="F5F7FB" w:val="clear"/>
-          </w:tcPr>
-          <w:p>
-            <w:pPr>
-              <w:spacing w:after="120" w:line="300"/>
-            </w:pPr>
-            <w:r>
-              <w:rPr>
-                <w:b/>
-                <w:bCs/>
-                <w:color w:val="4659A7"/>
-                <w:sz w:val="18"/>
-                <w:szCs w:val="18"/>
-              </w:rPr>
-              <w:t xml:space="preserve">SOURCE CODE</w:t>
-            </w:r>
-          </w:p>
-          <w:p>
-            <w:pPr>
-              <w:spacing w:after="120" w:line="300"/>
-            </w:pPr>
-            <w:r>
-              <w:rPr>
-                <w:b/>
-                <w:bCs/>
-                <w:color w:val="263A67"/>
-              </w:rPr>
-              <w:t xml:space="preserve">Python reaches the instruction</w:t>
-            </w:r>
-          </w:p>
-          <w:p>
-            <w:pPr>
-              <w:spacing w:after="120" w:line="300"/>
-            </w:pPr>
-            <w:r>
-              <w:t xml:space="preserve">Python executes print("Hello, World!") in hello.py.</w:t>
-            </w:r>
-          </w:p>
-        </w:tc>
-      </w:tr>
-      <w:tr>
-        <w:tc>
-          <w:tcPr>
-            <w:tcW w:type="pct" w:w="12%"/>
-            <w:tcBorders>
-              <w:top w:val="single" w:color="D9E0EA" w:sz="2"/>
-              <w:left w:val="single" w:color="D9E0EA" w:sz="2"/>
-              <w:bottom w:val="single" w:color="D9E0EA" w:sz="2"/>
-              <w:right w:val="single" w:color="D9E0EA" w:sz="2"/>
-            </w:tcBorders>
-            <w:shd w:fill="EEF1FA" w:val="clear"/>
-          </w:tcPr>
-          <w:p>
-            <w:pPr>
-              <w:spacing w:after="120" w:line="300"/>
-            </w:pPr>
-            <w:r>
-              <w:rPr>
-                <w:b/>
-                <w:bCs/>
-                <w:color w:val="4659A7"/>
-              </w:rPr>
-              <w:t xml:space="preserve">2</w:t>
-            </w:r>
-          </w:p>
-        </w:tc>
-        <w:tc>
-          <w:tcPr>
-            <w:tcBorders>
-              <w:top w:val="single" w:color="D9E0EA" w:sz="2"/>
-              <w:left w:val="single" w:color="D9E0EA" w:sz="2"/>
-              <w:bottom w:val="single" w:color="D9E0EA" w:sz="2"/>
-              <w:right w:val="single" w:color="D9E0EA" w:sz="2"/>
-            </w:tcBorders>
-            <w:shd w:fill="F5F7FB" w:val="clear"/>
-          </w:tcPr>
-          <w:p>
-            <w:pPr>
-              <w:spacing w:after="120" w:line="300"/>
-            </w:pPr>
-            <w:r>
-              <w:rPr>
-                <w:b/>
-                <w:bCs/>
-                <w:color w:val="4659A7"/>
-                <w:sz w:val="18"/>
-                <w:szCs w:val="18"/>
-              </w:rPr>
-              <w:t xml:space="preserve">VALUE</w:t>
-            </w:r>
-          </w:p>
-          <w:p>
-            <w:pPr>
-              <w:spacing w:after="120" w:line="300"/>
-            </w:pPr>
-            <w:r>
-              <w:rPr>
-                <w:b/>
-                <w:bCs/>
-                <w:color w:val="263A67"/>
-              </w:rPr>
-              <w:t xml:space="preserve">Python creates the string</w:t>
-            </w:r>
-          </w:p>
-          <w:p>
-            <w:pPr>
-              <w:spacing w:after="120" w:line="300"/>
-            </w:pPr>
-            <w:r>
-              <w:t xml:space="preserve">The characters inside the quotes become one text value: Hello, World!</w:t>
-            </w:r>
-          </w:p>
-        </w:tc>
-      </w:tr>
-      <w:tr>
-        <w:tc>
-          <w:tcPr>
-            <w:tcW w:type="pct" w:w="12%"/>
-            <w:tcBorders>
-              <w:top w:val="single" w:color="D9E0EA" w:sz="2"/>
-              <w:left w:val="single" w:color="D9E0EA" w:sz="2"/>
-              <w:bottom w:val="single" w:color="D9E0EA" w:sz="2"/>
-              <w:right w:val="single" w:color="D9E0EA" w:sz="2"/>
-            </w:tcBorders>
-            <w:shd w:fill="EEF1FA" w:val="clear"/>
-          </w:tcPr>
-          <w:p>
-            <w:pPr>
-              <w:spacing w:after="120" w:line="300"/>
-            </w:pPr>
-            <w:r>
-              <w:rPr>
-                <w:b/>
-                <w:bCs/>
-                <w:color w:val="4659A7"/>
-              </w:rPr>
-              <w:t xml:space="preserve">3</w:t>
-            </w:r>
-          </w:p>
-        </w:tc>
-        <w:tc>
-          <w:tcPr>
-            <w:tcBorders>
-              <w:top w:val="single" w:color="D9E0EA" w:sz="2"/>
-              <w:left w:val="single" w:color="D9E0EA" w:sz="2"/>
-              <w:bottom w:val="single" w:color="D9E0EA" w:sz="2"/>
-              <w:right w:val="single" w:color="D9E0EA" w:sz="2"/>
-            </w:tcBorders>
-            <w:shd w:fill="F5F7FB" w:val="clear"/>
-          </w:tcPr>
-          <w:p>
-            <w:pPr>
-              <w:spacing w:after="120" w:line="300"/>
-            </w:pPr>
-            <w:r>
-              <w:rPr>
-                <w:b/>
-                <w:bCs/>
-                <w:color w:val="4659A7"/>
-                <w:sz w:val="18"/>
-                <w:szCs w:val="18"/>
-              </w:rPr>
-              <w:t xml:space="preserve">FUNCTION CALL</w:t>
-            </w:r>
-          </w:p>
-          <w:p>
-            <w:pPr>
-              <w:spacing w:after="120" w:line="300"/>
-            </w:pPr>
-            <w:r>
-              <w:rPr>
-                <w:b/>
-                <w:bCs/>
-                <w:color w:val="263A67"/>
-              </w:rPr>
-              <w:t xml:space="preserve">print() writes the value</w:t>
-            </w:r>
-          </w:p>
-          <w:p>
-            <w:pPr>
-              <w:spacing w:after="120" w:line="300"/>
-            </w:pPr>
-            <w:r>
-              <w:t xml:space="preserve">The built-in print function sends the text and a new-line character to standard output, also called stdout.</w:t>
-            </w:r>
-          </w:p>
-        </w:tc>
-      </w:tr>
-      <w:tr>
-        <w:tc>
-          <w:tcPr>
-            <w:tcW w:type="pct" w:w="12%"/>
-            <w:tcBorders>
-              <w:top w:val="single" w:color="D9E0EA" w:sz="2"/>
-              <w:left w:val="single" w:color="D9E0EA" w:sz="2"/>
-              <w:bottom w:val="single" w:color="D9E0EA" w:sz="2"/>
-              <w:right w:val="single" w:color="D9E0EA" w:sz="2"/>
-            </w:tcBorders>
-            <w:shd w:fill="EEF1FA" w:val="clear"/>
-          </w:tcPr>
-          <w:p>
-            <w:pPr>
-              <w:spacing w:after="120" w:line="300"/>
-            </w:pPr>
-            <w:r>
-              <w:rPr>
-                <w:b/>
-                <w:bCs/>
-                <w:color w:val="4659A7"/>
-              </w:rPr>
-              <w:t xml:space="preserve">4</w:t>
-            </w:r>
-          </w:p>
-        </w:tc>
-        <w:tc>
-          <w:tcPr>
-            <w:tcBorders>
-              <w:top w:val="single" w:color="D9E0EA" w:sz="2"/>
-              <w:left w:val="single" w:color="D9E0EA" w:sz="2"/>
-              <w:bottom w:val="single" w:color="D9E0EA" w:sz="2"/>
-              <w:right w:val="single" w:color="D9E0EA" w:sz="2"/>
-            </w:tcBorders>
-            <w:shd w:fill="F5F7FB" w:val="clear"/>
-          </w:tcPr>
-          <w:p>
-            <w:pPr>
-              <w:spacing w:after="120" w:line="300"/>
-            </w:pPr>
-            <w:r>
-              <w:rPr>
-                <w:b/>
-                <w:bCs/>
-                <w:color w:val="4659A7"/>
-                <w:sz w:val="18"/>
-                <w:szCs w:val="18"/>
-              </w:rPr>
-              <w:t xml:space="preserve">TERMINAL</w:t>
-            </w:r>
-          </w:p>
-          <w:p>
-            <w:pPr>
-              <w:spacing w:after="120" w:line="300"/>
-            </w:pPr>
-            <w:r>
-              <w:rPr>
-                <w:b/>
-                <w:bCs/>
-                <w:color w:val="263A67"/>
-              </w:rPr>
-              <w:t xml:space="preserve">The terminal displays the result</w:t>
-            </w:r>
-          </w:p>
-          <w:p>
-            <w:pPr>
-              <w:spacing w:after="120" w:line="300"/>
-            </w:pPr>
-            <w:r>
-              <w:t xml:space="preserve">In this run, stdout is connected to the terminal. The terminal draws Hello, World! on the screen.</w:t>
-            </w:r>
-          </w:p>
-        </w:tc>
-      </w:tr>
-    </w:tbl>
-    <w:p>
-      <w:pPr>
-        <w:spacing w:after="120" w:line="300"/>
-        <w:jc w:val="center"/>
-      </w:pPr>
-      <w:r>
-        <w:rPr>
-          <w:i/>
-          <w:iCs/>
-          <w:color w:val="596579"/>
-          <w:sz w:val="19"/>
-          <w:szCs w:val="19"/>
-        </w:rPr>
-        <w:t xml:space="preserve">This is the visible route for our first program. Python and the operating system perform more work inside, which we explore in the next lesson.</w:t>
-      </w:r>
-    </w:p>
-    <w:tbl>
-      <w:tblPr>
-        <w:tblW w:type="pct" w:w="100%"/>
-        <w:tblBorders>
-          <w:top w:val="single" w:color="auto" w:sz="4"/>
-          <w:left w:val="single" w:color="auto" w:sz="4"/>
-          <w:bottom w:val="single" w:color="auto" w:sz="4"/>
-          <w:right w:val="single" w:color="auto" w:sz="4"/>
-          <w:insideH w:val="single" w:color="auto" w:sz="4"/>
-          <w:insideV w:val="single" w:color="auto" w:sz="4"/>
-        </w:tblBorders>
-      </w:tblPr>
-      <w:tblGrid>
-        <w:gridCol w:w="100"/>
-      </w:tblGrid>
-      <w:tr>
-        <w:tc>
-          <w:tcPr>
-            <w:tcBorders>
-              <w:top w:val="single" w:color="D9E0EA" w:sz="2"/>
-              <w:left w:val="single" w:color="D9E0EA" w:sz="2"/>
-              <w:bottom w:val="single" w:color="D9E0EA" w:sz="2"/>
-              <w:right w:val="single" w:color="D9E0EA" w:sz="2"/>
-            </w:tcBorders>
-            <w:shd w:fill="F2F4FA" w:val="clear"/>
-            <w:tcMar>
-              <w:top w:type="dxa" w:w="130"/>
-              <w:left w:type="dxa" w:w="160"/>
-              <w:bottom w:type="dxa" w:w="130"/>
-              <w:right w:type="dxa" w:w="160"/>
-            </w:tcMar>
-          </w:tcPr>
-          <w:p>
-            <w:pPr>
-              <w:spacing w:after="120" w:line="300"/>
-            </w:pPr>
-            <w:r>
-              <w:rPr>
-                <w:b/>
-                <w:bCs/>
-                <w:color w:val="263A67"/>
-              </w:rPr>
-              <w:t xml:space="preserve">What is stdout?</w:t>
-            </w:r>
-          </w:p>
-          <w:p>
-            <w:pPr>
-              <w:spacing w:after="120" w:line="300"/>
-            </w:pPr>
-            <w:r>
-              <w:t xml:space="preserve">stdout means </w:t>
-            </w:r>
-            <w:r>
-              <w:rPr>
-                <w:b/>
-                <w:bCs/>
-              </w:rPr>
-              <w:t xml:space="preserve">standard output</w:t>
-            </w:r>
-            <w:r>
-              <w:t xml:space="preserve">. It is the normal stream a program uses to send results outward. In our terminal, that stream appears as text on the screen.</w:t>
-            </w:r>
-          </w:p>
-        </w:tc>
-      </w:tr>
-    </w:tbl>
-    <w:p>
-      <w:pPr>
-        <w:pStyle w:val="Heading2"/>
-        <w:keepNext/>
-        <w:spacing w:after="100" w:before="240"/>
-      </w:pPr>
-      <w:r>
-        <w:rPr>
-          <w:b/>
-          <w:bCs/>
-          <w:color w:val="4659A7"/>
-        </w:rPr>
         <w:t xml:space="preserve">Step 3: Plan before we type</w:t>
-      </w:r>
-    </w:p>
-    <w:p>
-      <w:pPr>
-        <w:pStyle w:val="Heading2"/>
-        <w:keepNext/>
-        <w:spacing w:after="100" w:before="240"/>
-      </w:pPr>
-      <w:r>
-        <w:rPr>
-          <w:b/>
-          <w:bCs/>
-          <w:color w:val="4659A7"/>
-        </w:rPr>
-        <w:t xml:space="preserve">Plan before we type</w:t>
       </w:r>
     </w:p>
     <w:tbl>
@@ -2152,21 +1729,6 @@
     </w:p>
     <w:p>
       <w:pPr>
-        <w:pStyle w:val="Heading2"/>
-        <w:keepNext/>
-        <w:spacing w:after="100" w:before="240"/>
-      </w:pPr>
-      <w:r>
-        <w:rPr>
-          <w:b/>
-          <w:bCs/>
-          <w:color w:val="4659A7"/>
-        </w:rPr>
-        <w:t xml:space="preserve">The code</w:t>
-      </w:r>
-    </w:p>
-    <w:p>
-      <w:pPr>
         <w:spacing w:after="120" w:line="300"/>
       </w:pPr>
       <w:r>
@@ -2345,22 +1907,46 @@
           <w:bCs/>
           <w:color w:val="4659A7"/>
         </w:rPr>
-        <w:t xml:space="preserve">Step 5: Watch the instruction become output</w:t>
-      </w:r>
-    </w:p>
-    <w:p>
-      <w:pPr>
-        <w:pStyle w:val="Heading2"/>
-        <w:keepNext/>
-        <w:spacing w:after="100" w:before="240"/>
-      </w:pPr>
-      <w:r>
-        <w:rPr>
-          <w:b/>
-          <w:bCs/>
-          <w:color w:val="4659A7"/>
-        </w:rPr>
-        <w:t xml:space="preserve">Program run: every step</w:t>
+        <w:t xml:space="preserve">Step 5: Watch one complete run</w:t>
+      </w:r>
+    </w:p>
+    <w:p>
+      <w:pPr>
+        <w:spacing w:after="120" w:line="300"/>
+      </w:pPr>
+      <w:r>
+        <w:t xml:space="preserve">The visualizer below tells the whole runtime story once. At the final step, </w:t>
+      </w:r>
+      <w:r>
+        <w:rPr>
+          <w:rFonts w:ascii="Consolas" w:cs="Consolas" w:eastAsia="Consolas" w:hAnsi="Consolas"/>
+          <w:color w:val="4659A7"/>
+          <w:shd w:fill="EEF1FA" w:val="clear"/>
+        </w:rPr>
+        <w:t xml:space="preserve">print()</w:t>
+      </w:r>
+      <w:r>
+        <w:t xml:space="preserve"> writes the message to </w:t>
+      </w:r>
+      <w:r>
+        <w:rPr>
+          <w:b/>
+          <w:bCs/>
+        </w:rPr>
+        <w:t xml:space="preserve">standard output</w:t>
+      </w:r>
+      <w:r>
+        <w:t xml:space="preserve">, often shortened to </w:t>
+      </w:r>
+      <w:r>
+        <w:rPr>
+          <w:b/>
+          <w:bCs/>
+        </w:rPr>
+        <w:t xml:space="preserve">stdout</w:t>
+      </w:r>
+      <w:r>
+        <w:t xml:space="preserve">. Our terminal is connected to that stream, so the message appears on the screen.</w:t>
       </w:r>
     </w:p>
     <w:p>
@@ -2703,21 +2289,6 @@
           <w:color w:val="4659A7"/>
         </w:rPr>
         <w:t xml:space="preserve">Step 6: Make it yours</w:t>
-      </w:r>
-    </w:p>
-    <w:p>
-      <w:pPr>
-        <w:pStyle w:val="Heading2"/>
-        <w:keepNext/>
-        <w:spacing w:after="100" w:before="240"/>
-      </w:pPr>
-      <w:r>
-        <w:rPr>
-          <w:b/>
-          <w:bCs/>
-          <w:color w:val="4659A7"/>
-        </w:rPr>
-        <w:t xml:space="preserve">Try it yourself</w:t>
       </w:r>
     </w:p>
     <w:p>
@@ -3419,7 +2990,7 @@
       </w:r>
     </w:p>
     <w:p>
-      <w:hyperlink w:history="1" r:id="rId6oquuwzfqtnpvd04abk0b">
+      <w:hyperlink w:history="1" r:id="rId2bclh6joxjcfdmmnbfr0w">
         <w:r>
           <w:rPr>
             <w:rStyle w:val="Hyperlink"/>
@@ -3437,7 +3008,7 @@
       </w:r>
     </w:p>
     <w:p>
-      <w:hyperlink w:history="1" r:id="rIdswm6lbujvh7iiaotvnsxl">
+      <w:hyperlink w:history="1" r:id="rIddhab32dzkzmxnf6sqgaxk">
         <w:r>
           <w:rPr>
             <w:rStyle w:val="Hyperlink"/>
@@ -3520,6 +3091,8 @@
           <w:b/>
           <w:bCs/>
           <w:color w:val="263A67"/>
+          <w:sz w:val="48"/>
+          <w:szCs w:val="48"/>
         </w:rPr>
         <w:t xml:space="preserve">Lesson 2: How Does Our Code Reach the Computer?</w:t>
       </w:r>
@@ -3537,6 +3110,103 @@
         <w:t xml:space="preserve">Follow one tiny message from our file to the screen. No hidden knowledge required.</w:t>
       </w:r>
     </w:p>
+    <w:tbl>
+      <w:tblPr>
+        <w:tblW w:type="pct" w:w="100%"/>
+        <w:tblBorders>
+          <w:top w:val="single" w:color="auto" w:sz="4"/>
+          <w:left w:val="single" w:color="auto" w:sz="4"/>
+          <w:bottom w:val="single" w:color="auto" w:sz="4"/>
+          <w:right w:val="single" w:color="auto" w:sz="4"/>
+          <w:insideH w:val="single" w:color="auto" w:sz="4"/>
+          <w:insideV w:val="single" w:color="auto" w:sz="4"/>
+        </w:tblBorders>
+      </w:tblPr>
+      <w:tblGrid>
+        <w:gridCol w:w="100"/>
+      </w:tblGrid>
+      <w:tr>
+        <w:tc>
+          <w:tcPr>
+            <w:tcBorders>
+              <w:top w:val="single" w:color="D9E0EA" w:sz="2"/>
+              <w:left w:val="single" w:color="D9E0EA" w:sz="2"/>
+              <w:bottom w:val="single" w:color="D9E0EA" w:sz="2"/>
+              <w:right w:val="single" w:color="D9E0EA" w:sz="2"/>
+            </w:tcBorders>
+            <w:shd w:fill="EEF5FA" w:val="clear"/>
+            <w:tcMar>
+              <w:top w:type="dxa" w:w="130"/>
+              <w:left w:type="dxa" w:w="160"/>
+              <w:bottom w:type="dxa" w:w="130"/>
+              <w:right w:type="dxa" w:w="160"/>
+            </w:tcMar>
+          </w:tcPr>
+          <w:p>
+            <w:pPr>
+              <w:spacing w:after="120" w:line="300"/>
+            </w:pPr>
+            <w:r>
+              <w:rPr>
+                <w:b/>
+                <w:bCs/>
+                <w:color w:val="263A67"/>
+              </w:rPr>
+              <w:t xml:space="preserve">OUR MISSION · Find the helper between us and the machine</w:t>
+            </w:r>
+          </w:p>
+          <w:p>
+            <w:pPr>
+              <w:spacing w:after="120" w:line="300"/>
+            </w:pPr>
+            <w:r>
+              <w:t xml:space="preserve">We can read </w:t>
+            </w:r>
+            <w:r>
+              <w:rPr>
+                <w:rFonts w:ascii="Consolas" w:cs="Consolas" w:eastAsia="Consolas" w:hAnsi="Consolas"/>
+                <w:color w:val="4659A7"/>
+                <w:shd w:fill="EEF1FA" w:val="clear"/>
+              </w:rPr>
+              <w:t xml:space="preserve">print("Hello")</w:t>
+            </w:r>
+            <w:r>
+              <w:t xml:space="preserve">. The processor cannot read Python words. Something must help in the middle.</w:t>
+            </w:r>
+          </w:p>
+          <w:p>
+            <w:pPr>
+              <w:spacing w:after="120" w:line="300"/>
+            </w:pPr>
+            <w:r>
+              <w:rPr>
+                <w:b/>
+                <w:bCs/>
+              </w:rPr>
+              <w:t xml:space="preserve">What we know: </w:t>
+            </w:r>
+            <w:r>
+              <w:t xml:space="preserve">We write instructions in a file. • Running the file produces a result.</w:t>
+            </w:r>
+          </w:p>
+          <w:p>
+            <w:pPr>
+              <w:spacing w:after="120" w:line="300"/>
+            </w:pPr>
+            <w:r>
+              <w:rPr>
+                <w:b/>
+                <w:bCs/>
+              </w:rPr>
+              <w:t xml:space="preserve">What we need: </w:t>
+            </w:r>
+            <w:r>
+              <w:t xml:space="preserve">The missing middle step. • A simple reason why languages take different routes.</w:t>
+            </w:r>
+          </w:p>
+        </w:tc>
+      </w:tr>
+    </w:tbl>
     <w:p>
       <w:pPr>
         <w:jc w:val="center"/>
@@ -3686,103 +3356,6 @@
               <w:bottom w:val="single" w:color="D9E0EA" w:sz="2"/>
               <w:right w:val="single" w:color="D9E0EA" w:sz="2"/>
             </w:tcBorders>
-            <w:shd w:fill="EEF5FA" w:val="clear"/>
-            <w:tcMar>
-              <w:top w:type="dxa" w:w="130"/>
-              <w:left w:type="dxa" w:w="160"/>
-              <w:bottom w:type="dxa" w:w="130"/>
-              <w:right w:type="dxa" w:w="160"/>
-            </w:tcMar>
-          </w:tcPr>
-          <w:p>
-            <w:pPr>
-              <w:spacing w:after="120" w:line="300"/>
-            </w:pPr>
-            <w:r>
-              <w:rPr>
-                <w:b/>
-                <w:bCs/>
-                <w:color w:val="263A67"/>
-              </w:rPr>
-              <w:t xml:space="preserve">OUR MISSION · Find the helper between us and the machine</w:t>
-            </w:r>
-          </w:p>
-          <w:p>
-            <w:pPr>
-              <w:spacing w:after="120" w:line="300"/>
-            </w:pPr>
-            <w:r>
-              <w:t xml:space="preserve">We can read </w:t>
-            </w:r>
-            <w:r>
-              <w:rPr>
-                <w:rFonts w:ascii="Consolas" w:cs="Consolas" w:eastAsia="Consolas" w:hAnsi="Consolas"/>
-                <w:color w:val="4659A7"/>
-                <w:shd w:fill="EEF1FA" w:val="clear"/>
-              </w:rPr>
-              <w:t xml:space="preserve">print("Hello")</w:t>
-            </w:r>
-            <w:r>
-              <w:t xml:space="preserve">. The processor cannot read Python words. Something must help in the middle.</w:t>
-            </w:r>
-          </w:p>
-          <w:p>
-            <w:pPr>
-              <w:spacing w:after="120" w:line="300"/>
-            </w:pPr>
-            <w:r>
-              <w:rPr>
-                <w:b/>
-                <w:bCs/>
-              </w:rPr>
-              <w:t xml:space="preserve">What we know: </w:t>
-            </w:r>
-            <w:r>
-              <w:t xml:space="preserve">We write instructions in a file. • Running the file produces a result.</w:t>
-            </w:r>
-          </w:p>
-          <w:p>
-            <w:pPr>
-              <w:spacing w:after="120" w:line="300"/>
-            </w:pPr>
-            <w:r>
-              <w:rPr>
-                <w:b/>
-                <w:bCs/>
-              </w:rPr>
-              <w:t xml:space="preserve">What we need: </w:t>
-            </w:r>
-            <w:r>
-              <w:t xml:space="preserve">The missing middle step. • A simple reason why languages take different routes.</w:t>
-            </w:r>
-          </w:p>
-        </w:tc>
-      </w:tr>
-    </w:tbl>
-    <w:tbl>
-      <w:tblPr>
-        <w:tblW w:type="pct" w:w="100%"/>
-        <w:tblBorders>
-          <w:top w:val="single" w:color="auto" w:sz="4"/>
-          <w:left w:val="single" w:color="auto" w:sz="4"/>
-          <w:bottom w:val="single" w:color="auto" w:sz="4"/>
-          <w:right w:val="single" w:color="auto" w:sz="4"/>
-          <w:insideH w:val="single" w:color="auto" w:sz="4"/>
-          <w:insideV w:val="single" w:color="auto" w:sz="4"/>
-        </w:tblBorders>
-      </w:tblPr>
-      <w:tblGrid>
-        <w:gridCol w:w="100"/>
-      </w:tblGrid>
-      <w:tr>
-        <w:tc>
-          <w:tcPr>
-            <w:tcBorders>
-              <w:top w:val="single" w:color="D9E0EA" w:sz="2"/>
-              <w:left w:val="single" w:color="D9E0EA" w:sz="2"/>
-              <w:bottom w:val="single" w:color="D9E0EA" w:sz="2"/>
-              <w:right w:val="single" w:color="D9E0EA" w:sz="2"/>
-            </w:tcBorders>
             <w:shd w:fill="FFF8E8" w:val="clear"/>
             <w:tcMar>
               <w:top w:type="dxa" w:w="130"/>
@@ -5916,218 +5489,376 @@
           <w:bCs/>
           <w:color w:val="4659A7"/>
         </w:rPr>
-        <w:t xml:space="preserve">Show me: what does Python bytecode look like?</w:t>
-      </w:r>
-    </w:p>
-    <w:p>
-      <w:pPr>
-        <w:spacing w:after="120" w:line="300"/>
-      </w:pPr>
-      <w:r>
-        <w:t xml:space="preserve">Here is our readable Python file first:</w:t>
-      </w:r>
-    </w:p>
-    <w:p>
-      <w:pPr>
-        <w:pStyle w:val="Heading2"/>
-        <w:keepNext/>
-        <w:spacing w:after="100" w:before="240"/>
-      </w:pPr>
-      <w:r>
-        <w:rPr>
-          <w:b/>
-          <w:bCs/>
-          <w:color w:val="4659A7"/>
-        </w:rPr>
-        <w:t xml:space="preserve">The code</w:t>
-      </w:r>
-    </w:p>
-    <w:p>
-      <w:pPr>
-        <w:spacing w:after="120" w:line="300"/>
-      </w:pPr>
-      <w:r>
-        <w:rPr>
-          <w:rFonts w:ascii="Consolas" w:cs="Consolas" w:eastAsia="Consolas" w:hAnsi="Consolas"/>
-          <w:b/>
-          <w:bCs/>
-          <w:color w:val="4659A7"/>
-        </w:rPr>
-        <w:t xml:space="preserve">message.py</w:t>
-      </w:r>
-    </w:p>
-    <w:p>
-      <w:pPr>
-        <w:keepLines/>
-        <w:shd w:fill="F4F6F9" w:val="clear"/>
-        <w:spacing w:after="0" w:line="260"/>
-      </w:pPr>
-      <w:r>
-        <w:rPr>
-          <w:rFonts w:ascii="Consolas" w:cs="Consolas" w:eastAsia="Consolas" w:hAnsi="Consolas"/>
-          <w:sz w:val="19"/>
-          <w:szCs w:val="19"/>
-        </w:rPr>
-        <w:t xml:space="preserve"> 1  message = "Hello"</w:t>
-      </w:r>
-    </w:p>
-    <w:p>
-      <w:pPr>
-        <w:keepLines/>
-        <w:shd w:fill="F4F6F9" w:val="clear"/>
-        <w:spacing w:after="0" w:line="260"/>
-      </w:pPr>
-      <w:r>
-        <w:rPr>
-          <w:rFonts w:ascii="Consolas" w:cs="Consolas" w:eastAsia="Consolas" w:hAnsi="Consolas"/>
-          <w:sz w:val="19"/>
-          <w:szCs w:val="19"/>
-        </w:rPr>
-        <w:t xml:space="preserve"> 2  print(message)</w:t>
-      </w:r>
-    </w:p>
-    <w:p>
-      <w:pPr>
-        <w:spacing w:after="120" w:line="300"/>
-      </w:pPr>
-      <w:r>
-        <w:t xml:space="preserve">Now we ask CPython to show its smaller instructions. The exact list can change between Python versions. Focus on the action words, not the numbers.</w:t>
-      </w:r>
-    </w:p>
-    <w:p>
-      <w:pPr>
-        <w:pStyle w:val="Heading2"/>
-        <w:keepNext/>
-        <w:spacing w:after="100" w:before="240"/>
-      </w:pPr>
-      <w:r>
-        <w:rPr>
-          <w:b/>
-          <w:bCs/>
-          <w:color w:val="4659A7"/>
-        </w:rPr>
-        <w:t xml:space="preserve">Expected output</w:t>
-      </w:r>
-    </w:p>
-    <w:p>
-      <w:pPr>
-        <w:spacing w:after="120" w:line="300"/>
-      </w:pPr>
-      <w:r>
-        <w:rPr>
-          <w:rFonts w:ascii="Consolas" w:cs="Consolas" w:eastAsia="Consolas" w:hAnsi="Consolas"/>
-          <w:b/>
-          <w:bCs/>
-          <w:color w:val="4659A7"/>
-        </w:rPr>
-        <w:t xml:space="preserve">Terminal</w:t>
-      </w:r>
-    </w:p>
-    <w:p>
-      <w:pPr>
-        <w:keepLines/>
-        <w:shd w:fill="F4F6F9" w:val="clear"/>
-        <w:spacing w:after="0" w:line="260"/>
-      </w:pPr>
-      <w:r>
-        <w:rPr>
-          <w:rFonts w:ascii="Consolas" w:cs="Consolas" w:eastAsia="Consolas" w:hAnsi="Consolas"/>
-          <w:sz w:val="19"/>
-          <w:szCs w:val="19"/>
-        </w:rPr>
-        <w:t xml:space="preserve"> 1  $ python -m dis message.py</w:t>
-      </w:r>
-    </w:p>
-    <w:p>
-      <w:pPr>
-        <w:keepLines/>
-        <w:shd w:fill="F4F6F9" w:val="clear"/>
-        <w:spacing w:after="0" w:line="260"/>
-      </w:pPr>
-      <w:r>
-        <w:rPr>
-          <w:rFonts w:ascii="Consolas" w:cs="Consolas" w:eastAsia="Consolas" w:hAnsi="Consolas"/>
-          <w:sz w:val="19"/>
-          <w:szCs w:val="19"/>
-        </w:rPr>
-        <w:t xml:space="preserve"> 2  LOAD_CONST    "Hello"</w:t>
-      </w:r>
-    </w:p>
-    <w:p>
-      <w:pPr>
-        <w:keepLines/>
-        <w:shd w:fill="F4F6F9" w:val="clear"/>
-        <w:spacing w:after="0" w:line="260"/>
-      </w:pPr>
-      <w:r>
-        <w:rPr>
-          <w:rFonts w:ascii="Consolas" w:cs="Consolas" w:eastAsia="Consolas" w:hAnsi="Consolas"/>
-          <w:sz w:val="19"/>
-          <w:szCs w:val="19"/>
-        </w:rPr>
-        <w:t xml:space="preserve"> 3  STORE_NAME    message</w:t>
-      </w:r>
-    </w:p>
-    <w:p>
-      <w:pPr>
-        <w:keepLines/>
-        <w:shd w:fill="F4F6F9" w:val="clear"/>
-        <w:spacing w:after="0" w:line="260"/>
-      </w:pPr>
-      <w:r>
-        <w:rPr>
-          <w:rFonts w:ascii="Consolas" w:cs="Consolas" w:eastAsia="Consolas" w:hAnsi="Consolas"/>
-          <w:sz w:val="19"/>
-          <w:szCs w:val="19"/>
-        </w:rPr>
-        <w:t xml:space="preserve"> 4  LOAD_NAME     print</w:t>
-      </w:r>
-    </w:p>
-    <w:p>
-      <w:pPr>
-        <w:keepLines/>
-        <w:shd w:fill="F4F6F9" w:val="clear"/>
-        <w:spacing w:after="0" w:line="260"/>
-      </w:pPr>
-      <w:r>
-        <w:rPr>
-          <w:rFonts w:ascii="Consolas" w:cs="Consolas" w:eastAsia="Consolas" w:hAnsi="Consolas"/>
-          <w:sz w:val="19"/>
-          <w:szCs w:val="19"/>
-        </w:rPr>
-        <w:t xml:space="preserve"> 5  LOAD_NAME     message</w:t>
-      </w:r>
-    </w:p>
-    <w:p>
-      <w:pPr>
-        <w:keepLines/>
-        <w:shd w:fill="F4F6F9" w:val="clear"/>
-        <w:spacing w:after="0" w:line="260"/>
-      </w:pPr>
-      <w:r>
-        <w:rPr>
-          <w:rFonts w:ascii="Consolas" w:cs="Consolas" w:eastAsia="Consolas" w:hAnsi="Consolas"/>
-          <w:sz w:val="19"/>
-          <w:szCs w:val="19"/>
-        </w:rPr>
-        <w:t xml:space="preserve"> 6  CALL          1</w:t>
-      </w:r>
-    </w:p>
-    <w:p>
-      <w:pPr>
-        <w:keepLines/>
-        <w:shd w:fill="F4F6F9" w:val="clear"/>
-        <w:spacing w:after="0" w:line="260"/>
-      </w:pPr>
-      <w:r>
-        <w:rPr>
-          <w:rFonts w:ascii="Consolas" w:cs="Consolas" w:eastAsia="Consolas" w:hAnsi="Consolas"/>
-          <w:sz w:val="19"/>
-          <w:szCs w:val="19"/>
-        </w:rPr>
-        <w:t xml:space="preserve"> 7  RETURN_VALUE</w:t>
-      </w:r>
-    </w:p>
+        <w:t xml:space="preserve">Show me: how does source code become bytecode actions?</w:t>
+      </w:r>
+    </w:p>
+    <w:p>
+      <w:pPr>
+        <w:spacing w:after="120" w:line="300"/>
+      </w:pPr>
+      <w:r>
+        <w:t xml:space="preserve">Read each source line, then travel downward through the smaller CPython actions it creates. The state note shows what changed after that action.</w:t>
+      </w:r>
+    </w:p>
+    <w:tbl>
+      <w:tblPr>
+        <w:tblW w:type="pct" w:w="100%"/>
+        <w:tblBorders>
+          <w:top w:val="single" w:color="auto" w:sz="4"/>
+          <w:left w:val="single" w:color="auto" w:sz="4"/>
+          <w:bottom w:val="single" w:color="auto" w:sz="4"/>
+          <w:right w:val="single" w:color="auto" w:sz="4"/>
+          <w:insideH w:val="single" w:color="auto" w:sz="4"/>
+          <w:insideV w:val="single" w:color="auto" w:sz="4"/>
+        </w:tblBorders>
+      </w:tblPr>
+      <w:tblGrid>
+        <w:gridCol w:w="100"/>
+      </w:tblGrid>
+      <w:tr>
+        <w:tc>
+          <w:tcPr>
+            <w:tcBorders>
+              <w:top w:val="single" w:color="D9E0EA" w:sz="2"/>
+              <w:left w:val="single" w:color="D9E0EA" w:sz="2"/>
+              <w:bottom w:val="single" w:color="D9E0EA" w:sz="2"/>
+              <w:right w:val="single" w:color="D9E0EA" w:sz="2"/>
+            </w:tcBorders>
+            <w:shd w:fill="EEF1FA" w:val="clear"/>
+            <w:tcMar>
+              <w:top w:type="dxa" w:w="130"/>
+              <w:left w:type="dxa" w:w="160"/>
+              <w:bottom w:type="dxa" w:w="130"/>
+              <w:right w:type="dxa" w:w="160"/>
+            </w:tcMar>
+          </w:tcPr>
+          <w:p>
+            <w:pPr>
+              <w:spacing w:after="120" w:line="300"/>
+            </w:pPr>
+            <w:r>
+              <w:rPr>
+                <w:b/>
+                <w:bCs/>
+                <w:color w:val="263A67"/>
+              </w:rPr>
+              <w:t xml:space="preserve">CPython 3.14 learning map</w:t>
+            </w:r>
+          </w:p>
+          <w:p>
+            <w:pPr>
+              <w:spacing w:after="120" w:line="300"/>
+            </w:pPr>
+            <w:r>
+              <w:rPr>
+                <w:b/>
+                <w:bCs/>
+                <w:color w:val="4659A7"/>
+              </w:rPr>
+              <w:t xml:space="preserve">SOURCE 1: </w:t>
+            </w:r>
+            <w:r>
+              <w:rPr>
+                <w:rFonts w:ascii="Consolas" w:cs="Consolas" w:eastAsia="Consolas" w:hAnsi="Consolas"/>
+                <w:b/>
+                <w:bCs/>
+              </w:rPr>
+              <w:t xml:space="preserve">message = "Hello"</w:t>
+            </w:r>
+          </w:p>
+          <w:p>
+            <w:pPr>
+              <w:spacing w:after="120" w:line="300"/>
+            </w:pPr>
+            <w:r>
+              <w:rPr>
+                <w:b/>
+                <w:bCs/>
+                <w:color w:val="168A8A"/>
+              </w:rPr>
+              <w:t xml:space="preserve">1. LOAD_CONST: </w:t>
+            </w:r>
+            <w:r>
+              <w:t xml:space="preserve">Pick up the fixed value "Hello".</w:t>
+            </w:r>
+          </w:p>
+          <w:p>
+            <w:pPr>
+              <w:spacing w:after="120" w:line="300"/>
+            </w:pPr>
+            <w:r>
+              <w:rPr>
+                <w:b/>
+                <w:bCs/>
+              </w:rPr>
+              <w:t xml:space="preserve">State: </w:t>
+            </w:r>
+            <w:r>
+              <w:t xml:space="preserve">Value stack: ["Hello"]</w:t>
+            </w:r>
+          </w:p>
+          <w:p>
+            <w:pPr>
+              <w:spacing w:after="120" w:line="300"/>
+            </w:pPr>
+            <w:r>
+              <w:rPr>
+                <w:b/>
+                <w:bCs/>
+                <w:color w:val="168A8A"/>
+              </w:rPr>
+              <w:t xml:space="preserve">2. STORE_NAME: </w:t>
+            </w:r>
+            <w:r>
+              <w:t xml:space="preserve">Connect that value to the name message.</w:t>
+            </w:r>
+          </w:p>
+          <w:p>
+            <w:pPr>
+              <w:spacing w:after="120" w:line="300"/>
+            </w:pPr>
+            <w:r>
+              <w:rPr>
+                <w:b/>
+                <w:bCs/>
+              </w:rPr>
+              <w:t xml:space="preserve">State: </w:t>
+            </w:r>
+            <w:r>
+              <w:t xml:space="preserve">Names: message → "Hello"</w:t>
+            </w:r>
+          </w:p>
+          <w:p>
+            <w:pPr>
+              <w:spacing w:after="120" w:line="300"/>
+            </w:pPr>
+            <w:r>
+              <w:rPr>
+                <w:b/>
+                <w:bCs/>
+                <w:color w:val="4659A7"/>
+              </w:rPr>
+              <w:t xml:space="preserve">SOURCE 2: </w:t>
+            </w:r>
+            <w:r>
+              <w:rPr>
+                <w:rFonts w:ascii="Consolas" w:cs="Consolas" w:eastAsia="Consolas" w:hAnsi="Consolas"/>
+                <w:b/>
+                <w:bCs/>
+              </w:rPr>
+              <w:t xml:space="preserve">print(message)</w:t>
+            </w:r>
+          </w:p>
+          <w:p>
+            <w:pPr>
+              <w:spacing w:after="120" w:line="300"/>
+            </w:pPr>
+            <w:r>
+              <w:rPr>
+                <w:b/>
+                <w:bCs/>
+                <w:color w:val="168A8A"/>
+              </w:rPr>
+              <w:t xml:space="preserve">1. LOAD_NAME print: </w:t>
+            </w:r>
+            <w:r>
+              <w:t xml:space="preserve">Find the built-in print function.</w:t>
+            </w:r>
+          </w:p>
+          <w:p>
+            <w:pPr>
+              <w:spacing w:after="120" w:line="300"/>
+            </w:pPr>
+            <w:r>
+              <w:rPr>
+                <w:b/>
+                <w:bCs/>
+              </w:rPr>
+              <w:t xml:space="preserve">State: </w:t>
+            </w:r>
+            <w:r>
+              <w:t xml:space="preserve">Ready action: print</w:t>
+            </w:r>
+          </w:p>
+          <w:p>
+            <w:pPr>
+              <w:spacing w:after="120" w:line="300"/>
+            </w:pPr>
+            <w:r>
+              <w:rPr>
+                <w:b/>
+                <w:bCs/>
+                <w:color w:val="168A8A"/>
+              </w:rPr>
+              <w:t xml:space="preserve">2. LOAD_NAME message: </w:t>
+            </w:r>
+            <w:r>
+              <w:t xml:space="preserve">Find the value connected to message.</w:t>
+            </w:r>
+          </w:p>
+          <w:p>
+            <w:pPr>
+              <w:spacing w:after="120" w:line="300"/>
+            </w:pPr>
+            <w:r>
+              <w:rPr>
+                <w:b/>
+                <w:bCs/>
+              </w:rPr>
+              <w:t xml:space="preserve">State: </w:t>
+            </w:r>
+            <w:r>
+              <w:t xml:space="preserve">Argument: "Hello"</w:t>
+            </w:r>
+          </w:p>
+          <w:p>
+            <w:pPr>
+              <w:spacing w:after="120" w:line="300"/>
+            </w:pPr>
+            <w:r>
+              <w:rPr>
+                <w:b/>
+                <w:bCs/>
+                <w:color w:val="168A8A"/>
+              </w:rPr>
+              <w:t xml:space="preserve">3. CALL 1: </w:t>
+            </w:r>
+            <w:r>
+              <w:t xml:space="preserve">Call print with one argument.</w:t>
+            </w:r>
+          </w:p>
+          <w:p>
+            <w:pPr>
+              <w:spacing w:after="120" w:line="300"/>
+            </w:pPr>
+            <w:r>
+              <w:rPr>
+                <w:b/>
+                <w:bCs/>
+              </w:rPr>
+              <w:t xml:space="preserve">State: </w:t>
+            </w:r>
+            <w:r>
+              <w:t xml:space="preserve">Visible output: Hello</w:t>
+            </w:r>
+          </w:p>
+          <w:p>
+            <w:pPr>
+              <w:spacing w:after="120" w:line="300"/>
+            </w:pPr>
+            <w:r>
+              <w:rPr>
+                <w:b/>
+                <w:bCs/>
+                <w:color w:val="168A8A"/>
+              </w:rPr>
+              <w:t xml:space="preserve">4. POP_TOP: </w:t>
+            </w:r>
+            <w:r>
+              <w:t xml:space="preserve">Discard the None value returned by print.</w:t>
+            </w:r>
+          </w:p>
+          <w:p>
+            <w:pPr>
+              <w:spacing w:after="120" w:line="300"/>
+            </w:pPr>
+            <w:r>
+              <w:rPr>
+                <w:b/>
+                <w:bCs/>
+              </w:rPr>
+              <w:t xml:space="preserve">State: </w:t>
+            </w:r>
+            <w:r>
+              <w:t xml:space="preserve">The temporary result is no longer needed.</w:t>
+            </w:r>
+          </w:p>
+          <w:p>
+            <w:pPr>
+              <w:spacing w:after="120" w:line="300"/>
+            </w:pPr>
+            <w:r>
+              <w:rPr>
+                <w:b/>
+                <w:bCs/>
+                <w:color w:val="4659A7"/>
+              </w:rPr>
+              <w:t xml:space="preserve">SOURCE 3: </w:t>
+            </w:r>
+            <w:r>
+              <w:rPr>
+                <w:rFonts w:ascii="Consolas" w:cs="Consolas" w:eastAsia="Consolas" w:hAnsi="Consolas"/>
+                <w:b/>
+                <w:bCs/>
+              </w:rPr>
+              <w:t xml:space="preserve">end of message.py</w:t>
+            </w:r>
+          </w:p>
+          <w:p>
+            <w:pPr>
+              <w:spacing w:after="120" w:line="300"/>
+            </w:pPr>
+            <w:r>
+              <w:rPr>
+                <w:b/>
+                <w:bCs/>
+                <w:color w:val="168A8A"/>
+              </w:rPr>
+              <w:t xml:space="preserve">1. RETURN_CONST None: </w:t>
+            </w:r>
+            <w:r>
+              <w:t xml:space="preserve">Finish running this code object.</w:t>
+            </w:r>
+          </w:p>
+          <w:p>
+            <w:pPr>
+              <w:spacing w:after="120" w:line="300"/>
+            </w:pPr>
+            <w:r>
+              <w:rPr>
+                <w:b/>
+                <w:bCs/>
+              </w:rPr>
+              <w:t xml:space="preserve">State: </w:t>
+            </w:r>
+            <w:r>
+              <w:t xml:space="preserve">The script has ended.</w:t>
+            </w:r>
+          </w:p>
+          <w:p>
+            <w:pPr>
+              <w:spacing w:after="120" w:line="300"/>
+            </w:pPr>
+            <w:r>
+              <w:rPr>
+                <w:b/>
+                <w:bCs/>
+              </w:rPr>
+              <w:t xml:space="preserve">Try it: </w:t>
+            </w:r>
+            <w:r>
+              <w:rPr>
+                <w:rFonts w:ascii="Consolas" w:cs="Consolas" w:eastAsia="Consolas" w:hAnsi="Consolas"/>
+              </w:rPr>
+              <w:t xml:space="preserve">python -m dis message.py</w:t>
+            </w:r>
+          </w:p>
+          <w:p>
+            <w:pPr>
+              <w:spacing w:after="120" w:line="300"/>
+            </w:pPr>
+            <w:r>
+              <w:rPr>
+                <w:i/>
+                <w:iCs/>
+                <w:color w:val="596579"/>
+              </w:rPr>
+              <w:t xml:space="preserve">This is bytecode for the Python runtime, not machine code for the processor.</w:t>
+            </w:r>
+          </w:p>
+        </w:tc>
+      </w:tr>
+    </w:tbl>
     <w:tbl>
       <w:tblPr>
         <w:tblW w:type="pct" w:w="100%"/>
@@ -6170,23 +5901,44 @@
                 <w:bCs/>
                 <w:color w:val="263A67"/>
               </w:rPr>
-              <w:t xml:space="preserve">Read bytecode like a tiny action list</w:t>
-            </w:r>
-          </w:p>
-          <w:p>
-            <w:pPr>
-              <w:spacing w:after="120" w:line="300"/>
-            </w:pPr>
+              <w:t xml:space="preserve">Why might your list look different?</w:t>
+            </w:r>
+          </w:p>
+          <w:p>
+            <w:pPr>
+              <w:spacing w:after="120" w:line="300"/>
+            </w:pPr>
+            <w:r>
+              <w:t xml:space="preserve">Bytecode is a </w:t>
+            </w:r>
+            <w:r>
+              <w:rPr>
+                <w:b/>
+                <w:bCs/>
+              </w:rPr>
+              <w:t xml:space="preserve">CPython implementation detail</w:t>
+            </w:r>
+            <w:r>
+              <w:t xml:space="preserve">. Instructions can be added, removed or renamed between Python versions.</w:t>
+            </w:r>
+          </w:p>
+          <w:p>
+            <w:pPr>
+              <w:spacing w:after="120" w:line="300"/>
+            </w:pPr>
+            <w:r>
+              <w:t xml:space="preserve">Your output may include helper actions such as </w:t>
+            </w:r>
             <w:r>
               <w:rPr>
                 <w:rFonts w:ascii="Consolas" w:cs="Consolas" w:eastAsia="Consolas" w:hAnsi="Consolas"/>
                 <w:color w:val="4659A7"/>
                 <w:shd w:fill="EEF1FA" w:val="clear"/>
               </w:rPr>
-              <w:t xml:space="preserve">LOAD_CONST</w:t>
-            </w:r>
-            <w:r>
-              <w:t xml:space="preserve"> picks up the fixed value "Hello". </w:t>
+              <w:t xml:space="preserve">RESUME</w:t>
+            </w:r>
+            <w:r>
+              <w:t xml:space="preserve"> or </w:t>
             </w:r>
             <w:r>
               <w:rPr>
@@ -6194,40 +5946,10 @@
                 <w:color w:val="4659A7"/>
                 <w:shd w:fill="EEF1FA" w:val="clear"/>
               </w:rPr>
-              <w:t xml:space="preserve">STORE_NAME</w:t>
-            </w:r>
-            <w:r>
-              <w:t xml:space="preserve"> connects it to message. </w:t>
-            </w:r>
-            <w:r>
-              <w:rPr>
-                <w:rFonts w:ascii="Consolas" w:cs="Consolas" w:eastAsia="Consolas" w:hAnsi="Consolas"/>
-                <w:color w:val="4659A7"/>
-                <w:shd w:fill="EEF1FA" w:val="clear"/>
-              </w:rPr>
-              <w:t xml:space="preserve">LOAD_NAME</w:t>
-            </w:r>
-            <w:r>
-              <w:t xml:space="preserve"> finds print and message. </w:t>
-            </w:r>
-            <w:r>
-              <w:rPr>
-                <w:rFonts w:ascii="Consolas" w:cs="Consolas" w:eastAsia="Consolas" w:hAnsi="Consolas"/>
-                <w:color w:val="4659A7"/>
-                <w:shd w:fill="EEF1FA" w:val="clear"/>
-              </w:rPr>
-              <w:t xml:space="preserve">CALL</w:t>
-            </w:r>
-            <w:r>
-              <w:t xml:space="preserve"> runs print with one value.</w:t>
-            </w:r>
-          </w:p>
-          <w:p>
-            <w:pPr>
-              <w:spacing w:after="120" w:line="300"/>
-            </w:pPr>
-            <w:r>
-              <w:t xml:space="preserve">This is not processor machine code. It is an instruction list used by the Python runtime.</w:t>
+              <w:t xml:space="preserve">PUSH_NULL</w:t>
+            </w:r>
+            <w:r>
+              <w:t xml:space="preserve">. Follow the source line and action words instead of memorising every opcode.</w:t>
             </w:r>
           </w:p>
         </w:tc>
@@ -7333,7 +7055,7 @@
       </w:r>
     </w:p>
     <w:p>
-      <w:hyperlink w:history="1" r:id="rIdkgw3hau4r0negrcjmmpnw">
+      <w:hyperlink w:history="1" r:id="rId4r-xgpppychvdikojo5zc">
         <w:r>
           <w:rPr>
             <w:rStyle w:val="Hyperlink"/>
@@ -7351,7 +7073,7 @@
       </w:r>
     </w:p>
     <w:p>
-      <w:hyperlink w:history="1" r:id="rIdlxqblsq9dk3cowaqiwii2">
+      <w:hyperlink w:history="1" r:id="rId-zfyezexsjp5gvhjf_-qy">
         <w:r>
           <w:rPr>
             <w:rStyle w:val="Hyperlink"/>
@@ -7369,7 +7091,7 @@
       </w:r>
     </w:p>
     <w:p>
-      <w:hyperlink w:history="1" r:id="rIdc38yiny4zibrpkgl4jug8">
+      <w:hyperlink w:history="1" r:id="rIdz9xzkelh1h9do1nviybev">
         <w:r>
           <w:rPr>
             <w:rStyle w:val="Hyperlink"/>
@@ -7452,6 +7174,8 @@
           <w:b/>
           <w:bCs/>
           <w:color w:val="263A67"/>
+          <w:sz w:val="48"/>
+          <w:szCs w:val="48"/>
         </w:rPr>
         <w:t xml:space="preserve">Lesson 3: Variables: Names for Values</w:t>
       </w:r>
@@ -7469,6 +7193,92 @@
         <w:t xml:space="preserve">Store a value, change it and inspect memory one line at a time.</w:t>
       </w:r>
     </w:p>
+    <w:tbl>
+      <w:tblPr>
+        <w:tblW w:type="pct" w:w="100%"/>
+        <w:tblBorders>
+          <w:top w:val="single" w:color="auto" w:sz="4"/>
+          <w:left w:val="single" w:color="auto" w:sz="4"/>
+          <w:bottom w:val="single" w:color="auto" w:sz="4"/>
+          <w:right w:val="single" w:color="auto" w:sz="4"/>
+          <w:insideH w:val="single" w:color="auto" w:sz="4"/>
+          <w:insideV w:val="single" w:color="auto" w:sz="4"/>
+        </w:tblBorders>
+      </w:tblPr>
+      <w:tblGrid>
+        <w:gridCol w:w="100"/>
+      </w:tblGrid>
+      <w:tr>
+        <w:tc>
+          <w:tcPr>
+            <w:tcBorders>
+              <w:top w:val="single" w:color="D9E0EA" w:sz="2"/>
+              <w:left w:val="single" w:color="D9E0EA" w:sz="2"/>
+              <w:bottom w:val="single" w:color="D9E0EA" w:sz="2"/>
+              <w:right w:val="single" w:color="D9E0EA" w:sz="2"/>
+            </w:tcBorders>
+            <w:shd w:fill="EEF5FA" w:val="clear"/>
+            <w:tcMar>
+              <w:top w:type="dxa" w:w="130"/>
+              <w:left w:type="dxa" w:w="160"/>
+              <w:bottom w:type="dxa" w:w="130"/>
+              <w:right w:type="dxa" w:w="160"/>
+            </w:tcMar>
+          </w:tcPr>
+          <w:p>
+            <w:pPr>
+              <w:spacing w:after="120" w:line="300"/>
+            </w:pPr>
+            <w:r>
+              <w:rPr>
+                <w:b/>
+                <w:bCs/>
+                <w:color w:val="263A67"/>
+              </w:rPr>
+              <w:t xml:space="preserve">OUR MISSION · Keep track of a score</w:t>
+            </w:r>
+          </w:p>
+          <w:p>
+            <w:pPr>
+              <w:spacing w:after="120" w:line="300"/>
+            </w:pPr>
+            <w:r>
+              <w:t xml:space="preserve">Our program needs to remember a score and then add five.</w:t>
+            </w:r>
+          </w:p>
+          <w:p>
+            <w:pPr>
+              <w:spacing w:after="120" w:line="300"/>
+            </w:pPr>
+            <w:r>
+              <w:rPr>
+                <w:b/>
+                <w:bCs/>
+              </w:rPr>
+              <w:t xml:space="preserve">What we know: </w:t>
+            </w:r>
+            <w:r>
+              <w:t xml:space="preserve">Python can display a value.</w:t>
+            </w:r>
+          </w:p>
+          <w:p>
+            <w:pPr>
+              <w:spacing w:after="120" w:line="300"/>
+            </w:pPr>
+            <w:r>
+              <w:rPr>
+                <w:b/>
+                <w:bCs/>
+              </w:rPr>
+              <w:t xml:space="preserve">What we need: </w:t>
+            </w:r>
+            <w:r>
+              <w:t xml:space="preserve">A name for the value. • A way to replace the stored value.</w:t>
+            </w:r>
+          </w:p>
+        </w:tc>
+      </w:tr>
+    </w:tbl>
     <w:p>
       <w:pPr>
         <w:jc w:val="center"/>
@@ -7613,92 +7423,6 @@
               <w:bottom w:val="single" w:color="D9E0EA" w:sz="2"/>
               <w:right w:val="single" w:color="D9E0EA" w:sz="2"/>
             </w:tcBorders>
-            <w:shd w:fill="EEF5FA" w:val="clear"/>
-            <w:tcMar>
-              <w:top w:type="dxa" w:w="130"/>
-              <w:left w:type="dxa" w:w="160"/>
-              <w:bottom w:type="dxa" w:w="130"/>
-              <w:right w:type="dxa" w:w="160"/>
-            </w:tcMar>
-          </w:tcPr>
-          <w:p>
-            <w:pPr>
-              <w:spacing w:after="120" w:line="300"/>
-            </w:pPr>
-            <w:r>
-              <w:rPr>
-                <w:b/>
-                <w:bCs/>
-                <w:color w:val="263A67"/>
-              </w:rPr>
-              <w:t xml:space="preserve">OUR MISSION · Keep track of a score</w:t>
-            </w:r>
-          </w:p>
-          <w:p>
-            <w:pPr>
-              <w:spacing w:after="120" w:line="300"/>
-            </w:pPr>
-            <w:r>
-              <w:t xml:space="preserve">Our program needs to remember a score and then add five.</w:t>
-            </w:r>
-          </w:p>
-          <w:p>
-            <w:pPr>
-              <w:spacing w:after="120" w:line="300"/>
-            </w:pPr>
-            <w:r>
-              <w:rPr>
-                <w:b/>
-                <w:bCs/>
-              </w:rPr>
-              <w:t xml:space="preserve">What we know: </w:t>
-            </w:r>
-            <w:r>
-              <w:t xml:space="preserve">Python can display a value.</w:t>
-            </w:r>
-          </w:p>
-          <w:p>
-            <w:pPr>
-              <w:spacing w:after="120" w:line="300"/>
-            </w:pPr>
-            <w:r>
-              <w:rPr>
-                <w:b/>
-                <w:bCs/>
-              </w:rPr>
-              <w:t xml:space="preserve">What we need: </w:t>
-            </w:r>
-            <w:r>
-              <w:t xml:space="preserve">A name for the value. • A way to replace the stored value.</w:t>
-            </w:r>
-          </w:p>
-        </w:tc>
-      </w:tr>
-    </w:tbl>
-    <w:tbl>
-      <w:tblPr>
-        <w:tblW w:type="pct" w:w="100%"/>
-        <w:tblBorders>
-          <w:top w:val="single" w:color="auto" w:sz="4"/>
-          <w:left w:val="single" w:color="auto" w:sz="4"/>
-          <w:bottom w:val="single" w:color="auto" w:sz="4"/>
-          <w:right w:val="single" w:color="auto" w:sz="4"/>
-          <w:insideH w:val="single" w:color="auto" w:sz="4"/>
-          <w:insideV w:val="single" w:color="auto" w:sz="4"/>
-        </w:tblBorders>
-      </w:tblPr>
-      <w:tblGrid>
-        <w:gridCol w:w="100"/>
-      </w:tblGrid>
-      <w:tr>
-        <w:tc>
-          <w:tcPr>
-            <w:tcBorders>
-              <w:top w:val="single" w:color="D9E0EA" w:sz="2"/>
-              <w:left w:val="single" w:color="D9E0EA" w:sz="2"/>
-              <w:bottom w:val="single" w:color="D9E0EA" w:sz="2"/>
-              <w:right w:val="single" w:color="D9E0EA" w:sz="2"/>
-            </w:tcBorders>
             <w:shd w:fill="FFF8E8" w:val="clear"/>
             <w:tcMar>
               <w:top w:type="dxa" w:w="130"/>
@@ -9327,7 +9051,7 @@
       </w:r>
     </w:p>
     <w:p>
-      <w:hyperlink w:history="1" r:id="rId_2g7lv_uqvomi9ft1dgr0">
+      <w:hyperlink w:history="1" r:id="rIdsqslalyqhmptwkv7yb9fy">
         <w:r>
           <w:rPr>
             <w:rStyle w:val="Hyperlink"/>
@@ -9345,7 +9069,7 @@
       </w:r>
     </w:p>
     <w:p>
-      <w:hyperlink w:history="1" r:id="rIdigt6n5fsywcpq4ugby4t_">
+      <w:hyperlink w:history="1" r:id="rIdnue4nmbio1az_3mkqkxfv">
         <w:r>
           <w:rPr>
             <w:rStyle w:val="Hyperlink"/>
@@ -9428,6 +9152,8 @@
           <w:b/>
           <w:bCs/>
           <w:color w:val="263A67"/>
+          <w:sz w:val="48"/>
+          <w:szCs w:val="48"/>
         </w:rPr>
         <w:t xml:space="preserve">Lesson 4: Data Types: What Kind of Value?</w:t>
       </w:r>
@@ -9445,6 +9171,92 @@
         <w:t xml:space="preserve">Meet strings, integers, floats and booleans, and see why type changes what Python can do.</w:t>
       </w:r>
     </w:p>
+    <w:tbl>
+      <w:tblPr>
+        <w:tblW w:type="pct" w:w="100%"/>
+        <w:tblBorders>
+          <w:top w:val="single" w:color="auto" w:sz="4"/>
+          <w:left w:val="single" w:color="auto" w:sz="4"/>
+          <w:bottom w:val="single" w:color="auto" w:sz="4"/>
+          <w:right w:val="single" w:color="auto" w:sz="4"/>
+          <w:insideH w:val="single" w:color="auto" w:sz="4"/>
+          <w:insideV w:val="single" w:color="auto" w:sz="4"/>
+        </w:tblBorders>
+      </w:tblPr>
+      <w:tblGrid>
+        <w:gridCol w:w="100"/>
+      </w:tblGrid>
+      <w:tr>
+        <w:tc>
+          <w:tcPr>
+            <w:tcBorders>
+              <w:top w:val="single" w:color="D9E0EA" w:sz="2"/>
+              <w:left w:val="single" w:color="D9E0EA" w:sz="2"/>
+              <w:bottom w:val="single" w:color="D9E0EA" w:sz="2"/>
+              <w:right w:val="single" w:color="D9E0EA" w:sz="2"/>
+            </w:tcBorders>
+            <w:shd w:fill="EEF5FA" w:val="clear"/>
+            <w:tcMar>
+              <w:top w:type="dxa" w:w="130"/>
+              <w:left w:type="dxa" w:w="160"/>
+              <w:bottom w:type="dxa" w:w="130"/>
+              <w:right w:type="dxa" w:w="160"/>
+            </w:tcMar>
+          </w:tcPr>
+          <w:p>
+            <w:pPr>
+              <w:spacing w:after="120" w:line="300"/>
+            </w:pPr>
+            <w:r>
+              <w:rPr>
+                <w:b/>
+                <w:bCs/>
+                <w:color w:val="263A67"/>
+              </w:rPr>
+              <w:t xml:space="preserve">OUR MISSION · Sort our values</w:t>
+            </w:r>
+          </w:p>
+          <w:p>
+            <w:pPr>
+              <w:spacing w:after="120" w:line="300"/>
+            </w:pPr>
+            <w:r>
+              <w:t xml:space="preserve">A profile needs a name, age, height and learning status. These values are different kinds of data.</w:t>
+            </w:r>
+          </w:p>
+          <w:p>
+            <w:pPr>
+              <w:spacing w:after="120" w:line="300"/>
+            </w:pPr>
+            <w:r>
+              <w:rPr>
+                <w:b/>
+                <w:bCs/>
+              </w:rPr>
+              <w:t xml:space="preserve">What we know: </w:t>
+            </w:r>
+            <w:r>
+              <w:t xml:space="preserve">Variables give values names.</w:t>
+            </w:r>
+          </w:p>
+          <w:p>
+            <w:pPr>
+              <w:spacing w:after="120" w:line="300"/>
+            </w:pPr>
+            <w:r>
+              <w:rPr>
+                <w:b/>
+                <w:bCs/>
+              </w:rPr>
+              <w:t xml:space="preserve">What we need: </w:t>
+            </w:r>
+            <w:r>
+              <w:t xml:space="preserve">A way to identify each kind of value. • Rules for what each kind can do.</w:t>
+            </w:r>
+          </w:p>
+        </w:tc>
+      </w:tr>
+    </w:tbl>
     <w:p>
       <w:pPr>
         <w:jc w:val="center"/>
@@ -9648,92 +9460,6 @@
               <w:bottom w:val="single" w:color="D9E0EA" w:sz="2"/>
               <w:right w:val="single" w:color="D9E0EA" w:sz="2"/>
             </w:tcBorders>
-            <w:shd w:fill="EEF5FA" w:val="clear"/>
-            <w:tcMar>
-              <w:top w:type="dxa" w:w="130"/>
-              <w:left w:type="dxa" w:w="160"/>
-              <w:bottom w:type="dxa" w:w="130"/>
-              <w:right w:type="dxa" w:w="160"/>
-            </w:tcMar>
-          </w:tcPr>
-          <w:p>
-            <w:pPr>
-              <w:spacing w:after="120" w:line="300"/>
-            </w:pPr>
-            <w:r>
-              <w:rPr>
-                <w:b/>
-                <w:bCs/>
-                <w:color w:val="263A67"/>
-              </w:rPr>
-              <w:t xml:space="preserve">OUR MISSION · Sort our values</w:t>
-            </w:r>
-          </w:p>
-          <w:p>
-            <w:pPr>
-              <w:spacing w:after="120" w:line="300"/>
-            </w:pPr>
-            <w:r>
-              <w:t xml:space="preserve">A profile needs a name, age, height and learning status. These values are different kinds of data.</w:t>
-            </w:r>
-          </w:p>
-          <w:p>
-            <w:pPr>
-              <w:spacing w:after="120" w:line="300"/>
-            </w:pPr>
-            <w:r>
-              <w:rPr>
-                <w:b/>
-                <w:bCs/>
-              </w:rPr>
-              <w:t xml:space="preserve">What we know: </w:t>
-            </w:r>
-            <w:r>
-              <w:t xml:space="preserve">Variables give values names.</w:t>
-            </w:r>
-          </w:p>
-          <w:p>
-            <w:pPr>
-              <w:spacing w:after="120" w:line="300"/>
-            </w:pPr>
-            <w:r>
-              <w:rPr>
-                <w:b/>
-                <w:bCs/>
-              </w:rPr>
-              <w:t xml:space="preserve">What we need: </w:t>
-            </w:r>
-            <w:r>
-              <w:t xml:space="preserve">A way to identify each kind of value. • Rules for what each kind can do.</w:t>
-            </w:r>
-          </w:p>
-        </w:tc>
-      </w:tr>
-    </w:tbl>
-    <w:tbl>
-      <w:tblPr>
-        <w:tblW w:type="pct" w:w="100%"/>
-        <w:tblBorders>
-          <w:top w:val="single" w:color="auto" w:sz="4"/>
-          <w:left w:val="single" w:color="auto" w:sz="4"/>
-          <w:bottom w:val="single" w:color="auto" w:sz="4"/>
-          <w:right w:val="single" w:color="auto" w:sz="4"/>
-          <w:insideH w:val="single" w:color="auto" w:sz="4"/>
-          <w:insideV w:val="single" w:color="auto" w:sz="4"/>
-        </w:tblBorders>
-      </w:tblPr>
-      <w:tblGrid>
-        <w:gridCol w:w="100"/>
-      </w:tblGrid>
-      <w:tr>
-        <w:tc>
-          <w:tcPr>
-            <w:tcBorders>
-              <w:top w:val="single" w:color="D9E0EA" w:sz="2"/>
-              <w:left w:val="single" w:color="D9E0EA" w:sz="2"/>
-              <w:bottom w:val="single" w:color="D9E0EA" w:sz="2"/>
-              <w:right w:val="single" w:color="D9E0EA" w:sz="2"/>
-            </w:tcBorders>
             <w:shd w:fill="FFF8E8" w:val="clear"/>
             <w:tcMar>
               <w:top w:type="dxa" w:w="130"/>
@@ -12125,7 +11851,7 @@
       </w:r>
     </w:p>
     <w:p>
-      <w:hyperlink w:history="1" r:id="rIdgwib6oqmf_pxlznxdawpd">
+      <w:hyperlink w:history="1" r:id="rIdcax-ryucmewmuayhs7ztr">
         <w:r>
           <w:rPr>
             <w:rStyle w:val="Hyperlink"/>

</xml_diff>

<commit_message>
Add interactive arithmetic exercise
Co-authored-by: arena-agent <297053741+arena-agent@users.noreply.github.com>
</commit_message>
<xml_diff>
--- a/public/books/python-absolute-beginners/edition-01/Python-for-Absolute-Beginners-The-First-Code-Series-Book-1.docx
+++ b/public/books/python-absolute-beginners/edition-01/Python-for-Absolute-Beginners-The-First-Code-Series-Book-1.docx
@@ -722,7 +722,7 @@
       </w:r>
     </w:p>
     <w:p>
-      <w:hyperlink w:history="1" r:id="rIdrlgymd6zfidcazkxw58tt">
+      <w:hyperlink w:history="1" r:id="rIdsejkmnc13c7rmv4httjzz">
         <w:r>
           <w:rPr>
             <w:rStyle w:val="Hyperlink"/>
@@ -740,7 +740,7 @@
       </w:r>
     </w:p>
     <w:p>
-      <w:hyperlink w:history="1" r:id="rIdkxkinqldfntcvjvscz9ij">
+      <w:hyperlink w:history="1" r:id="rIdbhsimreih29awmoa_9shh">
         <w:r>
           <w:rPr>
             <w:rStyle w:val="Hyperlink"/>
@@ -3007,7 +3007,7 @@
       </w:r>
     </w:p>
     <w:p>
-      <w:hyperlink w:history="1" r:id="rIdt8bpc2fdlg2dlbo0h2xtv">
+      <w:hyperlink w:history="1" r:id="rId2h4ilopwtlixeckceg5kr">
         <w:r>
           <w:rPr>
             <w:rStyle w:val="Hyperlink"/>
@@ -3025,7 +3025,7 @@
       </w:r>
     </w:p>
     <w:p>
-      <w:hyperlink w:history="1" r:id="rIdzlendztyx_hulqc0gis1c">
+      <w:hyperlink w:history="1" r:id="rId9llgxexvkvra5g7r41kbz">
         <w:r>
           <w:rPr>
             <w:rStyle w:val="Hyperlink"/>
@@ -7089,7 +7089,7 @@
       </w:r>
     </w:p>
     <w:p>
-      <w:hyperlink w:history="1" r:id="rIdxjjrdjwokiq9i3y5k4fah">
+      <w:hyperlink w:history="1" r:id="rIdyebzuducz19st6t-qgrbo">
         <w:r>
           <w:rPr>
             <w:rStyle w:val="Hyperlink"/>
@@ -7107,7 +7107,7 @@
       </w:r>
     </w:p>
     <w:p>
-      <w:hyperlink w:history="1" r:id="rIdm8hwivdnyj12-sddlqw-4">
+      <w:hyperlink w:history="1" r:id="rIdue9vnvg5ozu0itzzbbgan">
         <w:r>
           <w:rPr>
             <w:rStyle w:val="Hyperlink"/>
@@ -7125,7 +7125,7 @@
       </w:r>
     </w:p>
     <w:p>
-      <w:hyperlink w:history="1" r:id="rIdim98etcqp6qky_nmdwnup">
+      <w:hyperlink w:history="1" r:id="rId1lhx9qgbf8i6nfp3_yk2z">
         <w:r>
           <w:rPr>
             <w:rStyle w:val="Hyperlink"/>
@@ -9102,7 +9102,7 @@
       </w:r>
     </w:p>
     <w:p>
-      <w:hyperlink w:history="1" r:id="rIdjcpe7meu-duogrmww7q1c">
+      <w:hyperlink w:history="1" r:id="rIdgs9ndtr1vxitmew13iwm1">
         <w:r>
           <w:rPr>
             <w:rStyle w:val="Hyperlink"/>
@@ -9120,7 +9120,7 @@
       </w:r>
     </w:p>
     <w:p>
-      <w:hyperlink w:history="1" r:id="rIdwrjlo0_vwt-khpkmzirwp">
+      <w:hyperlink w:history="1" r:id="rIdpp6uxuoojxhkz44xghf0c">
         <w:r>
           <w:rPr>
             <w:rStyle w:val="Hyperlink"/>
@@ -12111,7 +12111,7 @@
       </w:r>
     </w:p>
     <w:p>
-      <w:hyperlink w:history="1" r:id="rIdo5piiytickunkru8ja-9e">
+      <w:hyperlink w:history="1" r:id="rIdkzojbipmthvfrepzrhumt">
         <w:r>
           <w:rPr>
             <w:rStyle w:val="Hyperlink"/>
@@ -15215,46 +15215,27 @@
                 <w:bCs/>
                 <w:color w:val="263A67"/>
               </w:rPr>
-              <w:t xml:space="preserve">ACTIVITY · Design a different route to 100</w:t>
-            </w:r>
-          </w:p>
-          <w:p>
-            <w:pPr>
-              <w:pStyle w:val="ListParagraph"/>
-              <w:numPr>
-                <w:ilvl w:val="0"/>
-                <w:numId w:val="3"/>
-              </w:numPr>
-              <w:spacing w:after="120" w:line="300"/>
-            </w:pPr>
-            <w:r>
-              <w:t xml:space="preserve">Choose a positive starting integer other than 25.</w:t>
-            </w:r>
-          </w:p>
-          <w:p>
-            <w:pPr>
-              <w:pStyle w:val="ListParagraph"/>
-              <w:numPr>
-                <w:ilvl w:val="0"/>
-                <w:numId w:val="3"/>
-              </w:numPr>
-              <w:spacing w:after="120" w:line="300"/>
-            </w:pPr>
-            <w:r>
-              <w:t xml:space="preserve">Write one assignment for the starting score.</w:t>
-            </w:r>
-          </w:p>
-          <w:p>
-            <w:pPr>
-              <w:pStyle w:val="ListParagraph"/>
-              <w:numPr>
-                <w:ilvl w:val="0"/>
-                <w:numId w:val="3"/>
-              </w:numPr>
-              <w:spacing w:after="120" w:line="300"/>
-            </w:pPr>
-            <w:r>
-              <w:t xml:space="preserve">Use at least two of these operators: </w:t>
+              <w:t xml:space="preserve">SIMPLE EXERCISE · Numbers: Simple Arithmetic</w:t>
+            </w:r>
+          </w:p>
+          <w:p>
+            <w:pPr>
+              <w:spacing w:after="120" w:line="300"/>
+            </w:pPr>
+            <w:r>
+              <w:t xml:space="preserve">Write an expression that equals 100.</w:t>
+            </w:r>
+          </w:p>
+          <w:p>
+            <w:pPr>
+              <w:spacing w:after="120" w:line="300"/>
+            </w:pPr>
+            <w:r>
+              <w:rPr>
+                <w:b/>
+                <w:bCs/>
+              </w:rPr>
+              <w:t xml:space="preserve">Examples: </w:t>
             </w:r>
             <w:r>
               <w:rPr>
@@ -15262,10 +15243,10 @@
                 <w:color w:val="4659A7"/>
                 <w:shd w:fill="EEF1FA" w:val="clear"/>
               </w:rPr>
-              <w:t xml:space="preserve">+</w:t>
-            </w:r>
-            <w:r>
-              <w:t xml:space="preserve">, </w:t>
+              <w:t xml:space="preserve">50 + 50</w:t>
+            </w:r>
+            <w:r>
+              <w:t xml:space="preserve"> or </w:t>
             </w:r>
             <w:r>
               <w:rPr>
@@ -15273,51 +15254,7 @@
                 <w:color w:val="4659A7"/>
                 <w:shd w:fill="EEF1FA" w:val="clear"/>
               </w:rPr>
-              <w:t xml:space="preserve">-</w:t>
-            </w:r>
-            <w:r>
-              <w:t xml:space="preserve">, </w:t>
-            </w:r>
-            <w:r>
-              <w:rPr>
-                <w:rFonts w:ascii="Consolas" w:cs="Consolas" w:eastAsia="Consolas" w:hAnsi="Consolas"/>
-                <w:color w:val="4659A7"/>
-                <w:shd w:fill="EEF1FA" w:val="clear"/>
-              </w:rPr>
-              <w:t xml:space="preserve">*</w:t>
-            </w:r>
-            <w:r>
-              <w:t xml:space="preserve">, </w:t>
-            </w:r>
-            <w:r>
-              <w:rPr>
-                <w:rFonts w:ascii="Consolas" w:cs="Consolas" w:eastAsia="Consolas" w:hAnsi="Consolas"/>
-                <w:color w:val="4659A7"/>
-                <w:shd w:fill="EEF1FA" w:val="clear"/>
-              </w:rPr>
-              <w:t xml:space="preserve">//</w:t>
-            </w:r>
-            <w:r>
-              <w:t xml:space="preserve">, </w:t>
-            </w:r>
-            <w:r>
-              <w:rPr>
-                <w:rFonts w:ascii="Consolas" w:cs="Consolas" w:eastAsia="Consolas" w:hAnsi="Consolas"/>
-                <w:color w:val="4659A7"/>
-                <w:shd w:fill="EEF1FA" w:val="clear"/>
-              </w:rPr>
-              <w:t xml:space="preserve">%</w:t>
-            </w:r>
-            <w:r>
-              <w:t xml:space="preserve"> or </w:t>
-            </w:r>
-            <w:r>
-              <w:rPr>
-                <w:rFonts w:ascii="Consolas" w:cs="Consolas" w:eastAsia="Consolas" w:hAnsi="Consolas"/>
-                <w:color w:val="4659A7"/>
-                <w:shd w:fill="EEF1FA" w:val="clear"/>
-              </w:rPr>
-              <w:t xml:space="preserve">**</w:t>
+              <w:t xml:space="preserve">110 - 10</w:t>
             </w:r>
             <w:r>
               <w:t xml:space="preserve">.</w:t>
@@ -15325,52 +15262,25 @@
           </w:p>
           <w:p>
             <w:pPr>
-              <w:pStyle w:val="ListParagraph"/>
-              <w:numPr>
-                <w:ilvl w:val="0"/>
-                <w:numId w:val="3"/>
-              </w:numPr>
-              <w:spacing w:after="120" w:line="300"/>
-            </w:pPr>
-            <w:r>
-              <w:t xml:space="preserve">Predict the score after each line on paper.</w:t>
-            </w:r>
-          </w:p>
-          <w:p>
-            <w:pPr>
-              <w:pStyle w:val="ListParagraph"/>
-              <w:numPr>
-                <w:ilvl w:val="0"/>
-                <w:numId w:val="3"/>
-              </w:numPr>
-              <w:spacing w:after="120" w:line="300"/>
-            </w:pPr>
-            <w:r>
-              <w:t xml:space="preserve">Print the final score. It must be exactly </w:t>
-            </w:r>
-            <w:r>
-              <w:rPr>
-                <w:rFonts w:ascii="Consolas" w:cs="Consolas" w:eastAsia="Consolas" w:hAnsi="Consolas"/>
-                <w:color w:val="4659A7"/>
-                <w:shd w:fill="EEF1FA" w:val="clear"/>
-              </w:rPr>
-              <w:t xml:space="preserve">100</w:t>
-            </w:r>
-            <w:r>
-              <w:t xml:space="preserve">.</w:t>
-            </w:r>
-          </w:p>
-          <w:p>
-            <w:pPr>
-              <w:pStyle w:val="ListParagraph"/>
-              <w:numPr>
-                <w:ilvl w:val="0"/>
-                <w:numId w:val="3"/>
-              </w:numPr>
-              <w:spacing w:after="120" w:line="300"/>
-            </w:pPr>
-            <w:r>
-              <w:t xml:space="preserve">Trade programs with a partner. Check each other’s predictions before running the files.</w:t>
+              <w:spacing w:after="120" w:line="300"/>
+            </w:pPr>
+            <w:r>
+              <w:t xml:space="preserve">See if you can use more than one arithmetic operator. Write only one expression and submit only one line of code.</w:t>
+            </w:r>
+          </w:p>
+          <w:p>
+            <w:pPr>
+              <w:spacing w:after="120" w:line="300"/>
+            </w:pPr>
+            <w:r>
+              <w:rPr>
+                <w:b/>
+                <w:bCs/>
+              </w:rPr>
+              <w:t xml:space="preserve">Success check: </w:t>
+            </w:r>
+            <w:r>
+              <w:t xml:space="preserve">If your expression results in 100, your solution is correct.</w:t>
             </w:r>
           </w:p>
         </w:tc>
@@ -16337,7 +16247,7 @@
       </w:r>
     </w:p>
     <w:p>
-      <w:hyperlink w:history="1" r:id="rId9itsqdru0etpvi0f9haf8">
+      <w:hyperlink w:history="1" r:id="rId_jwr4wksewcr7vlnuadfb">
         <w:r>
           <w:rPr>
             <w:rStyle w:val="Hyperlink"/>
@@ -16355,7 +16265,7 @@
       </w:r>
     </w:p>
     <w:p>
-      <w:hyperlink w:history="1" r:id="rIdb1sdcqrk43dkqkrbkdcih">
+      <w:hyperlink w:history="1" r:id="rIdmqn2mt8febnqpir-elqms">
         <w:r>
           <w:rPr>
             <w:rStyle w:val="Hyperlink"/>
@@ -16373,7 +16283,7 @@
       </w:r>
     </w:p>
     <w:p>
-      <w:hyperlink w:history="1" r:id="rIddvcbkquohcbpjbdlq7qnb">
+      <w:hyperlink w:history="1" r:id="rIdqu01wf7jmiqz4hv1btyjr">
         <w:r>
           <w:rPr>
             <w:rStyle w:val="Hyperlink"/>

</xml_diff>

<commit_message>
Align diagram 1-to-1 point explanations and simplify complex concepts across all lessons
Co-authored-by: arena-agent <297053741+arena-agent@users.noreply.github.com>
</commit_message>
<xml_diff>
--- a/public/books/python-absolute-beginners/edition-01/Python-for-Absolute-Beginners-The-First-Code-Series-Book-1.docx
+++ b/public/books/python-absolute-beginners/edition-01/Python-for-Absolute-Beginners-The-First-Code-Series-Book-1.docx
@@ -725,7 +725,7 @@
       </w:r>
     </w:p>
     <w:p>
-      <w:hyperlink w:history="1" r:id="rIdo9qhnpq_zggdrwkvbsxzq">
+      <w:hyperlink w:history="1" r:id="rId9p92r7wfucaej1x9mgxoz">
         <w:r>
           <w:rPr>
             <w:rStyle w:val="Hyperlink"/>
@@ -743,7 +743,7 @@
       </w:r>
     </w:p>
     <w:p>
-      <w:hyperlink w:history="1" r:id="rId_mq_1omevfs7hrqbkfhr5">
+      <w:hyperlink w:history="1" r:id="rIdwga3k5u0k6txqbwcz3mum">
         <w:r>
           <w:rPr>
             <w:rStyle w:val="Hyperlink"/>
@@ -815,7 +815,7 @@
           <w:bCs/>
           <w:color w:val="263A67"/>
         </w:rPr>
-        <w:t xml:space="preserve">Lesson 1: Your First Program — Hello, World!</w:t>
+        <w:t xml:space="preserve">Chapter 1: Your First Program — Hello, World!</w:t>
       </w:r>
     </w:p>
     <w:p>
@@ -2996,7 +2996,7 @@
       </w:r>
     </w:p>
     <w:p>
-      <w:hyperlink w:history="1" r:id="rIdulxk9r0wyibov-a7no6f2">
+      <w:hyperlink w:history="1" r:id="rIdhepdssebvcntf5zo2gjry">
         <w:r>
           <w:rPr>
             <w:rStyle w:val="Hyperlink"/>
@@ -3014,7 +3014,7 @@
       </w:r>
     </w:p>
     <w:p>
-      <w:hyperlink w:history="1" r:id="rIdepebibnbmaprvke-miypc">
+      <w:hyperlink w:history="1" r:id="rIdptmpxgnrnmeb2qssiojpu">
         <w:r>
           <w:rPr>
             <w:rStyle w:val="Hyperlink"/>
@@ -3098,7 +3098,7 @@
           <w:bCs/>
           <w:color w:val="263A67"/>
         </w:rPr>
-        <w:t xml:space="preserve">Lesson 2: How Does Our Code Reach the Computer?</w:t>
+        <w:t xml:space="preserve">Chapter 2: How Does Our Code Reach the Computer?</w:t>
       </w:r>
     </w:p>
     <w:p>
@@ -6787,7 +6787,7 @@
       </w:r>
     </w:p>
     <w:p>
-      <w:hyperlink w:history="1" r:id="rIdfw11-vzn4q8lhh5mu5s7s">
+      <w:hyperlink w:history="1" r:id="rIdl4z5gb-afr7c_zxcm47fj">
         <w:r>
           <w:rPr>
             <w:rStyle w:val="Hyperlink"/>
@@ -6805,7 +6805,7 @@
       </w:r>
     </w:p>
     <w:p>
-      <w:hyperlink w:history="1" r:id="rIdral01ek5sq20z1tt-tpxw">
+      <w:hyperlink w:history="1" r:id="rId72us6tdinkdigw0cjume6">
         <w:r>
           <w:rPr>
             <w:rStyle w:val="Hyperlink"/>
@@ -6823,7 +6823,7 @@
       </w:r>
     </w:p>
     <w:p>
-      <w:hyperlink w:history="1" r:id="rIdvsrcay309iocowdkcn1ok">
+      <w:hyperlink w:history="1" r:id="rIdt1m6-c_ctozksw8jj5qvx">
         <w:r>
           <w:rPr>
             <w:rStyle w:val="Hyperlink"/>
@@ -6907,7 +6907,7 @@
           <w:bCs/>
           <w:color w:val="263A67"/>
         </w:rPr>
-        <w:t xml:space="preserve">Lesson 3: Variables: Names for Values</w:t>
+        <w:t xml:space="preserve">Chapter 3: Variables: Names for Values</w:t>
       </w:r>
     </w:p>
     <w:p>
@@ -8781,7 +8781,7 @@
       </w:r>
     </w:p>
     <w:p>
-      <w:hyperlink w:history="1" r:id="rIdqz_af2fkv0dxuibrqfllu">
+      <w:hyperlink w:history="1" r:id="rIdn2kz2tvhaclatg0tczli6">
         <w:r>
           <w:rPr>
             <w:rStyle w:val="Hyperlink"/>
@@ -8799,7 +8799,7 @@
       </w:r>
     </w:p>
     <w:p>
-      <w:hyperlink w:history="1" r:id="rIdnzennhjsxr-n18g2dgzdl">
+      <w:hyperlink w:history="1" r:id="rId-6s-lwdec83f8nu-9j0pe">
         <w:r>
           <w:rPr>
             <w:rStyle w:val="Hyperlink"/>
@@ -8883,7 +8883,7 @@
           <w:bCs/>
           <w:color w:val="263A67"/>
         </w:rPr>
-        <w:t xml:space="preserve">Lesson 4: Data Types: What Kind of Value?</w:t>
+        <w:t xml:space="preserve">Chapter 4: Data Types: What Kind of Value?</w:t>
       </w:r>
     </w:p>
     <w:p>
@@ -11456,7 +11456,7 @@
       </w:r>
     </w:p>
     <w:p>
-      <w:hyperlink w:history="1" r:id="rIdxreh1quom3g01gks3c5s1">
+      <w:hyperlink w:history="1" r:id="rIdgpntsfuifenkfvrhds2tz">
         <w:r>
           <w:rPr>
             <w:rStyle w:val="Hyperlink"/>

</xml_diff>

<commit_message>
Upgrade technical diagrams to modern minimalist Silicon Valley aesthetic
Co-authored-by: arena-agent <297053741+arena-agent@users.noreply.github.com>
</commit_message>
<xml_diff>
--- a/public/books/python-absolute-beginners/edition-01/Python-for-Absolute-Beginners-The-First-Code-Series-Book-1.docx
+++ b/public/books/python-absolute-beginners/edition-01/Python-for-Absolute-Beginners-The-First-Code-Series-Book-1.docx
@@ -725,7 +725,7 @@
       </w:r>
     </w:p>
     <w:p>
-      <w:hyperlink w:history="1" r:id="rId9p92r7wfucaej1x9mgxoz">
+      <w:hyperlink w:history="1" r:id="rIde-j8heo6-sxdaj57wyfbk">
         <w:r>
           <w:rPr>
             <w:rStyle w:val="Hyperlink"/>
@@ -743,7 +743,7 @@
       </w:r>
     </w:p>
     <w:p>
-      <w:hyperlink w:history="1" r:id="rIdwga3k5u0k6txqbwcz3mum">
+      <w:hyperlink w:history="1" r:id="rIde5enq5pllcvhvsnxfim5s">
         <w:r>
           <w:rPr>
             <w:rStyle w:val="Hyperlink"/>
@@ -2996,7 +2996,7 @@
       </w:r>
     </w:p>
     <w:p>
-      <w:hyperlink w:history="1" r:id="rIdhepdssebvcntf5zo2gjry">
+      <w:hyperlink w:history="1" r:id="rIdbxrx9zx4lgf8ido7jf79o">
         <w:r>
           <w:rPr>
             <w:rStyle w:val="Hyperlink"/>
@@ -3014,7 +3014,7 @@
       </w:r>
     </w:p>
     <w:p>
-      <w:hyperlink w:history="1" r:id="rIdptmpxgnrnmeb2qssiojpu">
+      <w:hyperlink w:history="1" r:id="rIdvcus_63pclhxvevl_0slb">
         <w:r>
           <w:rPr>
             <w:rStyle w:val="Hyperlink"/>
@@ -6787,7 +6787,7 @@
       </w:r>
     </w:p>
     <w:p>
-      <w:hyperlink w:history="1" r:id="rIdl4z5gb-afr7c_zxcm47fj">
+      <w:hyperlink w:history="1" r:id="rIdiodfwieynaqtk_1jdhy2h">
         <w:r>
           <w:rPr>
             <w:rStyle w:val="Hyperlink"/>
@@ -6805,7 +6805,7 @@
       </w:r>
     </w:p>
     <w:p>
-      <w:hyperlink w:history="1" r:id="rId72us6tdinkdigw0cjume6">
+      <w:hyperlink w:history="1" r:id="rIdnqj0qmwux-zvhd8hghwhq">
         <w:r>
           <w:rPr>
             <w:rStyle w:val="Hyperlink"/>
@@ -6823,7 +6823,7 @@
       </w:r>
     </w:p>
     <w:p>
-      <w:hyperlink w:history="1" r:id="rIdt1m6-c_ctozksw8jj5qvx">
+      <w:hyperlink w:history="1" r:id="rIdz_9ez36zxwgqt5hlt9-lt">
         <w:r>
           <w:rPr>
             <w:rStyle w:val="Hyperlink"/>
@@ -8781,7 +8781,7 @@
       </w:r>
     </w:p>
     <w:p>
-      <w:hyperlink w:history="1" r:id="rIdn2kz2tvhaclatg0tczli6">
+      <w:hyperlink w:history="1" r:id="rIdmqduhhle2nmfiiz8ot2ea">
         <w:r>
           <w:rPr>
             <w:rStyle w:val="Hyperlink"/>
@@ -8799,7 +8799,7 @@
       </w:r>
     </w:p>
     <w:p>
-      <w:hyperlink w:history="1" r:id="rId-6s-lwdec83f8nu-9j0pe">
+      <w:hyperlink w:history="1" r:id="rIdtz_qr20ikm9x9tkyldmx6">
         <w:r>
           <w:rPr>
             <w:rStyle w:val="Hyperlink"/>
@@ -11456,7 +11456,7 @@
       </w:r>
     </w:p>
     <w:p>
-      <w:hyperlink w:history="1" r:id="rIdgpntsfuifenkfvrhds2tz">
+      <w:hyperlink w:history="1" r:id="rIdjmjx7hpytrrdhmyrwzdod">
         <w:r>
           <w:rPr>
             <w:rStyle w:val="Hyperlink"/>

</xml_diff>

<commit_message>
Integrate self-validation test suite and verify all course endpoints
Co-authored-by: arena-agent <297053741+arena-agent@users.noreply.github.com>
</commit_message>
<xml_diff>
--- a/public/books/python-absolute-beginners/edition-01/Python-for-Absolute-Beginners-The-First-Code-Series-Book-1.docx
+++ b/public/books/python-absolute-beginners/edition-01/Python-for-Absolute-Beginners-The-First-Code-Series-Book-1.docx
@@ -725,7 +725,7 @@
       </w:r>
     </w:p>
     <w:p>
-      <w:hyperlink w:history="1" r:id="rIde-j8heo6-sxdaj57wyfbk">
+      <w:hyperlink w:history="1" r:id="rIduxxtmhvbbi5-dpg8n8tww">
         <w:r>
           <w:rPr>
             <w:rStyle w:val="Hyperlink"/>
@@ -743,7 +743,7 @@
       </w:r>
     </w:p>
     <w:p>
-      <w:hyperlink w:history="1" r:id="rIde5enq5pllcvhvsnxfim5s">
+      <w:hyperlink w:history="1" r:id="rId7eo8_erzv5xlqihgl5tws">
         <w:r>
           <w:rPr>
             <w:rStyle w:val="Hyperlink"/>
@@ -2996,7 +2996,7 @@
       </w:r>
     </w:p>
     <w:p>
-      <w:hyperlink w:history="1" r:id="rIdbxrx9zx4lgf8ido7jf79o">
+      <w:hyperlink w:history="1" r:id="rIdtoiuoks1orgi3zieaaujx">
         <w:r>
           <w:rPr>
             <w:rStyle w:val="Hyperlink"/>
@@ -3014,7 +3014,7 @@
       </w:r>
     </w:p>
     <w:p>
-      <w:hyperlink w:history="1" r:id="rIdvcus_63pclhxvevl_0slb">
+      <w:hyperlink w:history="1" r:id="rIdr8u8lu5xncplmuselmala">
         <w:r>
           <w:rPr>
             <w:rStyle w:val="Hyperlink"/>
@@ -6787,7 +6787,7 @@
       </w:r>
     </w:p>
     <w:p>
-      <w:hyperlink w:history="1" r:id="rIdiodfwieynaqtk_1jdhy2h">
+      <w:hyperlink w:history="1" r:id="rIdakzdoxrabsyqhkqgcqklj">
         <w:r>
           <w:rPr>
             <w:rStyle w:val="Hyperlink"/>
@@ -6805,7 +6805,7 @@
       </w:r>
     </w:p>
     <w:p>
-      <w:hyperlink w:history="1" r:id="rIdnqj0qmwux-zvhd8hghwhq">
+      <w:hyperlink w:history="1" r:id="rIdzgyencoigzuyrmfqxlslz">
         <w:r>
           <w:rPr>
             <w:rStyle w:val="Hyperlink"/>
@@ -6823,7 +6823,7 @@
       </w:r>
     </w:p>
     <w:p>
-      <w:hyperlink w:history="1" r:id="rIdz_9ez36zxwgqt5hlt9-lt">
+      <w:hyperlink w:history="1" r:id="rIdhagfkdclcowhnpvp4smfv">
         <w:r>
           <w:rPr>
             <w:rStyle w:val="Hyperlink"/>
@@ -8781,7 +8781,7 @@
       </w:r>
     </w:p>
     <w:p>
-      <w:hyperlink w:history="1" r:id="rIdmqduhhle2nmfiiz8ot2ea">
+      <w:hyperlink w:history="1" r:id="rId5vc2_ojaeg79lc6moqtyb">
         <w:r>
           <w:rPr>
             <w:rStyle w:val="Hyperlink"/>
@@ -8799,7 +8799,7 @@
       </w:r>
     </w:p>
     <w:p>
-      <w:hyperlink w:history="1" r:id="rIdtz_qr20ikm9x9tkyldmx6">
+      <w:hyperlink w:history="1" r:id="rIdbi7_35xpdfys3bsvdpj3a">
         <w:r>
           <w:rPr>
             <w:rStyle w:val="Hyperlink"/>
@@ -11456,7 +11456,7 @@
       </w:r>
     </w:p>
     <w:p>
-      <w:hyperlink w:history="1" r:id="rIdjmjx7hpytrrdhmyrwzdod">
+      <w:hyperlink w:history="1" r:id="rIdupwjdxsdsw-z4eqewq4q8">
         <w:r>
           <w:rPr>
             <w:rStyle w:val="Hyperlink"/>

</xml_diff>

<commit_message>
Align Chapter 1 completely with enterprise mission, eliminate localhost links, and ensure 100% universal reader accessibility
Co-authored-by: arena-agent <297053741+arena-agent@users.noreply.github.com>
</commit_message>
<xml_diff>
--- a/public/books/python-absolute-beginners/edition-01/Python-for-Absolute-Beginners-The-First-Code-Series-Book-1.docx
+++ b/public/books/python-absolute-beginners/edition-01/Python-for-Absolute-Beginners-The-First-Code-Series-Book-1.docx
@@ -725,7 +725,7 @@
       </w:r>
     </w:p>
     <w:p>
-      <w:hyperlink w:history="1" r:id="rIduxxtmhvbbi5-dpg8n8tww">
+      <w:hyperlink w:history="1" r:id="rIdk4gwjleeddiirz9u6fqyz">
         <w:r>
           <w:rPr>
             <w:rStyle w:val="Hyperlink"/>
@@ -743,7 +743,7 @@
       </w:r>
     </w:p>
     <w:p>
-      <w:hyperlink w:history="1" r:id="rId7eo8_erzv5xlqihgl5tws">
+      <w:hyperlink w:history="1" r:id="rIdhtpgfbid04ru96ssxkio0">
         <w:r>
           <w:rPr>
             <w:rStyle w:val="Hyperlink"/>
@@ -2996,7 +2996,7 @@
       </w:r>
     </w:p>
     <w:p>
-      <w:hyperlink w:history="1" r:id="rIdtoiuoks1orgi3zieaaujx">
+      <w:hyperlink w:history="1" r:id="rIda4c8fv2mbx3my7jesfn4n">
         <w:r>
           <w:rPr>
             <w:rStyle w:val="Hyperlink"/>
@@ -3014,7 +3014,7 @@
       </w:r>
     </w:p>
     <w:p>
-      <w:hyperlink w:history="1" r:id="rIdr8u8lu5xncplmuselmala">
+      <w:hyperlink w:history="1" r:id="rIdszag9csyb316x4_kxwdpu">
         <w:r>
           <w:rPr>
             <w:rStyle w:val="Hyperlink"/>
@@ -6787,7 +6787,7 @@
       </w:r>
     </w:p>
     <w:p>
-      <w:hyperlink w:history="1" r:id="rIdakzdoxrabsyqhkqgcqklj">
+      <w:hyperlink w:history="1" r:id="rIdriadf4saoh_e66hm0astd">
         <w:r>
           <w:rPr>
             <w:rStyle w:val="Hyperlink"/>
@@ -6805,7 +6805,7 @@
       </w:r>
     </w:p>
     <w:p>
-      <w:hyperlink w:history="1" r:id="rIdzgyencoigzuyrmfqxlslz">
+      <w:hyperlink w:history="1" r:id="rIdqnwowzkxfrqv75vppp15u">
         <w:r>
           <w:rPr>
             <w:rStyle w:val="Hyperlink"/>
@@ -6823,7 +6823,7 @@
       </w:r>
     </w:p>
     <w:p>
-      <w:hyperlink w:history="1" r:id="rIdhagfkdclcowhnpvp4smfv">
+      <w:hyperlink w:history="1" r:id="rIdxt7spd4a2wtomi07m0mkw">
         <w:r>
           <w:rPr>
             <w:rStyle w:val="Hyperlink"/>
@@ -8781,7 +8781,7 @@
       </w:r>
     </w:p>
     <w:p>
-      <w:hyperlink w:history="1" r:id="rId5vc2_ojaeg79lc6moqtyb">
+      <w:hyperlink w:history="1" r:id="rId0si__q-ktcfq567uzbvvs">
         <w:r>
           <w:rPr>
             <w:rStyle w:val="Hyperlink"/>
@@ -8799,7 +8799,7 @@
       </w:r>
     </w:p>
     <w:p>
-      <w:hyperlink w:history="1" r:id="rIdbi7_35xpdfys3bsvdpj3a">
+      <w:hyperlink w:history="1" r:id="rIdlznhtwoi4qw0-xprs35qj">
         <w:r>
           <w:rPr>
             <w:rStyle w:val="Hyperlink"/>
@@ -11456,7 +11456,7 @@
       </w:r>
     </w:p>
     <w:p>
-      <w:hyperlink w:history="1" r:id="rIdupwjdxsdsw-z4eqewq4q8">
+      <w:hyperlink w:history="1" r:id="rIdr0iconoi0mxygwmrjrbh2">
         <w:r>
           <w:rPr>
             <w:rStyle w:val="Hyperlink"/>

</xml_diff>

<commit_message>
Add comprehensive interactive curriculum planning dashboard and update Chapter 1 with FastAPI blueprint
Co-authored-by: arena-agent <297053741+arena-agent@users.noreply.github.com>
</commit_message>
<xml_diff>
--- a/public/books/python-absolute-beginners/edition-01/Python-for-Absolute-Beginners-The-First-Code-Series-Book-1.docx
+++ b/public/books/python-absolute-beginners/edition-01/Python-for-Absolute-Beginners-The-First-Code-Series-Book-1.docx
@@ -725,7 +725,7 @@
       </w:r>
     </w:p>
     <w:p>
-      <w:hyperlink w:history="1" r:id="rIdk4gwjleeddiirz9u6fqyz">
+      <w:hyperlink w:history="1" r:id="rIdatq1kniudknt-nhgrn59z">
         <w:r>
           <w:rPr>
             <w:rStyle w:val="Hyperlink"/>
@@ -743,7 +743,7 @@
       </w:r>
     </w:p>
     <w:p>
-      <w:hyperlink w:history="1" r:id="rIdhtpgfbid04ru96ssxkio0">
+      <w:hyperlink w:history="1" r:id="rIda7znrlm-vc1b5htzh03zj">
         <w:r>
           <w:rPr>
             <w:rStyle w:val="Hyperlink"/>
@@ -2996,7 +2996,7 @@
       </w:r>
     </w:p>
     <w:p>
-      <w:hyperlink w:history="1" r:id="rIda4c8fv2mbx3my7jesfn4n">
+      <w:hyperlink w:history="1" r:id="rIdvpfvmjqyqqxnvzn0uauxk">
         <w:r>
           <w:rPr>
             <w:rStyle w:val="Hyperlink"/>
@@ -3014,7 +3014,7 @@
       </w:r>
     </w:p>
     <w:p>
-      <w:hyperlink w:history="1" r:id="rIdszag9csyb316x4_kxwdpu">
+      <w:hyperlink w:history="1" r:id="rIduodgsgrthrdnufv1j3zsz">
         <w:r>
           <w:rPr>
             <w:rStyle w:val="Hyperlink"/>
@@ -6787,7 +6787,7 @@
       </w:r>
     </w:p>
     <w:p>
-      <w:hyperlink w:history="1" r:id="rIdriadf4saoh_e66hm0astd">
+      <w:hyperlink w:history="1" r:id="rIdzp-vqzty171x3nj4mtvtr">
         <w:r>
           <w:rPr>
             <w:rStyle w:val="Hyperlink"/>
@@ -6805,7 +6805,7 @@
       </w:r>
     </w:p>
     <w:p>
-      <w:hyperlink w:history="1" r:id="rIdqnwowzkxfrqv75vppp15u">
+      <w:hyperlink w:history="1" r:id="rIdqidvw0whcuroqonzsrddk">
         <w:r>
           <w:rPr>
             <w:rStyle w:val="Hyperlink"/>
@@ -6823,7 +6823,7 @@
       </w:r>
     </w:p>
     <w:p>
-      <w:hyperlink w:history="1" r:id="rIdxt7spd4a2wtomi07m0mkw">
+      <w:hyperlink w:history="1" r:id="rId6hx8fqyr7dzdeabrrcarv">
         <w:r>
           <w:rPr>
             <w:rStyle w:val="Hyperlink"/>
@@ -8781,7 +8781,7 @@
       </w:r>
     </w:p>
     <w:p>
-      <w:hyperlink w:history="1" r:id="rId0si__q-ktcfq567uzbvvs">
+      <w:hyperlink w:history="1" r:id="rIdcppzsvoudqhfkqpbycnfc">
         <w:r>
           <w:rPr>
             <w:rStyle w:val="Hyperlink"/>
@@ -8799,7 +8799,7 @@
       </w:r>
     </w:p>
     <w:p>
-      <w:hyperlink w:history="1" r:id="rIdlznhtwoi4qw0-xprs35qj">
+      <w:hyperlink w:history="1" r:id="rIdtewbqlmwhfqfj4kgvf2ce">
         <w:r>
           <w:rPr>
             <w:rStyle w:val="Hyperlink"/>
@@ -11456,7 +11456,7 @@
       </w:r>
     </w:p>
     <w:p>
-      <w:hyperlink w:history="1" r:id="rIdr0iconoi0mxygwmrjrbh2">
+      <w:hyperlink w:history="1" r:id="rIdknlzqutivw7xwipp5rbcl">
         <w:r>
           <w:rPr>
             <w:rStyle w:val="Hyperlink"/>

</xml_diff>

<commit_message>
Integrate Curriculum Blueprint as first-class interactive view within the application
Co-authored-by: arena-agent <297053741+arena-agent@users.noreply.github.com>
</commit_message>
<xml_diff>
--- a/public/books/python-absolute-beginners/edition-01/Python-for-Absolute-Beginners-The-First-Code-Series-Book-1.docx
+++ b/public/books/python-absolute-beginners/edition-01/Python-for-Absolute-Beginners-The-First-Code-Series-Book-1.docx
@@ -725,7 +725,7 @@
       </w:r>
     </w:p>
     <w:p>
-      <w:hyperlink w:history="1" r:id="rIdatq1kniudknt-nhgrn59z">
+      <w:hyperlink w:history="1" r:id="rId8tg04utx9petmfsgloq0z">
         <w:r>
           <w:rPr>
             <w:rStyle w:val="Hyperlink"/>
@@ -743,7 +743,7 @@
       </w:r>
     </w:p>
     <w:p>
-      <w:hyperlink w:history="1" r:id="rIda7znrlm-vc1b5htzh03zj">
+      <w:hyperlink w:history="1" r:id="rIdqeogaof2znanwat4s0peh">
         <w:r>
           <w:rPr>
             <w:rStyle w:val="Hyperlink"/>
@@ -2996,7 +2996,7 @@
       </w:r>
     </w:p>
     <w:p>
-      <w:hyperlink w:history="1" r:id="rIdvpfvmjqyqqxnvzn0uauxk">
+      <w:hyperlink w:history="1" r:id="rIduvtbzhyp57mtsfxlhhuc3">
         <w:r>
           <w:rPr>
             <w:rStyle w:val="Hyperlink"/>
@@ -3014,7 +3014,7 @@
       </w:r>
     </w:p>
     <w:p>
-      <w:hyperlink w:history="1" r:id="rIduodgsgrthrdnufv1j3zsz">
+      <w:hyperlink w:history="1" r:id="rIdua1xflzevoi4j_7ebgsc0">
         <w:r>
           <w:rPr>
             <w:rStyle w:val="Hyperlink"/>
@@ -6787,7 +6787,7 @@
       </w:r>
     </w:p>
     <w:p>
-      <w:hyperlink w:history="1" r:id="rIdzp-vqzty171x3nj4mtvtr">
+      <w:hyperlink w:history="1" r:id="rIdz0mzar-feur6bccvr416r">
         <w:r>
           <w:rPr>
             <w:rStyle w:val="Hyperlink"/>
@@ -6805,7 +6805,7 @@
       </w:r>
     </w:p>
     <w:p>
-      <w:hyperlink w:history="1" r:id="rIdqidvw0whcuroqonzsrddk">
+      <w:hyperlink w:history="1" r:id="rIdm95zvotqm_yop-2g2ziih">
         <w:r>
           <w:rPr>
             <w:rStyle w:val="Hyperlink"/>
@@ -6823,7 +6823,7 @@
       </w:r>
     </w:p>
     <w:p>
-      <w:hyperlink w:history="1" r:id="rId6hx8fqyr7dzdeabrrcarv">
+      <w:hyperlink w:history="1" r:id="rId1yde_4jeycxeyjperxfom">
         <w:r>
           <w:rPr>
             <w:rStyle w:val="Hyperlink"/>
@@ -8781,7 +8781,7 @@
       </w:r>
     </w:p>
     <w:p>
-      <w:hyperlink w:history="1" r:id="rIdcppzsvoudqhfkqpbycnfc">
+      <w:hyperlink w:history="1" r:id="rIdzwjy5zqkdn6ubj79mi1wv">
         <w:r>
           <w:rPr>
             <w:rStyle w:val="Hyperlink"/>
@@ -8799,7 +8799,7 @@
       </w:r>
     </w:p>
     <w:p>
-      <w:hyperlink w:history="1" r:id="rIdtewbqlmwhfqfj4kgvf2ce">
+      <w:hyperlink w:history="1" r:id="rIdkycfavacthhzx8wclp9wh">
         <w:r>
           <w:rPr>
             <w:rStyle w:val="Hyperlink"/>
@@ -11456,7 +11456,7 @@
       </w:r>
     </w:p>
     <w:p>
-      <w:hyperlink w:history="1" r:id="rIdknlzqutivw7xwipp5rbcl">
+      <w:hyperlink w:history="1" r:id="rIdkr8ha3shvggtt4guj6vop">
         <w:r>
           <w:rPr>
             <w:rStyle w:val="Hyperlink"/>

</xml_diff>

<commit_message>
Optimize book preview toolbar space and introduce full screen and full width reading modes
Co-authored-by: arena-agent <297053741+arena-agent@users.noreply.github.com>
</commit_message>
<xml_diff>
--- a/public/books/python-absolute-beginners/edition-01/Python-for-Absolute-Beginners-The-First-Code-Series-Book-1.docx
+++ b/public/books/python-absolute-beginners/edition-01/Python-for-Absolute-Beginners-The-First-Code-Series-Book-1.docx
@@ -725,7 +725,7 @@
       </w:r>
     </w:p>
     <w:p>
-      <w:hyperlink w:history="1" r:id="rId8tg04utx9petmfsgloq0z">
+      <w:hyperlink w:history="1" r:id="rIdmrz9tiofcrrpwlypz43ue">
         <w:r>
           <w:rPr>
             <w:rStyle w:val="Hyperlink"/>
@@ -743,7 +743,7 @@
       </w:r>
     </w:p>
     <w:p>
-      <w:hyperlink w:history="1" r:id="rIdqeogaof2znanwat4s0peh">
+      <w:hyperlink w:history="1" r:id="rIdpbwynex9lol7nscymzped">
         <w:r>
           <w:rPr>
             <w:rStyle w:val="Hyperlink"/>
@@ -2996,7 +2996,7 @@
       </w:r>
     </w:p>
     <w:p>
-      <w:hyperlink w:history="1" r:id="rIduvtbzhyp57mtsfxlhhuc3">
+      <w:hyperlink w:history="1" r:id="rIdmtqafp6vdva2mvndk5cpt">
         <w:r>
           <w:rPr>
             <w:rStyle w:val="Hyperlink"/>
@@ -3014,7 +3014,7 @@
       </w:r>
     </w:p>
     <w:p>
-      <w:hyperlink w:history="1" r:id="rIdua1xflzevoi4j_7ebgsc0">
+      <w:hyperlink w:history="1" r:id="rIdly3xzmyodojrdd_vpzalz">
         <w:r>
           <w:rPr>
             <w:rStyle w:val="Hyperlink"/>
@@ -6787,7 +6787,7 @@
       </w:r>
     </w:p>
     <w:p>
-      <w:hyperlink w:history="1" r:id="rIdz0mzar-feur6bccvr416r">
+      <w:hyperlink w:history="1" r:id="rId5_7avjutumevuqxb1p6ks">
         <w:r>
           <w:rPr>
             <w:rStyle w:val="Hyperlink"/>
@@ -6805,7 +6805,7 @@
       </w:r>
     </w:p>
     <w:p>
-      <w:hyperlink w:history="1" r:id="rIdm95zvotqm_yop-2g2ziih">
+      <w:hyperlink w:history="1" r:id="rIdjho5n-ydgdldxuyk5rcid">
         <w:r>
           <w:rPr>
             <w:rStyle w:val="Hyperlink"/>
@@ -6823,7 +6823,7 @@
       </w:r>
     </w:p>
     <w:p>
-      <w:hyperlink w:history="1" r:id="rId1yde_4jeycxeyjperxfom">
+      <w:hyperlink w:history="1" r:id="rId6q0e5elwqsae3sk0jvplr">
         <w:r>
           <w:rPr>
             <w:rStyle w:val="Hyperlink"/>
@@ -8781,7 +8781,7 @@
       </w:r>
     </w:p>
     <w:p>
-      <w:hyperlink w:history="1" r:id="rIdzwjy5zqkdn6ubj79mi1wv">
+      <w:hyperlink w:history="1" r:id="rIdvyqy52bgqjgqog81yq3d_">
         <w:r>
           <w:rPr>
             <w:rStyle w:val="Hyperlink"/>
@@ -8799,7 +8799,7 @@
       </w:r>
     </w:p>
     <w:p>
-      <w:hyperlink w:history="1" r:id="rIdkycfavacthhzx8wclp9wh">
+      <w:hyperlink w:history="1" r:id="rId3uzmvprvmxutucvamxdci">
         <w:r>
           <w:rPr>
             <w:rStyle w:val="Hyperlink"/>
@@ -11456,7 +11456,7 @@
       </w:r>
     </w:p>
     <w:p>
-      <w:hyperlink w:history="1" r:id="rIdkr8ha3shvggtt4guj6vop">
+      <w:hyperlink w:history="1" r:id="rIdkaeku3d10uifx5hymhzvv">
         <w:r>
           <w:rPr>
             <w:rStyle w:val="Hyperlink"/>

</xml_diff>

<commit_message>
Implement true viewport fullscreen reading mode with iframe fallback, jump dropdown, and escape key listener
Co-authored-by: arena-agent <297053741+arena-agent@users.noreply.github.com>
</commit_message>
<xml_diff>
--- a/public/books/python-absolute-beginners/edition-01/Python-for-Absolute-Beginners-The-First-Code-Series-Book-1.docx
+++ b/public/books/python-absolute-beginners/edition-01/Python-for-Absolute-Beginners-The-First-Code-Series-Book-1.docx
@@ -725,7 +725,7 @@
       </w:r>
     </w:p>
     <w:p>
-      <w:hyperlink w:history="1" r:id="rIdmrz9tiofcrrpwlypz43ue">
+      <w:hyperlink w:history="1" r:id="rIdyrwlpmgic3w73dgopvubl">
         <w:r>
           <w:rPr>
             <w:rStyle w:val="Hyperlink"/>
@@ -743,7 +743,7 @@
       </w:r>
     </w:p>
     <w:p>
-      <w:hyperlink w:history="1" r:id="rIdpbwynex9lol7nscymzped">
+      <w:hyperlink w:history="1" r:id="rIdnees-srxsbtuex1blnbzw">
         <w:r>
           <w:rPr>
             <w:rStyle w:val="Hyperlink"/>
@@ -2996,7 +2996,7 @@
       </w:r>
     </w:p>
     <w:p>
-      <w:hyperlink w:history="1" r:id="rIdmtqafp6vdva2mvndk5cpt">
+      <w:hyperlink w:history="1" r:id="rIdqgw5qret7vtktzbu_0dtj">
         <w:r>
           <w:rPr>
             <w:rStyle w:val="Hyperlink"/>
@@ -3014,7 +3014,7 @@
       </w:r>
     </w:p>
     <w:p>
-      <w:hyperlink w:history="1" r:id="rIdly3xzmyodojrdd_vpzalz">
+      <w:hyperlink w:history="1" r:id="rIdmaixklxqgo7fg86sw9gph">
         <w:r>
           <w:rPr>
             <w:rStyle w:val="Hyperlink"/>
@@ -6787,7 +6787,7 @@
       </w:r>
     </w:p>
     <w:p>
-      <w:hyperlink w:history="1" r:id="rId5_7avjutumevuqxb1p6ks">
+      <w:hyperlink w:history="1" r:id="rId9zyjrzl__yveyjuvfgkrz">
         <w:r>
           <w:rPr>
             <w:rStyle w:val="Hyperlink"/>
@@ -6805,7 +6805,7 @@
       </w:r>
     </w:p>
     <w:p>
-      <w:hyperlink w:history="1" r:id="rIdjho5n-ydgdldxuyk5rcid">
+      <w:hyperlink w:history="1" r:id="rIdvkmwu-tz8biuhxl8lqule">
         <w:r>
           <w:rPr>
             <w:rStyle w:val="Hyperlink"/>
@@ -6823,7 +6823,7 @@
       </w:r>
     </w:p>
     <w:p>
-      <w:hyperlink w:history="1" r:id="rId6q0e5elwqsae3sk0jvplr">
+      <w:hyperlink w:history="1" r:id="rIdbrfuwa5uqzhpgbtpnwnex">
         <w:r>
           <w:rPr>
             <w:rStyle w:val="Hyperlink"/>
@@ -8781,7 +8781,7 @@
       </w:r>
     </w:p>
     <w:p>
-      <w:hyperlink w:history="1" r:id="rIdvyqy52bgqjgqog81yq3d_">
+      <w:hyperlink w:history="1" r:id="rIdzntw050sqfk0ghtofe5ob">
         <w:r>
           <w:rPr>
             <w:rStyle w:val="Hyperlink"/>
@@ -8799,7 +8799,7 @@
       </w:r>
     </w:p>
     <w:p>
-      <w:hyperlink w:history="1" r:id="rId3uzmvprvmxutucvamxdci">
+      <w:hyperlink w:history="1" r:id="rIdhdzujje7tyrjlgi-7ckml">
         <w:r>
           <w:rPr>
             <w:rStyle w:val="Hyperlink"/>
@@ -11456,7 +11456,7 @@
       </w:r>
     </w:p>
     <w:p>
-      <w:hyperlink w:history="1" r:id="rIdkaeku3d10uifx5hymhzvv">
+      <w:hyperlink w:history="1" r:id="rId4iqbrgnvoke-9idtnkezh">
         <w:r>
           <w:rPr>
             <w:rStyle w:val="Hyperlink"/>

</xml_diff>

<commit_message>
Add prominent Fullscreen Book button, keyboard shortcut F, floating FAB, full-width responsive sheets, and direct URL sync
Co-authored-by: arena-agent <297053741+arena-agent@users.noreply.github.com>
</commit_message>
<xml_diff>
--- a/public/books/python-absolute-beginners/edition-01/Python-for-Absolute-Beginners-The-First-Code-Series-Book-1.docx
+++ b/public/books/python-absolute-beginners/edition-01/Python-for-Absolute-Beginners-The-First-Code-Series-Book-1.docx
@@ -725,7 +725,7 @@
       </w:r>
     </w:p>
     <w:p>
-      <w:hyperlink w:history="1" r:id="rIdyrwlpmgic3w73dgopvubl">
+      <w:hyperlink w:history="1" r:id="rIdii3z8nvu5p4wswd7_nkbf">
         <w:r>
           <w:rPr>
             <w:rStyle w:val="Hyperlink"/>
@@ -743,7 +743,7 @@
       </w:r>
     </w:p>
     <w:p>
-      <w:hyperlink w:history="1" r:id="rIdnees-srxsbtuex1blnbzw">
+      <w:hyperlink w:history="1" r:id="rIdikhwcbwzup0slwuepyhgk">
         <w:r>
           <w:rPr>
             <w:rStyle w:val="Hyperlink"/>
@@ -2996,7 +2996,7 @@
       </w:r>
     </w:p>
     <w:p>
-      <w:hyperlink w:history="1" r:id="rIdqgw5qret7vtktzbu_0dtj">
+      <w:hyperlink w:history="1" r:id="rIdewctyxnjgor8-o9evuebp">
         <w:r>
           <w:rPr>
             <w:rStyle w:val="Hyperlink"/>
@@ -3014,7 +3014,7 @@
       </w:r>
     </w:p>
     <w:p>
-      <w:hyperlink w:history="1" r:id="rIdmaixklxqgo7fg86sw9gph">
+      <w:hyperlink w:history="1" r:id="rIdjqsqk9nag-wcqhfr8qhvq">
         <w:r>
           <w:rPr>
             <w:rStyle w:val="Hyperlink"/>
@@ -6787,7 +6787,7 @@
       </w:r>
     </w:p>
     <w:p>
-      <w:hyperlink w:history="1" r:id="rId9zyjrzl__yveyjuvfgkrz">
+      <w:hyperlink w:history="1" r:id="rIdukv_we2juz0fczbmieowq">
         <w:r>
           <w:rPr>
             <w:rStyle w:val="Hyperlink"/>
@@ -6805,7 +6805,7 @@
       </w:r>
     </w:p>
     <w:p>
-      <w:hyperlink w:history="1" r:id="rIdvkmwu-tz8biuhxl8lqule">
+      <w:hyperlink w:history="1" r:id="rId8kedeqlsrrgg_jebgh5gh">
         <w:r>
           <w:rPr>
             <w:rStyle w:val="Hyperlink"/>
@@ -6823,7 +6823,7 @@
       </w:r>
     </w:p>
     <w:p>
-      <w:hyperlink w:history="1" r:id="rIdbrfuwa5uqzhpgbtpnwnex">
+      <w:hyperlink w:history="1" r:id="rIdxekeo7ogrvsj-k3o0ajsm">
         <w:r>
           <w:rPr>
             <w:rStyle w:val="Hyperlink"/>
@@ -8781,7 +8781,7 @@
       </w:r>
     </w:p>
     <w:p>
-      <w:hyperlink w:history="1" r:id="rIdzntw050sqfk0ghtofe5ob">
+      <w:hyperlink w:history="1" r:id="rId-mpmgammol8drv4kidlvn">
         <w:r>
           <w:rPr>
             <w:rStyle w:val="Hyperlink"/>
@@ -8799,7 +8799,7 @@
       </w:r>
     </w:p>
     <w:p>
-      <w:hyperlink w:history="1" r:id="rIdhdzujje7tyrjlgi-7ckml">
+      <w:hyperlink w:history="1" r:id="rIdo4t6kdbragoub3uw0nwuj">
         <w:r>
           <w:rPr>
             <w:rStyle w:val="Hyperlink"/>
@@ -11456,7 +11456,7 @@
       </w:r>
     </w:p>
     <w:p>
-      <w:hyperlink w:history="1" r:id="rId4iqbrgnvoke-9idtnkezh">
+      <w:hyperlink w:history="1" r:id="rId-ne71-cgax3on8es2baaj">
         <w:r>
           <w:rPr>
             <w:rStyle w:val="Hyperlink"/>

</xml_diff>

<commit_message>
Implement high-stakes architectural triumph milestones and superpowers across all 13 chapters with 100% Rule 19 compliance
Co-authored-by: arena-agent <297053741+arena-agent@users.noreply.github.com>
</commit_message>
<xml_diff>
--- a/public/books/python-absolute-beginners/edition-01/Python-for-Absolute-Beginners-The-First-Code-Series-Book-1.docx
+++ b/public/books/python-absolute-beginners/edition-01/Python-for-Absolute-Beginners-The-First-Code-Series-Book-1.docx
@@ -725,7 +725,7 @@
       </w:r>
     </w:p>
     <w:p>
-      <w:hyperlink w:history="1" r:id="rIdii3z8nvu5p4wswd7_nkbf">
+      <w:hyperlink w:history="1" r:id="rIdsz5uz6cvugnbyjtnmxm4t">
         <w:r>
           <w:rPr>
             <w:rStyle w:val="Hyperlink"/>
@@ -743,7 +743,7 @@
       </w:r>
     </w:p>
     <w:p>
-      <w:hyperlink w:history="1" r:id="rIdikhwcbwzup0slwuepyhgk">
+      <w:hyperlink w:history="1" r:id="rId96epkz4m2ceyc6-59hcpw">
         <w:r>
           <w:rPr>
             <w:rStyle w:val="Hyperlink"/>
@@ -2996,7 +2996,7 @@
       </w:r>
     </w:p>
     <w:p>
-      <w:hyperlink w:history="1" r:id="rIdewctyxnjgor8-o9evuebp">
+      <w:hyperlink w:history="1" r:id="rId6smn4kvrpuio6ermdoy3h">
         <w:r>
           <w:rPr>
             <w:rStyle w:val="Hyperlink"/>
@@ -3014,7 +3014,7 @@
       </w:r>
     </w:p>
     <w:p>
-      <w:hyperlink w:history="1" r:id="rIdjqsqk9nag-wcqhfr8qhvq">
+      <w:hyperlink w:history="1" r:id="rId25jye3fbevsmfnrqqnttw">
         <w:r>
           <w:rPr>
             <w:rStyle w:val="Hyperlink"/>
@@ -6787,7 +6787,7 @@
       </w:r>
     </w:p>
     <w:p>
-      <w:hyperlink w:history="1" r:id="rIdukv_we2juz0fczbmieowq">
+      <w:hyperlink w:history="1" r:id="rId5irhtm6wejuy6yaku326p">
         <w:r>
           <w:rPr>
             <w:rStyle w:val="Hyperlink"/>
@@ -6805,7 +6805,7 @@
       </w:r>
     </w:p>
     <w:p>
-      <w:hyperlink w:history="1" r:id="rId8kedeqlsrrgg_jebgh5gh">
+      <w:hyperlink w:history="1" r:id="rId61mxa_rqpa6ufipvd7t0w">
         <w:r>
           <w:rPr>
             <w:rStyle w:val="Hyperlink"/>
@@ -6823,7 +6823,7 @@
       </w:r>
     </w:p>
     <w:p>
-      <w:hyperlink w:history="1" r:id="rIdxekeo7ogrvsj-k3o0ajsm">
+      <w:hyperlink w:history="1" r:id="rIdsluwildadsncmbeouqv5w">
         <w:r>
           <w:rPr>
             <w:rStyle w:val="Hyperlink"/>
@@ -8781,7 +8781,7 @@
       </w:r>
     </w:p>
     <w:p>
-      <w:hyperlink w:history="1" r:id="rId-mpmgammol8drv4kidlvn">
+      <w:hyperlink w:history="1" r:id="rIdra0cqwsz15_-1uzrvll2e">
         <w:r>
           <w:rPr>
             <w:rStyle w:val="Hyperlink"/>
@@ -8799,7 +8799,7 @@
       </w:r>
     </w:p>
     <w:p>
-      <w:hyperlink w:history="1" r:id="rIdo4t6kdbragoub3uw0nwuj">
+      <w:hyperlink w:history="1" r:id="rIdnd8ye38zuzcudmrb4h0id">
         <w:r>
           <w:rPr>
             <w:rStyle w:val="Hyperlink"/>
@@ -11456,7 +11456,7 @@
       </w:r>
     </w:p>
     <w:p>
-      <w:hyperlink w:history="1" r:id="rId-ne71-cgax3on8es2baaj">
+      <w:hyperlink w:history="1" r:id="rIdprde3gn50jnf1vlvdxfut">
         <w:r>
           <w:rPr>
             <w:rStyle w:val="Hyperlink"/>

</xml_diff>

<commit_message>
Complete Zero to Agentic API Testing: 13 chapters, story images, victory milestones, and full test suite
Co-authored-by: arena-agent <297053741+arena-agent@users.noreply.github.com>
</commit_message>
<xml_diff>
--- a/public/books/python-absolute-beginners/edition-01/Python-for-Absolute-Beginners-The-First-Code-Series-Book-1.docx
+++ b/public/books/python-absolute-beginners/edition-01/Python-for-Absolute-Beginners-The-First-Code-Series-Book-1.docx
@@ -725,7 +725,7 @@
       </w:r>
     </w:p>
     <w:p>
-      <w:hyperlink w:history="1" r:id="rIdsz5uz6cvugnbyjtnmxm4t">
+      <w:hyperlink w:history="1" r:id="rIdgcfu7w9vn1vqcbdoollkk">
         <w:r>
           <w:rPr>
             <w:rStyle w:val="Hyperlink"/>
@@ -743,7 +743,7 @@
       </w:r>
     </w:p>
     <w:p>
-      <w:hyperlink w:history="1" r:id="rId96epkz4m2ceyc6-59hcpw">
+      <w:hyperlink w:history="1" r:id="rId2hqvmrgiy675ogr8rnlxf">
         <w:r>
           <w:rPr>
             <w:rStyle w:val="Hyperlink"/>
@@ -2996,7 +2996,7 @@
       </w:r>
     </w:p>
     <w:p>
-      <w:hyperlink w:history="1" r:id="rId6smn4kvrpuio6ermdoy3h">
+      <w:hyperlink w:history="1" r:id="rIdyiq7x2uc_jklpomku1j7o">
         <w:r>
           <w:rPr>
             <w:rStyle w:val="Hyperlink"/>
@@ -3014,7 +3014,7 @@
       </w:r>
     </w:p>
     <w:p>
-      <w:hyperlink w:history="1" r:id="rId25jye3fbevsmfnrqqnttw">
+      <w:hyperlink w:history="1" r:id="rIdieendnzp3on991lkm9mzz">
         <w:r>
           <w:rPr>
             <w:rStyle w:val="Hyperlink"/>
@@ -6787,7 +6787,7 @@
       </w:r>
     </w:p>
     <w:p>
-      <w:hyperlink w:history="1" r:id="rId5irhtm6wejuy6yaku326p">
+      <w:hyperlink w:history="1" r:id="rIdzrdyv09q_9fxq66trkcud">
         <w:r>
           <w:rPr>
             <w:rStyle w:val="Hyperlink"/>
@@ -6805,7 +6805,7 @@
       </w:r>
     </w:p>
     <w:p>
-      <w:hyperlink w:history="1" r:id="rId61mxa_rqpa6ufipvd7t0w">
+      <w:hyperlink w:history="1" r:id="rIda7h8gnqqbmn-shbm-ikmw">
         <w:r>
           <w:rPr>
             <w:rStyle w:val="Hyperlink"/>
@@ -6823,7 +6823,7 @@
       </w:r>
     </w:p>
     <w:p>
-      <w:hyperlink w:history="1" r:id="rIdsluwildadsncmbeouqv5w">
+      <w:hyperlink w:history="1" r:id="rIdr9ppmjtpidxnfurxnmtkm">
         <w:r>
           <w:rPr>
             <w:rStyle w:val="Hyperlink"/>
@@ -8781,7 +8781,7 @@
       </w:r>
     </w:p>
     <w:p>
-      <w:hyperlink w:history="1" r:id="rIdra0cqwsz15_-1uzrvll2e">
+      <w:hyperlink w:history="1" r:id="rIdnnakgigiooqllaaq2xu1a">
         <w:r>
           <w:rPr>
             <w:rStyle w:val="Hyperlink"/>
@@ -8799,7 +8799,7 @@
       </w:r>
     </w:p>
     <w:p>
-      <w:hyperlink w:history="1" r:id="rIdnd8ye38zuzcudmrb4h0id">
+      <w:hyperlink w:history="1" r:id="rIde5bizuzbphap78fpx_kzc">
         <w:r>
           <w:rPr>
             <w:rStyle w:val="Hyperlink"/>
@@ -11456,7 +11456,7 @@
       </w:r>
     </w:p>
     <w:p>
-      <w:hyperlink w:history="1" r:id="rIdprde3gn50jnf1vlvdxfut">
+      <w:hyperlink w:history="1" r:id="rIdag7rpyh44jmztjhwtbrus">
         <w:r>
           <w:rPr>
             <w:rStyle w:val="Hyperlink"/>

</xml_diff>

<commit_message>
Integrate mission story images into mission boxes and package architectural images into modern UI boxes
Co-authored-by: arena-agent <297053741+arena-agent@users.noreply.github.com>
</commit_message>
<xml_diff>
--- a/public/books/python-absolute-beginners/edition-01/Python-for-Absolute-Beginners-The-First-Code-Series-Book-1.docx
+++ b/public/books/python-absolute-beginners/edition-01/Python-for-Absolute-Beginners-The-First-Code-Series-Book-1.docx
@@ -279,131 +279,179 @@
         <w:t xml:space="preserve">Preface — Why Was Python Needed?</w:t>
       </w:r>
     </w:p>
-    <w:p>
-      <w:pPr>
-        <w:jc w:val="center"/>
-      </w:pPr>
-      <w:r>
-        <w:drawing>
-          <wp:inline distT="0" distB="0" distL="0" distR="0">
-            <wp:extent cx="5334000" cy="3552825"/>
-            <wp:effectExtent t="0" r="0" b="0" l="0"/>
-            <wp:docPr id="1" name="A difficult choice leads to a simpler Python bridge and then many kinds of useful work." descr="A difficult choice leads to a simpler Python bridge and then many kinds of useful work." title="A difficult choice leads to a simpler Python bridge and then many kinds of useful work."/>
-            <wp:cNvGraphicFramePr>
-              <a:graphicFrameLocks xmlns:a="http://schemas.openxmlformats.org/drawingml/2006/main" noChangeAspect="1"/>
-            </wp:cNvGraphicFramePr>
-            <a:graphic xmlns:a="http://schemas.openxmlformats.org/drawingml/2006/main">
-              <a:graphicData uri="http://schemas.openxmlformats.org/drawingml/2006/picture">
-                <pic:pic xmlns:pic="http://schemas.openxmlformats.org/drawingml/2006/picture">
-                  <pic:nvPicPr>
-                    <pic:cNvPr id="0" name="" descr=""/>
-                    <pic:cNvPicPr>
-                      <a:picLocks noChangeAspect="1" noChangeArrowheads="1"/>
-                    </pic:cNvPicPr>
-                  </pic:nvPicPr>
-                  <pic:blipFill>
-                    <a:blip r:embed="rId10" cstate="none"/>
-                    <a:srcRect/>
-                    <a:stretch>
-                      <a:fillRect/>
-                    </a:stretch>
-                  </pic:blipFill>
-                  <pic:spPr bwMode="auto">
-                    <a:xfrm>
-                      <a:off x="0" y="0"/>
-                      <a:ext cx="5334000" cy="3552825"/>
-                    </a:xfrm>
-                    <a:prstGeom prst="rect">
-                      <a:avLst/>
-                    </a:prstGeom>
-                  </pic:spPr>
-                </pic:pic>
-              </a:graphicData>
-            </a:graphic>
-          </wp:inline>
-        </w:drawing>
-      </w:r>
-    </w:p>
-    <w:p>
-      <w:pPr>
-        <w:spacing w:after="120" w:line="300"/>
-        <w:jc w:val="center"/>
-      </w:pPr>
-      <w:r>
-        <w:rPr>
-          <w:i/>
-          <w:iCs/>
-          <w:color w:val="5B6575"/>
-          <w:sz w:val="19"/>
-          <w:szCs w:val="19"/>
-        </w:rPr>
-        <w:t xml:space="preserve">Python filled the missing middle path.</w:t>
-      </w:r>
-    </w:p>
-    <w:p>
-      <w:pPr>
-        <w:spacing w:after="120" w:line="300"/>
-      </w:pPr>
-      <w:r>
-        <w:rPr>
-          <w:b/>
-          <w:bCs/>
-          <w:color w:val="4659A7"/>
-        </w:rPr>
-        <w:t xml:space="preserve">1  </w:t>
-      </w:r>
-      <w:r>
-        <w:t xml:space="preserve">Quick scripts were useful, but some jobs outgrew them.</w:t>
-      </w:r>
-    </w:p>
-    <w:p>
-      <w:pPr>
-        <w:spacing w:after="120" w:line="300"/>
-      </w:pPr>
-      <w:r>
-        <w:rPr>
-          <w:b/>
-          <w:bCs/>
-          <w:color w:val="4659A7"/>
-        </w:rPr>
-        <w:t xml:space="preserve">2  </w:t>
-      </w:r>
-      <w:r>
-        <w:t xml:space="preserve">C offered more control, but small tools could take much more code.</w:t>
-      </w:r>
-    </w:p>
-    <w:p>
-      <w:pPr>
-        <w:spacing w:after="120" w:line="300"/>
-      </w:pPr>
-      <w:r>
-        <w:rPr>
-          <w:b/>
-          <w:bCs/>
-          <w:color w:val="4659A7"/>
-        </w:rPr>
-        <w:t xml:space="preserve">3  </w:t>
-      </w:r>
-      <w:r>
-        <w:t xml:space="preserve">Python made many everyday programs easier to read and build.</w:t>
-      </w:r>
-    </w:p>
-    <w:p>
-      <w:pPr>
-        <w:spacing w:after="120" w:line="300"/>
-      </w:pPr>
-      <w:r>
-        <w:rPr>
-          <w:b/>
-          <w:bCs/>
-          <w:color w:val="4659A7"/>
-        </w:rPr>
-        <w:t xml:space="preserve">4  </w:t>
-      </w:r>
-      <w:r>
-        <w:t xml:space="preserve">The same language now supports automation, websites, data, science and AI.</w:t>
-      </w:r>
-    </w:p>
+    <w:tbl>
+      <w:tblPr>
+        <w:tblW w:type="pct" w:w="100%"/>
+        <w:tblBorders>
+          <w:top w:val="single" w:color="auto" w:sz="4"/>
+          <w:left w:val="single" w:color="auto" w:sz="4"/>
+          <w:bottom w:val="single" w:color="auto" w:sz="4"/>
+          <w:right w:val="single" w:color="auto" w:sz="4"/>
+          <w:insideH w:val="single" w:color="auto" w:sz="4"/>
+          <w:insideV w:val="single" w:color="auto" w:sz="4"/>
+        </w:tblBorders>
+      </w:tblPr>
+      <w:tblGrid>
+        <w:gridCol w:w="100"/>
+      </w:tblGrid>
+      <w:tr>
+        <w:tc>
+          <w:tcPr>
+            <w:tcBorders>
+              <w:top w:val="single" w:color="D9E0EA" w:sz="2"/>
+              <w:left w:val="single" w:color="D9E0EA" w:sz="2"/>
+              <w:bottom w:val="single" w:color="D9E0EA" w:sz="2"/>
+              <w:right w:val="single" w:color="D9E0EA" w:sz="2"/>
+            </w:tcBorders>
+            <w:shd w:fill="F8FAFC" w:val="clear"/>
+            <w:tcMar>
+              <w:top w:type="dxa" w:w="130"/>
+              <w:left w:type="dxa" w:w="160"/>
+              <w:bottom w:type="dxa" w:w="130"/>
+              <w:right w:type="dxa" w:w="160"/>
+            </w:tcMar>
+          </w:tcPr>
+          <w:p>
+            <w:pPr>
+              <w:spacing w:after="120" w:line="300"/>
+            </w:pPr>
+            <w:r>
+              <w:rPr>
+                <w:b/>
+                <w:bCs/>
+                <w:color w:val="263A67"/>
+              </w:rPr>
+              <w:t xml:space="preserve">ARCHITECTURAL BLUEPRINT</w:t>
+            </w:r>
+          </w:p>
+          <w:p>
+            <w:pPr>
+              <w:jc w:val="center"/>
+            </w:pPr>
+            <w:r>
+              <w:drawing>
+                <wp:inline distT="0" distB="0" distL="0" distR="0">
+                  <wp:extent cx="5334000" cy="3552825"/>
+                  <wp:effectExtent t="0" r="0" b="0" l="0"/>
+                  <wp:docPr id="1" name="A difficult choice leads to a simpler Python bridge and then many kinds of useful work." descr="A difficult choice leads to a simpler Python bridge and then many kinds of useful work." title="A difficult choice leads to a simpler Python bridge and then many kinds of useful work."/>
+                  <wp:cNvGraphicFramePr>
+                    <a:graphicFrameLocks xmlns:a="http://schemas.openxmlformats.org/drawingml/2006/main" noChangeAspect="1"/>
+                  </wp:cNvGraphicFramePr>
+                  <a:graphic xmlns:a="http://schemas.openxmlformats.org/drawingml/2006/main">
+                    <a:graphicData uri="http://schemas.openxmlformats.org/drawingml/2006/picture">
+                      <pic:pic xmlns:pic="http://schemas.openxmlformats.org/drawingml/2006/picture">
+                        <pic:nvPicPr>
+                          <pic:cNvPr id="0" name="" descr=""/>
+                          <pic:cNvPicPr>
+                            <a:picLocks noChangeAspect="1" noChangeArrowheads="1"/>
+                          </pic:cNvPicPr>
+                        </pic:nvPicPr>
+                        <pic:blipFill>
+                          <a:blip r:embed="rId10" cstate="none"/>
+                          <a:srcRect/>
+                          <a:stretch>
+                            <a:fillRect/>
+                          </a:stretch>
+                        </pic:blipFill>
+                        <pic:spPr bwMode="auto">
+                          <a:xfrm>
+                            <a:off x="0" y="0"/>
+                            <a:ext cx="5334000" cy="3552825"/>
+                          </a:xfrm>
+                          <a:prstGeom prst="rect">
+                            <a:avLst/>
+                          </a:prstGeom>
+                        </pic:spPr>
+                      </pic:pic>
+                    </a:graphicData>
+                  </a:graphic>
+                </wp:inline>
+              </w:drawing>
+            </w:r>
+          </w:p>
+          <w:p>
+            <w:pPr>
+              <w:spacing w:after="120" w:line="300"/>
+              <w:jc w:val="center"/>
+            </w:pPr>
+            <w:r>
+              <w:rPr>
+                <w:i/>
+                <w:iCs/>
+                <w:color w:val="5B6575"/>
+                <w:sz w:val="19"/>
+                <w:szCs w:val="19"/>
+              </w:rPr>
+              <w:t xml:space="preserve">Python filled the missing middle path.</w:t>
+            </w:r>
+          </w:p>
+          <w:p>
+            <w:pPr>
+              <w:spacing w:after="120" w:line="300"/>
+            </w:pPr>
+            <w:r>
+              <w:rPr>
+                <w:b/>
+                <w:bCs/>
+                <w:color w:val="4659A7"/>
+              </w:rPr>
+              <w:t xml:space="preserve">1  </w:t>
+            </w:r>
+            <w:r>
+              <w:t xml:space="preserve">Quick scripts were useful, but some jobs outgrew them.</w:t>
+            </w:r>
+          </w:p>
+          <w:p>
+            <w:pPr>
+              <w:spacing w:after="120" w:line="300"/>
+            </w:pPr>
+            <w:r>
+              <w:rPr>
+                <w:b/>
+                <w:bCs/>
+                <w:color w:val="4659A7"/>
+              </w:rPr>
+              <w:t xml:space="preserve">2  </w:t>
+            </w:r>
+            <w:r>
+              <w:t xml:space="preserve">C offered more control, but small tools could take much more code.</w:t>
+            </w:r>
+          </w:p>
+          <w:p>
+            <w:pPr>
+              <w:spacing w:after="120" w:line="300"/>
+            </w:pPr>
+            <w:r>
+              <w:rPr>
+                <w:b/>
+                <w:bCs/>
+                <w:color w:val="4659A7"/>
+              </w:rPr>
+              <w:t xml:space="preserve">3  </w:t>
+            </w:r>
+            <w:r>
+              <w:t xml:space="preserve">Python made many everyday programs easier to read and build.</w:t>
+            </w:r>
+          </w:p>
+          <w:p>
+            <w:pPr>
+              <w:spacing w:after="120" w:line="300"/>
+            </w:pPr>
+            <w:r>
+              <w:rPr>
+                <w:b/>
+                <w:bCs/>
+                <w:color w:val="4659A7"/>
+              </w:rPr>
+              <w:t xml:space="preserve">4  </w:t>
+            </w:r>
+            <w:r>
+              <w:t xml:space="preserve">The same language now supports automation, websites, data, science and AI.</w:t>
+            </w:r>
+          </w:p>
+        </w:tc>
+      </w:tr>
+    </w:tbl>
     <w:p>
       <w:pPr>
         <w:spacing w:after="120" w:line="300"/>
@@ -725,7 +773,7 @@
       </w:r>
     </w:p>
     <w:p>
-      <w:hyperlink w:history="1" r:id="rIdgcfu7w9vn1vqcbdoollkk">
+      <w:hyperlink w:history="1" r:id="rIdwe-zhmf44po0fa3friroz">
         <w:r>
           <w:rPr>
             <w:rStyle w:val="Hyperlink"/>
@@ -743,7 +791,7 @@
       </w:r>
     </w:p>
     <w:p>
-      <w:hyperlink w:history="1" r:id="rId2hqvmrgiy675ogr8rnlxf">
+      <w:hyperlink w:history="1" r:id="rIdk1zxhga5pa6jyq6re3otz">
         <w:r>
           <w:rPr>
             <w:rStyle w:val="Hyperlink"/>
@@ -831,126 +879,174 @@
         <w:t xml:space="preserve">We begin with an empty file and end with a real result—understanding every character we typed.</w:t>
       </w:r>
     </w:p>
-    <w:p>
-      <w:pPr>
-        <w:jc w:val="center"/>
-      </w:pPr>
-      <w:r>
-        <w:drawing>
-          <wp:inline distT="0" distB="0" distL="0" distR="0">
-            <wp:extent cx="5334000" cy="3552825"/>
-            <wp:effectExtent t="0" r="0" b="0" l="0"/>
-            <wp:docPr id="1" name="A three-stage path from a Python file to the interpreter and a terminal." descr="A three-stage path from a Python file to the interpreter and a terminal." title="A three-stage path from a Python file to the interpreter and a terminal."/>
-            <wp:cNvGraphicFramePr>
-              <a:graphicFrameLocks xmlns:a="http://schemas.openxmlformats.org/drawingml/2006/main" noChangeAspect="1"/>
-            </wp:cNvGraphicFramePr>
-            <a:graphic xmlns:a="http://schemas.openxmlformats.org/drawingml/2006/main">
-              <a:graphicData uri="http://schemas.openxmlformats.org/drawingml/2006/picture">
-                <pic:pic xmlns:pic="http://schemas.openxmlformats.org/drawingml/2006/picture">
-                  <pic:nvPicPr>
-                    <pic:cNvPr id="0" name="" descr=""/>
-                    <pic:cNvPicPr>
-                      <a:picLocks noChangeAspect="1" noChangeArrowheads="1"/>
-                    </pic:cNvPicPr>
-                  </pic:nvPicPr>
-                  <pic:blipFill>
-                    <a:blip r:embed="rId11" cstate="none"/>
-                    <a:srcRect/>
-                    <a:stretch>
-                      <a:fillRect/>
-                    </a:stretch>
-                  </pic:blipFill>
-                  <pic:spPr bwMode="auto">
-                    <a:xfrm>
-                      <a:off x="0" y="0"/>
-                      <a:ext cx="5334000" cy="3552825"/>
-                    </a:xfrm>
-                    <a:prstGeom prst="rect">
-                      <a:avLst/>
-                    </a:prstGeom>
-                  </pic:spPr>
-                </pic:pic>
-              </a:graphicData>
-            </a:graphic>
-          </wp:inline>
-        </w:drawing>
-      </w:r>
-    </w:p>
-    <w:p>
-      <w:pPr>
-        <w:spacing w:after="120" w:line="300"/>
-        <w:jc w:val="center"/>
-      </w:pPr>
-      <w:r>
-        <w:rPr>
-          <w:i/>
-          <w:iCs/>
-          <w:color w:val="5B6575"/>
-          <w:sz w:val="19"/>
-          <w:szCs w:val="19"/>
-        </w:rPr>
-        <w:t xml:space="preserve">One instruction travels from our file to the screen.</w:t>
-      </w:r>
-    </w:p>
-    <w:p>
-      <w:pPr>
-        <w:spacing w:after="120" w:line="300"/>
-      </w:pPr>
-      <w:r>
-        <w:rPr>
-          <w:b/>
-          <w:bCs/>
-          <w:color w:val="4659A7"/>
-        </w:rPr>
-        <w:t xml:space="preserve">1  </w:t>
-      </w:r>
-      <w:r>
-        <w:t xml:space="preserve">We save the instruction in </w:t>
-      </w:r>
-      <w:r>
-        <w:rPr>
-          <w:rFonts w:ascii="Consolas" w:cs="Consolas" w:eastAsia="Consolas" w:hAnsi="Consolas"/>
-          <w:color w:val="4659A7"/>
-          <w:shd w:fill="EEF1FA" w:val="clear"/>
-        </w:rPr>
-        <w:t xml:space="preserve">hello.py</w:t>
-      </w:r>
-      <w:r>
-        <w:t xml:space="preserve">.</w:t>
-      </w:r>
-    </w:p>
-    <w:p>
-      <w:pPr>
-        <w:spacing w:after="120" w:line="300"/>
-      </w:pPr>
-      <w:r>
-        <w:rPr>
-          <w:b/>
-          <w:bCs/>
-          <w:color w:val="4659A7"/>
-        </w:rPr>
-        <w:t xml:space="preserve">2  </w:t>
-      </w:r>
-      <w:r>
-        <w:t xml:space="preserve">Python reads the file and performs the instruction.</w:t>
-      </w:r>
-    </w:p>
-    <w:p>
-      <w:pPr>
-        <w:spacing w:after="120" w:line="300"/>
-      </w:pPr>
-      <w:r>
-        <w:rPr>
-          <w:b/>
-          <w:bCs/>
-          <w:color w:val="4659A7"/>
-        </w:rPr>
-        <w:t xml:space="preserve">3  </w:t>
-      </w:r>
-      <w:r>
-        <w:t xml:space="preserve">The terminal receives and displays the result.</w:t>
-      </w:r>
-    </w:p>
+    <w:tbl>
+      <w:tblPr>
+        <w:tblW w:type="pct" w:w="100%"/>
+        <w:tblBorders>
+          <w:top w:val="single" w:color="auto" w:sz="4"/>
+          <w:left w:val="single" w:color="auto" w:sz="4"/>
+          <w:bottom w:val="single" w:color="auto" w:sz="4"/>
+          <w:right w:val="single" w:color="auto" w:sz="4"/>
+          <w:insideH w:val="single" w:color="auto" w:sz="4"/>
+          <w:insideV w:val="single" w:color="auto" w:sz="4"/>
+        </w:tblBorders>
+      </w:tblPr>
+      <w:tblGrid>
+        <w:gridCol w:w="100"/>
+      </w:tblGrid>
+      <w:tr>
+        <w:tc>
+          <w:tcPr>
+            <w:tcBorders>
+              <w:top w:val="single" w:color="D9E0EA" w:sz="2"/>
+              <w:left w:val="single" w:color="D9E0EA" w:sz="2"/>
+              <w:bottom w:val="single" w:color="D9E0EA" w:sz="2"/>
+              <w:right w:val="single" w:color="D9E0EA" w:sz="2"/>
+            </w:tcBorders>
+            <w:shd w:fill="F8FAFC" w:val="clear"/>
+            <w:tcMar>
+              <w:top w:type="dxa" w:w="130"/>
+              <w:left w:type="dxa" w:w="160"/>
+              <w:bottom w:type="dxa" w:w="130"/>
+              <w:right w:type="dxa" w:w="160"/>
+            </w:tcMar>
+          </w:tcPr>
+          <w:p>
+            <w:pPr>
+              <w:spacing w:after="120" w:line="300"/>
+            </w:pPr>
+            <w:r>
+              <w:rPr>
+                <w:b/>
+                <w:bCs/>
+                <w:color w:val="263A67"/>
+              </w:rPr>
+              <w:t xml:space="preserve">ARCHITECTURAL BLUEPRINT</w:t>
+            </w:r>
+          </w:p>
+          <w:p>
+            <w:pPr>
+              <w:jc w:val="center"/>
+            </w:pPr>
+            <w:r>
+              <w:drawing>
+                <wp:inline distT="0" distB="0" distL="0" distR="0">
+                  <wp:extent cx="5334000" cy="3552825"/>
+                  <wp:effectExtent t="0" r="0" b="0" l="0"/>
+                  <wp:docPr id="1" name="A three-stage path from a Python file to the interpreter and a terminal." descr="A three-stage path from a Python file to the interpreter and a terminal." title="A three-stage path from a Python file to the interpreter and a terminal."/>
+                  <wp:cNvGraphicFramePr>
+                    <a:graphicFrameLocks xmlns:a="http://schemas.openxmlformats.org/drawingml/2006/main" noChangeAspect="1"/>
+                  </wp:cNvGraphicFramePr>
+                  <a:graphic xmlns:a="http://schemas.openxmlformats.org/drawingml/2006/main">
+                    <a:graphicData uri="http://schemas.openxmlformats.org/drawingml/2006/picture">
+                      <pic:pic xmlns:pic="http://schemas.openxmlformats.org/drawingml/2006/picture">
+                        <pic:nvPicPr>
+                          <pic:cNvPr id="0" name="" descr=""/>
+                          <pic:cNvPicPr>
+                            <a:picLocks noChangeAspect="1" noChangeArrowheads="1"/>
+                          </pic:cNvPicPr>
+                        </pic:nvPicPr>
+                        <pic:blipFill>
+                          <a:blip r:embed="rId11" cstate="none"/>
+                          <a:srcRect/>
+                          <a:stretch>
+                            <a:fillRect/>
+                          </a:stretch>
+                        </pic:blipFill>
+                        <pic:spPr bwMode="auto">
+                          <a:xfrm>
+                            <a:off x="0" y="0"/>
+                            <a:ext cx="5334000" cy="3552825"/>
+                          </a:xfrm>
+                          <a:prstGeom prst="rect">
+                            <a:avLst/>
+                          </a:prstGeom>
+                        </pic:spPr>
+                      </pic:pic>
+                    </a:graphicData>
+                  </a:graphic>
+                </wp:inline>
+              </w:drawing>
+            </w:r>
+          </w:p>
+          <w:p>
+            <w:pPr>
+              <w:spacing w:after="120" w:line="300"/>
+              <w:jc w:val="center"/>
+            </w:pPr>
+            <w:r>
+              <w:rPr>
+                <w:i/>
+                <w:iCs/>
+                <w:color w:val="5B6575"/>
+                <w:sz w:val="19"/>
+                <w:szCs w:val="19"/>
+              </w:rPr>
+              <w:t xml:space="preserve">One instruction travels from our file to the screen.</w:t>
+            </w:r>
+          </w:p>
+          <w:p>
+            <w:pPr>
+              <w:spacing w:after="120" w:line="300"/>
+            </w:pPr>
+            <w:r>
+              <w:rPr>
+                <w:b/>
+                <w:bCs/>
+                <w:color w:val="4659A7"/>
+              </w:rPr>
+              <w:t xml:space="preserve">1  </w:t>
+            </w:r>
+            <w:r>
+              <w:t xml:space="preserve">We save the instruction in </w:t>
+            </w:r>
+            <w:r>
+              <w:rPr>
+                <w:rFonts w:ascii="Consolas" w:cs="Consolas" w:eastAsia="Consolas" w:hAnsi="Consolas"/>
+                <w:color w:val="4659A7"/>
+                <w:shd w:fill="EEF1FA" w:val="clear"/>
+              </w:rPr>
+              <w:t xml:space="preserve">hello.py</w:t>
+            </w:r>
+            <w:r>
+              <w:t xml:space="preserve">.</w:t>
+            </w:r>
+          </w:p>
+          <w:p>
+            <w:pPr>
+              <w:spacing w:after="120" w:line="300"/>
+            </w:pPr>
+            <w:r>
+              <w:rPr>
+                <w:b/>
+                <w:bCs/>
+                <w:color w:val="4659A7"/>
+              </w:rPr>
+              <w:t xml:space="preserve">2  </w:t>
+            </w:r>
+            <w:r>
+              <w:t xml:space="preserve">Python reads the file and performs the instruction.</w:t>
+            </w:r>
+          </w:p>
+          <w:p>
+            <w:pPr>
+              <w:spacing w:after="120" w:line="300"/>
+            </w:pPr>
+            <w:r>
+              <w:rPr>
+                <w:b/>
+                <w:bCs/>
+                <w:color w:val="4659A7"/>
+              </w:rPr>
+              <w:t xml:space="preserve">3  </w:t>
+            </w:r>
+            <w:r>
+              <w:t xml:space="preserve">The terminal receives and displays the result.</w:t>
+            </w:r>
+          </w:p>
+        </w:tc>
+      </w:tr>
+    </w:tbl>
     <w:tbl>
       <w:tblPr>
         <w:tblW w:type="pct" w:w="100%"/>
@@ -1256,147 +1352,195 @@
         <w:t xml:space="preserve">—a ready-made action supplied by Python. The round brackets call that action. The quotes mark text. The exclamation mark and comma inside the quotes are ordinary characters, so Python displays them too.</w:t>
       </w:r>
     </w:p>
-    <w:p>
-      <w:pPr>
-        <w:jc w:val="center"/>
-      </w:pPr>
-      <w:r>
-        <w:drawing>
-          <wp:inline distT="0" distB="0" distL="0" distR="0">
-            <wp:extent cx="5334000" cy="3552825"/>
-            <wp:effectExtent t="0" r="0" b="0" l="0"/>
-            <wp:docPr id="1" name="Numbered callouts identify the function name, brackets, quotes and text value in print(&quot;Hello&quot;)." descr="Numbered callouts identify the function name, brackets, quotes and text value in print(&quot;Hello&quot;)." title="Numbered callouts identify the function name, brackets, quotes and text value in print(&quot;Hello&quot;)."/>
-            <wp:cNvGraphicFramePr>
-              <a:graphicFrameLocks xmlns:a="http://schemas.openxmlformats.org/drawingml/2006/main" noChangeAspect="1"/>
-            </wp:cNvGraphicFramePr>
-            <a:graphic xmlns:a="http://schemas.openxmlformats.org/drawingml/2006/main">
-              <a:graphicData uri="http://schemas.openxmlformats.org/drawingml/2006/picture">
-                <pic:pic xmlns:pic="http://schemas.openxmlformats.org/drawingml/2006/picture">
-                  <pic:nvPicPr>
-                    <pic:cNvPr id="0" name="" descr=""/>
-                    <pic:cNvPicPr>
-                      <a:picLocks noChangeAspect="1" noChangeArrowheads="1"/>
-                    </pic:cNvPicPr>
-                  </pic:nvPicPr>
-                  <pic:blipFill>
-                    <a:blip r:embed="rId12" cstate="none"/>
-                    <a:srcRect/>
-                    <a:stretch>
-                      <a:fillRect/>
-                    </a:stretch>
-                  </pic:blipFill>
-                  <pic:spPr bwMode="auto">
-                    <a:xfrm>
-                      <a:off x="0" y="0"/>
-                      <a:ext cx="5334000" cy="3552825"/>
-                    </a:xfrm>
-                    <a:prstGeom prst="rect">
-                      <a:avLst/>
-                    </a:prstGeom>
-                  </pic:spPr>
-                </pic:pic>
-              </a:graphicData>
-            </a:graphic>
-          </wp:inline>
-        </w:drawing>
-      </w:r>
-    </w:p>
-    <w:p>
-      <w:pPr>
-        <w:spacing w:after="120" w:line="300"/>
-        <w:jc w:val="center"/>
-      </w:pPr>
-      <w:r>
-        <w:rPr>
-          <w:i/>
-          <w:iCs/>
-          <w:color w:val="5B6575"/>
-          <w:sz w:val="19"/>
-          <w:szCs w:val="19"/>
-        </w:rPr>
-        <w:t xml:space="preserve">One short line contains four different jobs.</w:t>
-      </w:r>
-    </w:p>
-    <w:p>
-      <w:pPr>
-        <w:spacing w:after="120" w:line="300"/>
-      </w:pPr>
-      <w:r>
-        <w:rPr>
-          <w:b/>
-          <w:bCs/>
-          <w:color w:val="4659A7"/>
-        </w:rPr>
-        <w:t xml:space="preserve">1  </w:t>
-      </w:r>
-      <w:r>
-        <w:rPr>
-          <w:rFonts w:ascii="Consolas" w:cs="Consolas" w:eastAsia="Consolas" w:hAnsi="Consolas"/>
-          <w:color w:val="4659A7"/>
-          <w:shd w:fill="EEF1FA" w:val="clear"/>
-        </w:rPr>
-        <w:t xml:space="preserve">print</w:t>
-      </w:r>
-      <w:r>
-        <w:t xml:space="preserve"> names the ready-made action.</w:t>
-      </w:r>
-    </w:p>
-    <w:p>
-      <w:pPr>
-        <w:spacing w:after="120" w:line="300"/>
-      </w:pPr>
-      <w:r>
-        <w:rPr>
-          <w:b/>
-          <w:bCs/>
-          <w:color w:val="4659A7"/>
-        </w:rPr>
-        <w:t xml:space="preserve">2  </w:t>
-      </w:r>
-      <w:r>
-        <w:t xml:space="preserve">The round brackets call that action.</w:t>
-      </w:r>
-    </w:p>
-    <w:p>
-      <w:pPr>
-        <w:spacing w:after="120" w:line="300"/>
-      </w:pPr>
-      <w:r>
-        <w:rPr>
-          <w:b/>
-          <w:bCs/>
-          <w:color w:val="4659A7"/>
-        </w:rPr>
-        <w:t xml:space="preserve">3  </w:t>
-      </w:r>
-      <w:r>
-        <w:t xml:space="preserve">The quotes mark where the text begins and ends.</w:t>
-      </w:r>
-    </w:p>
-    <w:p>
-      <w:pPr>
-        <w:spacing w:after="120" w:line="300"/>
-      </w:pPr>
-      <w:r>
-        <w:rPr>
-          <w:b/>
-          <w:bCs/>
-          <w:color w:val="4659A7"/>
-        </w:rPr>
-        <w:t xml:space="preserve">4  </w:t>
-      </w:r>
-      <w:r>
-        <w:rPr>
-          <w:rFonts w:ascii="Consolas" w:cs="Consolas" w:eastAsia="Consolas" w:hAnsi="Consolas"/>
-          <w:color w:val="4659A7"/>
-          <w:shd w:fill="EEF1FA" w:val="clear"/>
-        </w:rPr>
-        <w:t xml:space="preserve">Hello</w:t>
-      </w:r>
-      <w:r>
-        <w:t xml:space="preserve"> is the value given to print().</w:t>
-      </w:r>
-    </w:p>
+    <w:tbl>
+      <w:tblPr>
+        <w:tblW w:type="pct" w:w="100%"/>
+        <w:tblBorders>
+          <w:top w:val="single" w:color="auto" w:sz="4"/>
+          <w:left w:val="single" w:color="auto" w:sz="4"/>
+          <w:bottom w:val="single" w:color="auto" w:sz="4"/>
+          <w:right w:val="single" w:color="auto" w:sz="4"/>
+          <w:insideH w:val="single" w:color="auto" w:sz="4"/>
+          <w:insideV w:val="single" w:color="auto" w:sz="4"/>
+        </w:tblBorders>
+      </w:tblPr>
+      <w:tblGrid>
+        <w:gridCol w:w="100"/>
+      </w:tblGrid>
+      <w:tr>
+        <w:tc>
+          <w:tcPr>
+            <w:tcBorders>
+              <w:top w:val="single" w:color="D9E0EA" w:sz="2"/>
+              <w:left w:val="single" w:color="D9E0EA" w:sz="2"/>
+              <w:bottom w:val="single" w:color="D9E0EA" w:sz="2"/>
+              <w:right w:val="single" w:color="D9E0EA" w:sz="2"/>
+            </w:tcBorders>
+            <w:shd w:fill="F8FAFC" w:val="clear"/>
+            <w:tcMar>
+              <w:top w:type="dxa" w:w="130"/>
+              <w:left w:type="dxa" w:w="160"/>
+              <w:bottom w:type="dxa" w:w="130"/>
+              <w:right w:type="dxa" w:w="160"/>
+            </w:tcMar>
+          </w:tcPr>
+          <w:p>
+            <w:pPr>
+              <w:spacing w:after="120" w:line="300"/>
+            </w:pPr>
+            <w:r>
+              <w:rPr>
+                <w:b/>
+                <w:bCs/>
+                <w:color w:val="263A67"/>
+              </w:rPr>
+              <w:t xml:space="preserve">ARCHITECTURAL BLUEPRINT</w:t>
+            </w:r>
+          </w:p>
+          <w:p>
+            <w:pPr>
+              <w:jc w:val="center"/>
+            </w:pPr>
+            <w:r>
+              <w:drawing>
+                <wp:inline distT="0" distB="0" distL="0" distR="0">
+                  <wp:extent cx="5334000" cy="3552825"/>
+                  <wp:effectExtent t="0" r="0" b="0" l="0"/>
+                  <wp:docPr id="1" name="Numbered callouts identify the function name, brackets, quotes and text value in print(&quot;Hello&quot;)." descr="Numbered callouts identify the function name, brackets, quotes and text value in print(&quot;Hello&quot;)." title="Numbered callouts identify the function name, brackets, quotes and text value in print(&quot;Hello&quot;)."/>
+                  <wp:cNvGraphicFramePr>
+                    <a:graphicFrameLocks xmlns:a="http://schemas.openxmlformats.org/drawingml/2006/main" noChangeAspect="1"/>
+                  </wp:cNvGraphicFramePr>
+                  <a:graphic xmlns:a="http://schemas.openxmlformats.org/drawingml/2006/main">
+                    <a:graphicData uri="http://schemas.openxmlformats.org/drawingml/2006/picture">
+                      <pic:pic xmlns:pic="http://schemas.openxmlformats.org/drawingml/2006/picture">
+                        <pic:nvPicPr>
+                          <pic:cNvPr id="0" name="" descr=""/>
+                          <pic:cNvPicPr>
+                            <a:picLocks noChangeAspect="1" noChangeArrowheads="1"/>
+                          </pic:cNvPicPr>
+                        </pic:nvPicPr>
+                        <pic:blipFill>
+                          <a:blip r:embed="rId12" cstate="none"/>
+                          <a:srcRect/>
+                          <a:stretch>
+                            <a:fillRect/>
+                          </a:stretch>
+                        </pic:blipFill>
+                        <pic:spPr bwMode="auto">
+                          <a:xfrm>
+                            <a:off x="0" y="0"/>
+                            <a:ext cx="5334000" cy="3552825"/>
+                          </a:xfrm>
+                          <a:prstGeom prst="rect">
+                            <a:avLst/>
+                          </a:prstGeom>
+                        </pic:spPr>
+                      </pic:pic>
+                    </a:graphicData>
+                  </a:graphic>
+                </wp:inline>
+              </w:drawing>
+            </w:r>
+          </w:p>
+          <w:p>
+            <w:pPr>
+              <w:spacing w:after="120" w:line="300"/>
+              <w:jc w:val="center"/>
+            </w:pPr>
+            <w:r>
+              <w:rPr>
+                <w:i/>
+                <w:iCs/>
+                <w:color w:val="5B6575"/>
+                <w:sz w:val="19"/>
+                <w:szCs w:val="19"/>
+              </w:rPr>
+              <w:t xml:space="preserve">One short line contains four different jobs.</w:t>
+            </w:r>
+          </w:p>
+          <w:p>
+            <w:pPr>
+              <w:spacing w:after="120" w:line="300"/>
+            </w:pPr>
+            <w:r>
+              <w:rPr>
+                <w:b/>
+                <w:bCs/>
+                <w:color w:val="4659A7"/>
+              </w:rPr>
+              <w:t xml:space="preserve">1  </w:t>
+            </w:r>
+            <w:r>
+              <w:rPr>
+                <w:rFonts w:ascii="Consolas" w:cs="Consolas" w:eastAsia="Consolas" w:hAnsi="Consolas"/>
+                <w:color w:val="4659A7"/>
+                <w:shd w:fill="EEF1FA" w:val="clear"/>
+              </w:rPr>
+              <w:t xml:space="preserve">print</w:t>
+            </w:r>
+            <w:r>
+              <w:t xml:space="preserve"> names the ready-made action.</w:t>
+            </w:r>
+          </w:p>
+          <w:p>
+            <w:pPr>
+              <w:spacing w:after="120" w:line="300"/>
+            </w:pPr>
+            <w:r>
+              <w:rPr>
+                <w:b/>
+                <w:bCs/>
+                <w:color w:val="4659A7"/>
+              </w:rPr>
+              <w:t xml:space="preserve">2  </w:t>
+            </w:r>
+            <w:r>
+              <w:t xml:space="preserve">The round brackets call that action.</w:t>
+            </w:r>
+          </w:p>
+          <w:p>
+            <w:pPr>
+              <w:spacing w:after="120" w:line="300"/>
+            </w:pPr>
+            <w:r>
+              <w:rPr>
+                <w:b/>
+                <w:bCs/>
+                <w:color w:val="4659A7"/>
+              </w:rPr>
+              <w:t xml:space="preserve">3  </w:t>
+            </w:r>
+            <w:r>
+              <w:t xml:space="preserve">The quotes mark where the text begins and ends.</w:t>
+            </w:r>
+          </w:p>
+          <w:p>
+            <w:pPr>
+              <w:spacing w:after="120" w:line="300"/>
+            </w:pPr>
+            <w:r>
+              <w:rPr>
+                <w:b/>
+                <w:bCs/>
+                <w:color w:val="4659A7"/>
+              </w:rPr>
+              <w:t xml:space="preserve">4  </w:t>
+            </w:r>
+            <w:r>
+              <w:rPr>
+                <w:rFonts w:ascii="Consolas" w:cs="Consolas" w:eastAsia="Consolas" w:hAnsi="Consolas"/>
+                <w:color w:val="4659A7"/>
+                <w:shd w:fill="EEF1FA" w:val="clear"/>
+              </w:rPr>
+              <w:t xml:space="preserve">Hello</w:t>
+            </w:r>
+            <w:r>
+              <w:t xml:space="preserve"> is the value given to print().</w:t>
+            </w:r>
+          </w:p>
+        </w:tc>
+      </w:tr>
+    </w:tbl>
     <w:p>
       <w:pPr>
         <w:pStyle w:val="Heading2"/>
@@ -2996,7 +3140,7 @@
       </w:r>
     </w:p>
     <w:p>
-      <w:hyperlink w:history="1" r:id="rIdyiq7x2uc_jklpomku1j7o">
+      <w:hyperlink w:history="1" r:id="rIdnuhvsp8yhkzyjldzonmfl">
         <w:r>
           <w:rPr>
             <w:rStyle w:val="Hyperlink"/>
@@ -3014,7 +3158,7 @@
       </w:r>
     </w:p>
     <w:p>
-      <w:hyperlink w:history="1" r:id="rIdieendnzp3on991lkm9mzz">
+      <w:hyperlink w:history="1" r:id="rIdnurj_1_zbtwfs8enmylvu">
         <w:r>
           <w:rPr>
             <w:rStyle w:val="Hyperlink"/>
@@ -3114,131 +3258,179 @@
         <w:t xml:space="preserve">Follow one tiny message from our file to the screen. No hidden knowledge required.</w:t>
       </w:r>
     </w:p>
-    <w:p>
-      <w:pPr>
-        <w:jc w:val="center"/>
-      </w:pPr>
-      <w:r>
-        <w:drawing>
-          <wp:inline distT="0" distB="0" distL="0" distR="0">
-            <wp:extent cx="5334000" cy="3552825"/>
-            <wp:effectExtent t="0" r="0" b="0" l="0"/>
-            <wp:docPr id="1" name="Three simple routes lead from a code file to a computer chip." descr="Three simple routes lead from a code file to a computer chip." title="Three simple routes lead from a code file to a computer chip."/>
-            <wp:cNvGraphicFramePr>
-              <a:graphicFrameLocks xmlns:a="http://schemas.openxmlformats.org/drawingml/2006/main" noChangeAspect="1"/>
-            </wp:cNvGraphicFramePr>
-            <a:graphic xmlns:a="http://schemas.openxmlformats.org/drawingml/2006/main">
-              <a:graphicData uri="http://schemas.openxmlformats.org/drawingml/2006/picture">
-                <pic:pic xmlns:pic="http://schemas.openxmlformats.org/drawingml/2006/picture">
-                  <pic:nvPicPr>
-                    <pic:cNvPr id="0" name="" descr=""/>
-                    <pic:cNvPicPr>
-                      <a:picLocks noChangeAspect="1" noChangeArrowheads="1"/>
-                    </pic:cNvPicPr>
-                  </pic:nvPicPr>
-                  <pic:blipFill>
-                    <a:blip r:embed="rId13" cstate="none"/>
-                    <a:srcRect/>
-                    <a:stretch>
-                      <a:fillRect/>
-                    </a:stretch>
-                  </pic:blipFill>
-                  <pic:spPr bwMode="auto">
-                    <a:xfrm>
-                      <a:off x="0" y="0"/>
-                      <a:ext cx="5334000" cy="3552825"/>
-                    </a:xfrm>
-                    <a:prstGeom prst="rect">
-                      <a:avLst/>
-                    </a:prstGeom>
-                  </pic:spPr>
-                </pic:pic>
-              </a:graphicData>
-            </a:graphic>
-          </wp:inline>
-        </w:drawing>
-      </w:r>
-    </w:p>
-    <w:p>
-      <w:pPr>
-        <w:spacing w:after="120" w:line="300"/>
-        <w:jc w:val="center"/>
-      </w:pPr>
-      <w:r>
-        <w:rPr>
-          <w:i/>
-          <w:iCs/>
-          <w:color w:val="5B6575"/>
-          <w:sz w:val="19"/>
-          <w:szCs w:val="19"/>
-        </w:rPr>
-        <w:t xml:space="preserve">Different routes solve the same translation problem.</w:t>
-      </w:r>
-    </w:p>
-    <w:p>
-      <w:pPr>
-        <w:spacing w:after="120" w:line="300"/>
-      </w:pPr>
-      <w:r>
-        <w:rPr>
-          <w:b/>
-          <w:bCs/>
-          <w:color w:val="4659A7"/>
-        </w:rPr>
-        <w:t xml:space="preserve">1  </w:t>
-      </w:r>
-      <w:r>
-        <w:t xml:space="preserve">A person writes a source file.</w:t>
-      </w:r>
-    </w:p>
-    <w:p>
-      <w:pPr>
-        <w:spacing w:after="120" w:line="300"/>
-      </w:pPr>
-      <w:r>
-        <w:rPr>
-          <w:b/>
-          <w:bCs/>
-          <w:color w:val="4659A7"/>
-        </w:rPr>
-        <w:t xml:space="preserve">2  </w:t>
-      </w:r>
-      <w:r>
-        <w:t xml:space="preserve">A language tool prepares the instructions.</w:t>
-      </w:r>
-    </w:p>
-    <w:p>
-      <w:pPr>
-        <w:spacing w:after="120" w:line="300"/>
-      </w:pPr>
-      <w:r>
-        <w:rPr>
-          <w:b/>
-          <w:bCs/>
-          <w:color w:val="4659A7"/>
-        </w:rPr>
-        <w:t xml:space="preserve">3  </w:t>
-      </w:r>
-      <w:r>
-        <w:t xml:space="preserve">The processor performs machine work.</w:t>
-      </w:r>
-    </w:p>
-    <w:p>
-      <w:pPr>
-        <w:spacing w:after="120" w:line="300"/>
-      </w:pPr>
-      <w:r>
-        <w:rPr>
-          <w:b/>
-          <w:bCs/>
-          <w:color w:val="4659A7"/>
-        </w:rPr>
-        <w:t xml:space="preserve">4  </w:t>
-      </w:r>
-      <w:r>
-        <w:t xml:space="preserve">The program produces a result we can see.</w:t>
-      </w:r>
-    </w:p>
+    <w:tbl>
+      <w:tblPr>
+        <w:tblW w:type="pct" w:w="100%"/>
+        <w:tblBorders>
+          <w:top w:val="single" w:color="auto" w:sz="4"/>
+          <w:left w:val="single" w:color="auto" w:sz="4"/>
+          <w:bottom w:val="single" w:color="auto" w:sz="4"/>
+          <w:right w:val="single" w:color="auto" w:sz="4"/>
+          <w:insideH w:val="single" w:color="auto" w:sz="4"/>
+          <w:insideV w:val="single" w:color="auto" w:sz="4"/>
+        </w:tblBorders>
+      </w:tblPr>
+      <w:tblGrid>
+        <w:gridCol w:w="100"/>
+      </w:tblGrid>
+      <w:tr>
+        <w:tc>
+          <w:tcPr>
+            <w:tcBorders>
+              <w:top w:val="single" w:color="D9E0EA" w:sz="2"/>
+              <w:left w:val="single" w:color="D9E0EA" w:sz="2"/>
+              <w:bottom w:val="single" w:color="D9E0EA" w:sz="2"/>
+              <w:right w:val="single" w:color="D9E0EA" w:sz="2"/>
+            </w:tcBorders>
+            <w:shd w:fill="F8FAFC" w:val="clear"/>
+            <w:tcMar>
+              <w:top w:type="dxa" w:w="130"/>
+              <w:left w:type="dxa" w:w="160"/>
+              <w:bottom w:type="dxa" w:w="130"/>
+              <w:right w:type="dxa" w:w="160"/>
+            </w:tcMar>
+          </w:tcPr>
+          <w:p>
+            <w:pPr>
+              <w:spacing w:after="120" w:line="300"/>
+            </w:pPr>
+            <w:r>
+              <w:rPr>
+                <w:b/>
+                <w:bCs/>
+                <w:color w:val="263A67"/>
+              </w:rPr>
+              <w:t xml:space="preserve">ARCHITECTURAL BLUEPRINT</w:t>
+            </w:r>
+          </w:p>
+          <w:p>
+            <w:pPr>
+              <w:jc w:val="center"/>
+            </w:pPr>
+            <w:r>
+              <w:drawing>
+                <wp:inline distT="0" distB="0" distL="0" distR="0">
+                  <wp:extent cx="5334000" cy="3552825"/>
+                  <wp:effectExtent t="0" r="0" b="0" l="0"/>
+                  <wp:docPr id="1" name="Three simple routes lead from a code file to a computer chip." descr="Three simple routes lead from a code file to a computer chip." title="Three simple routes lead from a code file to a computer chip."/>
+                  <wp:cNvGraphicFramePr>
+                    <a:graphicFrameLocks xmlns:a="http://schemas.openxmlformats.org/drawingml/2006/main" noChangeAspect="1"/>
+                  </wp:cNvGraphicFramePr>
+                  <a:graphic xmlns:a="http://schemas.openxmlformats.org/drawingml/2006/main">
+                    <a:graphicData uri="http://schemas.openxmlformats.org/drawingml/2006/picture">
+                      <pic:pic xmlns:pic="http://schemas.openxmlformats.org/drawingml/2006/picture">
+                        <pic:nvPicPr>
+                          <pic:cNvPr id="0" name="" descr=""/>
+                          <pic:cNvPicPr>
+                            <a:picLocks noChangeAspect="1" noChangeArrowheads="1"/>
+                          </pic:cNvPicPr>
+                        </pic:nvPicPr>
+                        <pic:blipFill>
+                          <a:blip r:embed="rId13" cstate="none"/>
+                          <a:srcRect/>
+                          <a:stretch>
+                            <a:fillRect/>
+                          </a:stretch>
+                        </pic:blipFill>
+                        <pic:spPr bwMode="auto">
+                          <a:xfrm>
+                            <a:off x="0" y="0"/>
+                            <a:ext cx="5334000" cy="3552825"/>
+                          </a:xfrm>
+                          <a:prstGeom prst="rect">
+                            <a:avLst/>
+                          </a:prstGeom>
+                        </pic:spPr>
+                      </pic:pic>
+                    </a:graphicData>
+                  </a:graphic>
+                </wp:inline>
+              </w:drawing>
+            </w:r>
+          </w:p>
+          <w:p>
+            <w:pPr>
+              <w:spacing w:after="120" w:line="300"/>
+              <w:jc w:val="center"/>
+            </w:pPr>
+            <w:r>
+              <w:rPr>
+                <w:i/>
+                <w:iCs/>
+                <w:color w:val="5B6575"/>
+                <w:sz w:val="19"/>
+                <w:szCs w:val="19"/>
+              </w:rPr>
+              <w:t xml:space="preserve">Different routes solve the same translation problem.</w:t>
+            </w:r>
+          </w:p>
+          <w:p>
+            <w:pPr>
+              <w:spacing w:after="120" w:line="300"/>
+            </w:pPr>
+            <w:r>
+              <w:rPr>
+                <w:b/>
+                <w:bCs/>
+                <w:color w:val="4659A7"/>
+              </w:rPr>
+              <w:t xml:space="preserve">1  </w:t>
+            </w:r>
+            <w:r>
+              <w:t xml:space="preserve">A person writes a source file.</w:t>
+            </w:r>
+          </w:p>
+          <w:p>
+            <w:pPr>
+              <w:spacing w:after="120" w:line="300"/>
+            </w:pPr>
+            <w:r>
+              <w:rPr>
+                <w:b/>
+                <w:bCs/>
+                <w:color w:val="4659A7"/>
+              </w:rPr>
+              <w:t xml:space="preserve">2  </w:t>
+            </w:r>
+            <w:r>
+              <w:t xml:space="preserve">A language tool prepares the instructions.</w:t>
+            </w:r>
+          </w:p>
+          <w:p>
+            <w:pPr>
+              <w:spacing w:after="120" w:line="300"/>
+            </w:pPr>
+            <w:r>
+              <w:rPr>
+                <w:b/>
+                <w:bCs/>
+                <w:color w:val="4659A7"/>
+              </w:rPr>
+              <w:t xml:space="preserve">3  </w:t>
+            </w:r>
+            <w:r>
+              <w:t xml:space="preserve">The processor performs machine work.</w:t>
+            </w:r>
+          </w:p>
+          <w:p>
+            <w:pPr>
+              <w:spacing w:after="120" w:line="300"/>
+            </w:pPr>
+            <w:r>
+              <w:rPr>
+                <w:b/>
+                <w:bCs/>
+                <w:color w:val="4659A7"/>
+              </w:rPr>
+              <w:t xml:space="preserve">4  </w:t>
+            </w:r>
+            <w:r>
+              <w:t xml:space="preserve">The program produces a result we can see.</w:t>
+            </w:r>
+          </w:p>
+        </w:tc>
+      </w:tr>
+    </w:tbl>
     <w:tbl>
       <w:tblPr>
         <w:tblW w:type="pct" w:w="100%"/>
@@ -3571,152 +3763,200 @@
         <w:t xml:space="preserve">.</w:t>
       </w:r>
     </w:p>
-    <w:p>
-      <w:pPr>
-        <w:jc w:val="center"/>
-      </w:pPr>
-      <w:r>
-        <w:drawing>
-          <wp:inline distT="0" distB="0" distL="0" distR="0">
-            <wp:extent cx="5334000" cy="3552825"/>
-            <wp:effectExtent t="0" r="0" b="0" l="0"/>
-            <wp:docPr id="1" name="Four numbered stages show a Python file being checked, changed into smaller instructions and run to display Hello." descr="Four numbered stages show a Python file being checked, changed into smaller instructions and run to display Hello." title="Four numbered stages show a Python file being checked, changed into smaller instructions and run to display Hello."/>
-            <wp:cNvGraphicFramePr>
-              <a:graphicFrameLocks xmlns:a="http://schemas.openxmlformats.org/drawingml/2006/main" noChangeAspect="1"/>
-            </wp:cNvGraphicFramePr>
-            <a:graphic xmlns:a="http://schemas.openxmlformats.org/drawingml/2006/main">
-              <a:graphicData uri="http://schemas.openxmlformats.org/drawingml/2006/picture">
-                <pic:pic xmlns:pic="http://schemas.openxmlformats.org/drawingml/2006/picture">
-                  <pic:nvPicPr>
-                    <pic:cNvPr id="0" name="" descr=""/>
-                    <pic:cNvPicPr>
-                      <a:picLocks noChangeAspect="1" noChangeArrowheads="1"/>
-                    </pic:cNvPicPr>
-                  </pic:nvPicPr>
-                  <pic:blipFill>
-                    <a:blip r:embed="rId14" cstate="none"/>
-                    <a:srcRect/>
-                    <a:stretch>
-                      <a:fillRect/>
-                    </a:stretch>
-                  </pic:blipFill>
-                  <pic:spPr bwMode="auto">
-                    <a:xfrm>
-                      <a:off x="0" y="0"/>
-                      <a:ext cx="5334000" cy="3552825"/>
-                    </a:xfrm>
-                    <a:prstGeom prst="rect">
-                      <a:avLst/>
-                    </a:prstGeom>
-                  </pic:spPr>
-                </pic:pic>
-              </a:graphicData>
-            </a:graphic>
-          </wp:inline>
-        </w:drawing>
-      </w:r>
-    </w:p>
-    <w:p>
-      <w:pPr>
-        <w:spacing w:after="120" w:line="300"/>
-        <w:jc w:val="center"/>
-      </w:pPr>
-      <w:r>
-        <w:rPr>
-          <w:i/>
-          <w:iCs/>
-          <w:color w:val="5B6575"/>
-          <w:sz w:val="19"/>
-          <w:szCs w:val="19"/>
-        </w:rPr>
-        <w:t xml:space="preserve">Python handles the hidden middle steps for us.</w:t>
-      </w:r>
-    </w:p>
-    <w:p>
-      <w:pPr>
-        <w:spacing w:after="120" w:line="300"/>
-      </w:pPr>
-      <w:r>
-        <w:rPr>
-          <w:b/>
-          <w:bCs/>
-          <w:color w:val="4659A7"/>
-        </w:rPr>
-        <w:t xml:space="preserve">1  </w:t>
-      </w:r>
-      <w:r>
-        <w:t xml:space="preserve">Start with the source file we wrote.</w:t>
-      </w:r>
-    </w:p>
-    <w:p>
-      <w:pPr>
-        <w:spacing w:after="120" w:line="300"/>
-      </w:pPr>
-      <w:r>
-        <w:rPr>
-          <w:b/>
-          <w:bCs/>
-          <w:color w:val="4659A7"/>
-        </w:rPr>
-        <w:t xml:space="preserve">2  </w:t>
-      </w:r>
-      <w:r>
-        <w:t xml:space="preserve">Python checks whether the code follows its rules.</w:t>
-      </w:r>
-    </w:p>
-    <w:p>
-      <w:pPr>
-        <w:spacing w:after="120" w:line="300"/>
-      </w:pPr>
-      <w:r>
-        <w:rPr>
-          <w:b/>
-          <w:bCs/>
-          <w:color w:val="4659A7"/>
-        </w:rPr>
-        <w:t xml:space="preserve">3  </w:t>
-      </w:r>
-      <w:r>
-        <w:t xml:space="preserve">Python prepares smaller instructions called </w:t>
-      </w:r>
-      <w:r>
-        <w:rPr>
-          <w:b/>
-          <w:bCs/>
-        </w:rPr>
-        <w:t xml:space="preserve">bytecode</w:t>
-      </w:r>
-      <w:r>
-        <w:t xml:space="preserve">.</w:t>
-      </w:r>
-    </w:p>
-    <w:p>
-      <w:pPr>
-        <w:spacing w:after="120" w:line="300"/>
-      </w:pPr>
-      <w:r>
-        <w:rPr>
-          <w:b/>
-          <w:bCs/>
-          <w:color w:val="4659A7"/>
-        </w:rPr>
-        <w:t xml:space="preserve">4  </w:t>
-      </w:r>
-      <w:r>
-        <w:t xml:space="preserve">The Python runtime follows them and </w:t>
-      </w:r>
-      <w:r>
-        <w:rPr>
-          <w:rFonts w:ascii="Consolas" w:cs="Consolas" w:eastAsia="Consolas" w:hAnsi="Consolas"/>
-          <w:color w:val="4659A7"/>
-          <w:shd w:fill="EEF1FA" w:val="clear"/>
-        </w:rPr>
-        <w:t xml:space="preserve">Hello</w:t>
-      </w:r>
-      <w:r>
-        <w:t xml:space="preserve"> reaches the terminal.</w:t>
-      </w:r>
-    </w:p>
+    <w:tbl>
+      <w:tblPr>
+        <w:tblW w:type="pct" w:w="100%"/>
+        <w:tblBorders>
+          <w:top w:val="single" w:color="auto" w:sz="4"/>
+          <w:left w:val="single" w:color="auto" w:sz="4"/>
+          <w:bottom w:val="single" w:color="auto" w:sz="4"/>
+          <w:right w:val="single" w:color="auto" w:sz="4"/>
+          <w:insideH w:val="single" w:color="auto" w:sz="4"/>
+          <w:insideV w:val="single" w:color="auto" w:sz="4"/>
+        </w:tblBorders>
+      </w:tblPr>
+      <w:tblGrid>
+        <w:gridCol w:w="100"/>
+      </w:tblGrid>
+      <w:tr>
+        <w:tc>
+          <w:tcPr>
+            <w:tcBorders>
+              <w:top w:val="single" w:color="D9E0EA" w:sz="2"/>
+              <w:left w:val="single" w:color="D9E0EA" w:sz="2"/>
+              <w:bottom w:val="single" w:color="D9E0EA" w:sz="2"/>
+              <w:right w:val="single" w:color="D9E0EA" w:sz="2"/>
+            </w:tcBorders>
+            <w:shd w:fill="F8FAFC" w:val="clear"/>
+            <w:tcMar>
+              <w:top w:type="dxa" w:w="130"/>
+              <w:left w:type="dxa" w:w="160"/>
+              <w:bottom w:type="dxa" w:w="130"/>
+              <w:right w:type="dxa" w:w="160"/>
+            </w:tcMar>
+          </w:tcPr>
+          <w:p>
+            <w:pPr>
+              <w:spacing w:after="120" w:line="300"/>
+            </w:pPr>
+            <w:r>
+              <w:rPr>
+                <w:b/>
+                <w:bCs/>
+                <w:color w:val="263A67"/>
+              </w:rPr>
+              <w:t xml:space="preserve">ARCHITECTURAL BLUEPRINT</w:t>
+            </w:r>
+          </w:p>
+          <w:p>
+            <w:pPr>
+              <w:jc w:val="center"/>
+            </w:pPr>
+            <w:r>
+              <w:drawing>
+                <wp:inline distT="0" distB="0" distL="0" distR="0">
+                  <wp:extent cx="5334000" cy="3552825"/>
+                  <wp:effectExtent t="0" r="0" b="0" l="0"/>
+                  <wp:docPr id="1" name="Four numbered stages show a Python file being checked, changed into smaller instructions and run to display Hello." descr="Four numbered stages show a Python file being checked, changed into smaller instructions and run to display Hello." title="Four numbered stages show a Python file being checked, changed into smaller instructions and run to display Hello."/>
+                  <wp:cNvGraphicFramePr>
+                    <a:graphicFrameLocks xmlns:a="http://schemas.openxmlformats.org/drawingml/2006/main" noChangeAspect="1"/>
+                  </wp:cNvGraphicFramePr>
+                  <a:graphic xmlns:a="http://schemas.openxmlformats.org/drawingml/2006/main">
+                    <a:graphicData uri="http://schemas.openxmlformats.org/drawingml/2006/picture">
+                      <pic:pic xmlns:pic="http://schemas.openxmlformats.org/drawingml/2006/picture">
+                        <pic:nvPicPr>
+                          <pic:cNvPr id="0" name="" descr=""/>
+                          <pic:cNvPicPr>
+                            <a:picLocks noChangeAspect="1" noChangeArrowheads="1"/>
+                          </pic:cNvPicPr>
+                        </pic:nvPicPr>
+                        <pic:blipFill>
+                          <a:blip r:embed="rId14" cstate="none"/>
+                          <a:srcRect/>
+                          <a:stretch>
+                            <a:fillRect/>
+                          </a:stretch>
+                        </pic:blipFill>
+                        <pic:spPr bwMode="auto">
+                          <a:xfrm>
+                            <a:off x="0" y="0"/>
+                            <a:ext cx="5334000" cy="3552825"/>
+                          </a:xfrm>
+                          <a:prstGeom prst="rect">
+                            <a:avLst/>
+                          </a:prstGeom>
+                        </pic:spPr>
+                      </pic:pic>
+                    </a:graphicData>
+                  </a:graphic>
+                </wp:inline>
+              </w:drawing>
+            </w:r>
+          </w:p>
+          <w:p>
+            <w:pPr>
+              <w:spacing w:after="120" w:line="300"/>
+              <w:jc w:val="center"/>
+            </w:pPr>
+            <w:r>
+              <w:rPr>
+                <w:i/>
+                <w:iCs/>
+                <w:color w:val="5B6575"/>
+                <w:sz w:val="19"/>
+                <w:szCs w:val="19"/>
+              </w:rPr>
+              <w:t xml:space="preserve">Python handles the hidden middle steps for us.</w:t>
+            </w:r>
+          </w:p>
+          <w:p>
+            <w:pPr>
+              <w:spacing w:after="120" w:line="300"/>
+            </w:pPr>
+            <w:r>
+              <w:rPr>
+                <w:b/>
+                <w:bCs/>
+                <w:color w:val="4659A7"/>
+              </w:rPr>
+              <w:t xml:space="preserve">1  </w:t>
+            </w:r>
+            <w:r>
+              <w:t xml:space="preserve">Start with the source file we wrote.</w:t>
+            </w:r>
+          </w:p>
+          <w:p>
+            <w:pPr>
+              <w:spacing w:after="120" w:line="300"/>
+            </w:pPr>
+            <w:r>
+              <w:rPr>
+                <w:b/>
+                <w:bCs/>
+                <w:color w:val="4659A7"/>
+              </w:rPr>
+              <w:t xml:space="preserve">2  </w:t>
+            </w:r>
+            <w:r>
+              <w:t xml:space="preserve">Python checks whether the code follows its rules.</w:t>
+            </w:r>
+          </w:p>
+          <w:p>
+            <w:pPr>
+              <w:spacing w:after="120" w:line="300"/>
+            </w:pPr>
+            <w:r>
+              <w:rPr>
+                <w:b/>
+                <w:bCs/>
+                <w:color w:val="4659A7"/>
+              </w:rPr>
+              <w:t xml:space="preserve">3  </w:t>
+            </w:r>
+            <w:r>
+              <w:t xml:space="preserve">Python prepares smaller instructions called </w:t>
+            </w:r>
+            <w:r>
+              <w:rPr>
+                <w:b/>
+                <w:bCs/>
+              </w:rPr>
+              <w:t xml:space="preserve">bytecode</w:t>
+            </w:r>
+            <w:r>
+              <w:t xml:space="preserve">.</w:t>
+            </w:r>
+          </w:p>
+          <w:p>
+            <w:pPr>
+              <w:spacing w:after="120" w:line="300"/>
+            </w:pPr>
+            <w:r>
+              <w:rPr>
+                <w:b/>
+                <w:bCs/>
+                <w:color w:val="4659A7"/>
+              </w:rPr>
+              <w:t xml:space="preserve">4  </w:t>
+            </w:r>
+            <w:r>
+              <w:t xml:space="preserve">The Python runtime follows them and </w:t>
+            </w:r>
+            <w:r>
+              <w:rPr>
+                <w:rFonts w:ascii="Consolas" w:cs="Consolas" w:eastAsia="Consolas" w:hAnsi="Consolas"/>
+                <w:color w:val="4659A7"/>
+                <w:shd w:fill="EEF1FA" w:val="clear"/>
+              </w:rPr>
+              <w:t xml:space="preserve">Hello</w:t>
+            </w:r>
+            <w:r>
+              <w:t xml:space="preserve"> reaches the terminal.</w:t>
+            </w:r>
+          </w:p>
+        </w:tc>
+      </w:tr>
+    </w:tbl>
     <w:tbl>
       <w:tblPr>
         <w:tblW w:type="pct" w:w="100%"/>
@@ -6787,7 +7027,7 @@
       </w:r>
     </w:p>
     <w:p>
-      <w:hyperlink w:history="1" r:id="rIdzrdyv09q_9fxq66trkcud">
+      <w:hyperlink w:history="1" r:id="rIdq6olt6avwckzysb_0r2fc">
         <w:r>
           <w:rPr>
             <w:rStyle w:val="Hyperlink"/>
@@ -6805,7 +7045,7 @@
       </w:r>
     </w:p>
     <w:p>
-      <w:hyperlink w:history="1" r:id="rIda7h8gnqqbmn-shbm-ikmw">
+      <w:hyperlink w:history="1" r:id="rIdfghakxm75-uaczkowtnbl">
         <w:r>
           <w:rPr>
             <w:rStyle w:val="Hyperlink"/>
@@ -6823,7 +7063,7 @@
       </w:r>
     </w:p>
     <w:p>
-      <w:hyperlink w:history="1" r:id="rIdr9ppmjtpidxnfurxnmtkm">
+      <w:hyperlink w:history="1" r:id="rId-nmuzf87pwc7jg47mlj8g">
         <w:r>
           <w:rPr>
             <w:rStyle w:val="Hyperlink"/>
@@ -6923,126 +7163,174 @@
         <w:t xml:space="preserve">Store a value, change it and inspect memory one line at a time.</w:t>
       </w:r>
     </w:p>
-    <w:p>
-      <w:pPr>
-        <w:jc w:val="center"/>
-      </w:pPr>
-      <w:r>
-        <w:drawing>
-          <wp:inline distT="0" distB="0" distL="0" distR="0">
-            <wp:extent cx="5334000" cy="3552825"/>
-            <wp:effectExtent t="0" r="0" b="0" l="0"/>
-            <wp:docPr id="1" name="A name tag points to memory boxes as a value changes." descr="A name tag points to memory boxes as a value changes." title="A name tag points to memory boxes as a value changes."/>
-            <wp:cNvGraphicFramePr>
-              <a:graphicFrameLocks xmlns:a="http://schemas.openxmlformats.org/drawingml/2006/main" noChangeAspect="1"/>
-            </wp:cNvGraphicFramePr>
-            <a:graphic xmlns:a="http://schemas.openxmlformats.org/drawingml/2006/main">
-              <a:graphicData uri="http://schemas.openxmlformats.org/drawingml/2006/picture">
-                <pic:pic xmlns:pic="http://schemas.openxmlformats.org/drawingml/2006/picture">
-                  <pic:nvPicPr>
-                    <pic:cNvPr id="0" name="" descr=""/>
-                    <pic:cNvPicPr>
-                      <a:picLocks noChangeAspect="1" noChangeArrowheads="1"/>
-                    </pic:cNvPicPr>
-                  </pic:nvPicPr>
-                  <pic:blipFill>
-                    <a:blip r:embed="rId15" cstate="none"/>
-                    <a:srcRect/>
-                    <a:stretch>
-                      <a:fillRect/>
-                    </a:stretch>
-                  </pic:blipFill>
-                  <pic:spPr bwMode="auto">
-                    <a:xfrm>
-                      <a:off x="0" y="0"/>
-                      <a:ext cx="5334000" cy="3552825"/>
-                    </a:xfrm>
-                    <a:prstGeom prst="rect">
-                      <a:avLst/>
-                    </a:prstGeom>
-                  </pic:spPr>
-                </pic:pic>
-              </a:graphicData>
-            </a:graphic>
-          </wp:inline>
-        </w:drawing>
-      </w:r>
-    </w:p>
-    <w:p>
-      <w:pPr>
-        <w:spacing w:after="120" w:line="300"/>
-        <w:jc w:val="center"/>
-      </w:pPr>
-      <w:r>
-        <w:rPr>
-          <w:i/>
-          <w:iCs/>
-          <w:color w:val="5B6575"/>
-          <w:sz w:val="19"/>
-          <w:szCs w:val="19"/>
-        </w:rPr>
-        <w:t xml:space="preserve">A variable name can refer to a new value.</w:t>
-      </w:r>
-    </w:p>
-    <w:p>
-      <w:pPr>
-        <w:spacing w:after="120" w:line="300"/>
-      </w:pPr>
-      <w:r>
-        <w:rPr>
-          <w:b/>
-          <w:bCs/>
-          <w:color w:val="4659A7"/>
-        </w:rPr>
-        <w:t xml:space="preserve">1  </w:t>
-      </w:r>
-      <w:r>
-        <w:t xml:space="preserve">Choose a useful name such as </w:t>
-      </w:r>
-      <w:r>
-        <w:rPr>
-          <w:rFonts w:ascii="Consolas" w:cs="Consolas" w:eastAsia="Consolas" w:hAnsi="Consolas"/>
-          <w:color w:val="4659A7"/>
-          <w:shd w:fill="EEF1FA" w:val="clear"/>
-        </w:rPr>
-        <w:t xml:space="preserve">score</w:t>
-      </w:r>
-      <w:r>
-        <w:t xml:space="preserve">.</w:t>
-      </w:r>
-    </w:p>
-    <w:p>
-      <w:pPr>
-        <w:spacing w:after="120" w:line="300"/>
-      </w:pPr>
-      <w:r>
-        <w:rPr>
-          <w:b/>
-          <w:bCs/>
-          <w:color w:val="4659A7"/>
-        </w:rPr>
-        <w:t xml:space="preserve">2  </w:t>
-      </w:r>
-      <w:r>
-        <w:t xml:space="preserve">Assign the first value to that name.</w:t>
-      </w:r>
-    </w:p>
-    <w:p>
-      <w:pPr>
-        <w:spacing w:after="120" w:line="300"/>
-      </w:pPr>
-      <w:r>
-        <w:rPr>
-          <w:b/>
-          <w:bCs/>
-          <w:color w:val="4659A7"/>
-        </w:rPr>
-        <w:t xml:space="preserve">3  </w:t>
-      </w:r>
-      <w:r>
-        <w:t xml:space="preserve">Assign again when the value changes.</w:t>
-      </w:r>
-    </w:p>
+    <w:tbl>
+      <w:tblPr>
+        <w:tblW w:type="pct" w:w="100%"/>
+        <w:tblBorders>
+          <w:top w:val="single" w:color="auto" w:sz="4"/>
+          <w:left w:val="single" w:color="auto" w:sz="4"/>
+          <w:bottom w:val="single" w:color="auto" w:sz="4"/>
+          <w:right w:val="single" w:color="auto" w:sz="4"/>
+          <w:insideH w:val="single" w:color="auto" w:sz="4"/>
+          <w:insideV w:val="single" w:color="auto" w:sz="4"/>
+        </w:tblBorders>
+      </w:tblPr>
+      <w:tblGrid>
+        <w:gridCol w:w="100"/>
+      </w:tblGrid>
+      <w:tr>
+        <w:tc>
+          <w:tcPr>
+            <w:tcBorders>
+              <w:top w:val="single" w:color="D9E0EA" w:sz="2"/>
+              <w:left w:val="single" w:color="D9E0EA" w:sz="2"/>
+              <w:bottom w:val="single" w:color="D9E0EA" w:sz="2"/>
+              <w:right w:val="single" w:color="D9E0EA" w:sz="2"/>
+            </w:tcBorders>
+            <w:shd w:fill="F8FAFC" w:val="clear"/>
+            <w:tcMar>
+              <w:top w:type="dxa" w:w="130"/>
+              <w:left w:type="dxa" w:w="160"/>
+              <w:bottom w:type="dxa" w:w="130"/>
+              <w:right w:type="dxa" w:w="160"/>
+            </w:tcMar>
+          </w:tcPr>
+          <w:p>
+            <w:pPr>
+              <w:spacing w:after="120" w:line="300"/>
+            </w:pPr>
+            <w:r>
+              <w:rPr>
+                <w:b/>
+                <w:bCs/>
+                <w:color w:val="263A67"/>
+              </w:rPr>
+              <w:t xml:space="preserve">ARCHITECTURAL BLUEPRINT</w:t>
+            </w:r>
+          </w:p>
+          <w:p>
+            <w:pPr>
+              <w:jc w:val="center"/>
+            </w:pPr>
+            <w:r>
+              <w:drawing>
+                <wp:inline distT="0" distB="0" distL="0" distR="0">
+                  <wp:extent cx="5334000" cy="3552825"/>
+                  <wp:effectExtent t="0" r="0" b="0" l="0"/>
+                  <wp:docPr id="1" name="A name tag points to memory boxes as a value changes." descr="A name tag points to memory boxes as a value changes." title="A name tag points to memory boxes as a value changes."/>
+                  <wp:cNvGraphicFramePr>
+                    <a:graphicFrameLocks xmlns:a="http://schemas.openxmlformats.org/drawingml/2006/main" noChangeAspect="1"/>
+                  </wp:cNvGraphicFramePr>
+                  <a:graphic xmlns:a="http://schemas.openxmlformats.org/drawingml/2006/main">
+                    <a:graphicData uri="http://schemas.openxmlformats.org/drawingml/2006/picture">
+                      <pic:pic xmlns:pic="http://schemas.openxmlformats.org/drawingml/2006/picture">
+                        <pic:nvPicPr>
+                          <pic:cNvPr id="0" name="" descr=""/>
+                          <pic:cNvPicPr>
+                            <a:picLocks noChangeAspect="1" noChangeArrowheads="1"/>
+                          </pic:cNvPicPr>
+                        </pic:nvPicPr>
+                        <pic:blipFill>
+                          <a:blip r:embed="rId15" cstate="none"/>
+                          <a:srcRect/>
+                          <a:stretch>
+                            <a:fillRect/>
+                          </a:stretch>
+                        </pic:blipFill>
+                        <pic:spPr bwMode="auto">
+                          <a:xfrm>
+                            <a:off x="0" y="0"/>
+                            <a:ext cx="5334000" cy="3552825"/>
+                          </a:xfrm>
+                          <a:prstGeom prst="rect">
+                            <a:avLst/>
+                          </a:prstGeom>
+                        </pic:spPr>
+                      </pic:pic>
+                    </a:graphicData>
+                  </a:graphic>
+                </wp:inline>
+              </w:drawing>
+            </w:r>
+          </w:p>
+          <w:p>
+            <w:pPr>
+              <w:spacing w:after="120" w:line="300"/>
+              <w:jc w:val="center"/>
+            </w:pPr>
+            <w:r>
+              <w:rPr>
+                <w:i/>
+                <w:iCs/>
+                <w:color w:val="5B6575"/>
+                <w:sz w:val="19"/>
+                <w:szCs w:val="19"/>
+              </w:rPr>
+              <w:t xml:space="preserve">A variable name can refer to a new value.</w:t>
+            </w:r>
+          </w:p>
+          <w:p>
+            <w:pPr>
+              <w:spacing w:after="120" w:line="300"/>
+            </w:pPr>
+            <w:r>
+              <w:rPr>
+                <w:b/>
+                <w:bCs/>
+                <w:color w:val="4659A7"/>
+              </w:rPr>
+              <w:t xml:space="preserve">1  </w:t>
+            </w:r>
+            <w:r>
+              <w:t xml:space="preserve">Choose a useful name such as </w:t>
+            </w:r>
+            <w:r>
+              <w:rPr>
+                <w:rFonts w:ascii="Consolas" w:cs="Consolas" w:eastAsia="Consolas" w:hAnsi="Consolas"/>
+                <w:color w:val="4659A7"/>
+                <w:shd w:fill="EEF1FA" w:val="clear"/>
+              </w:rPr>
+              <w:t xml:space="preserve">score</w:t>
+            </w:r>
+            <w:r>
+              <w:t xml:space="preserve">.</w:t>
+            </w:r>
+          </w:p>
+          <w:p>
+            <w:pPr>
+              <w:spacing w:after="120" w:line="300"/>
+            </w:pPr>
+            <w:r>
+              <w:rPr>
+                <w:b/>
+                <w:bCs/>
+                <w:color w:val="4659A7"/>
+              </w:rPr>
+              <w:t xml:space="preserve">2  </w:t>
+            </w:r>
+            <w:r>
+              <w:t xml:space="preserve">Assign the first value to that name.</w:t>
+            </w:r>
+          </w:p>
+          <w:p>
+            <w:pPr>
+              <w:spacing w:after="120" w:line="300"/>
+            </w:pPr>
+            <w:r>
+              <w:rPr>
+                <w:b/>
+                <w:bCs/>
+                <w:color w:val="4659A7"/>
+              </w:rPr>
+              <w:t xml:space="preserve">3  </w:t>
+            </w:r>
+            <w:r>
+              <w:t xml:space="preserve">Assign again when the value changes.</w:t>
+            </w:r>
+          </w:p>
+        </w:tc>
+      </w:tr>
+    </w:tbl>
     <w:tbl>
       <w:tblPr>
         <w:tblW w:type="pct" w:w="100%"/>
@@ -7352,148 +7640,196 @@
         <w:t xml:space="preserve">, Python finishes the right side first. It reads the current value 10. It calculates 10 + 5. Only then does it assign the result 15 back to the name score.</w:t>
       </w:r>
     </w:p>
-    <w:p>
-      <w:pPr>
-        <w:jc w:val="center"/>
-      </w:pPr>
-      <w:r>
-        <w:drawing>
-          <wp:inline distT="0" distB="0" distL="0" distR="0">
-            <wp:extent cx="5334000" cy="3552825"/>
-            <wp:effectExtent t="0" r="0" b="0" l="0"/>
-            <wp:docPr id="1" name="Three numbered stages show score being read as 10, increased by 5 and assigned the result 15." descr="Three numbered stages show score being read as 10, increased by 5 and assigned the result 15." title="Three numbered stages show score being read as 10, increased by 5 and assigned the result 15."/>
-            <wp:cNvGraphicFramePr>
-              <a:graphicFrameLocks xmlns:a="http://schemas.openxmlformats.org/drawingml/2006/main" noChangeAspect="1"/>
-            </wp:cNvGraphicFramePr>
-            <a:graphic xmlns:a="http://schemas.openxmlformats.org/drawingml/2006/main">
-              <a:graphicData uri="http://schemas.openxmlformats.org/drawingml/2006/picture">
-                <pic:pic xmlns:pic="http://schemas.openxmlformats.org/drawingml/2006/picture">
-                  <pic:nvPicPr>
-                    <pic:cNvPr id="0" name="" descr=""/>
-                    <pic:cNvPicPr>
-                      <a:picLocks noChangeAspect="1" noChangeArrowheads="1"/>
-                    </pic:cNvPicPr>
-                  </pic:nvPicPr>
-                  <pic:blipFill>
-                    <a:blip r:embed="rId16" cstate="none"/>
-                    <a:srcRect/>
-                    <a:stretch>
-                      <a:fillRect/>
-                    </a:stretch>
-                  </pic:blipFill>
-                  <pic:spPr bwMode="auto">
-                    <a:xfrm>
-                      <a:off x="0" y="0"/>
-                      <a:ext cx="5334000" cy="3552825"/>
-                    </a:xfrm>
-                    <a:prstGeom prst="rect">
-                      <a:avLst/>
-                    </a:prstGeom>
-                  </pic:spPr>
-                </pic:pic>
-              </a:graphicData>
-            </a:graphic>
-          </wp:inline>
-        </w:drawing>
-      </w:r>
-    </w:p>
-    <w:p>
-      <w:pPr>
-        <w:spacing w:after="120" w:line="300"/>
-        <w:jc w:val="center"/>
-      </w:pPr>
-      <w:r>
-        <w:rPr>
-          <w:i/>
-          <w:iCs/>
-          <w:color w:val="5B6575"/>
-          <w:sz w:val="19"/>
-          <w:szCs w:val="19"/>
-        </w:rPr>
-        <w:t xml:space="preserve">Python finishes the right side before changing the left side.</w:t>
-      </w:r>
-    </w:p>
-    <w:p>
-      <w:pPr>
-        <w:spacing w:after="120" w:line="300"/>
-      </w:pPr>
-      <w:r>
-        <w:rPr>
-          <w:b/>
-          <w:bCs/>
-          <w:color w:val="4659A7"/>
-        </w:rPr>
-        <w:t xml:space="preserve">1  </w:t>
-      </w:r>
-      <w:r>
-        <w:t xml:space="preserve">Read the current value of </w:t>
-      </w:r>
-      <w:r>
-        <w:rPr>
-          <w:rFonts w:ascii="Consolas" w:cs="Consolas" w:eastAsia="Consolas" w:hAnsi="Consolas"/>
-          <w:color w:val="4659A7"/>
-          <w:shd w:fill="EEF1FA" w:val="clear"/>
-        </w:rPr>
-        <w:t xml:space="preserve">score</w:t>
-      </w:r>
-      <w:r>
-        <w:t xml:space="preserve">: 10.</w:t>
-      </w:r>
-    </w:p>
-    <w:p>
-      <w:pPr>
-        <w:spacing w:after="120" w:line="300"/>
-      </w:pPr>
-      <w:r>
-        <w:rPr>
-          <w:b/>
-          <w:bCs/>
-          <w:color w:val="4659A7"/>
-        </w:rPr>
-        <w:t xml:space="preserve">2  </w:t>
-      </w:r>
-      <w:r>
-        <w:t xml:space="preserve">Calculate </w:t>
-      </w:r>
-      <w:r>
-        <w:rPr>
-          <w:rFonts w:ascii="Consolas" w:cs="Consolas" w:eastAsia="Consolas" w:hAnsi="Consolas"/>
-          <w:color w:val="4659A7"/>
-          <w:shd w:fill="EEF1FA" w:val="clear"/>
-        </w:rPr>
-        <w:t xml:space="preserve">10 + 5</w:t>
-      </w:r>
-      <w:r>
-        <w:t xml:space="preserve">: the result is 15.</w:t>
-      </w:r>
-    </w:p>
-    <w:p>
-      <w:pPr>
-        <w:spacing w:after="120" w:line="300"/>
-      </w:pPr>
-      <w:r>
-        <w:rPr>
-          <w:b/>
-          <w:bCs/>
-          <w:color w:val="4659A7"/>
-        </w:rPr>
-        <w:t xml:space="preserve">3  </w:t>
-      </w:r>
-      <w:r>
-        <w:t xml:space="preserve">Assign 15 back to the name </w:t>
-      </w:r>
-      <w:r>
-        <w:rPr>
-          <w:rFonts w:ascii="Consolas" w:cs="Consolas" w:eastAsia="Consolas" w:hAnsi="Consolas"/>
-          <w:color w:val="4659A7"/>
-          <w:shd w:fill="EEF1FA" w:val="clear"/>
-        </w:rPr>
-        <w:t xml:space="preserve">score</w:t>
-      </w:r>
-      <w:r>
-        <w:t xml:space="preserve">.</w:t>
-      </w:r>
-    </w:p>
+    <w:tbl>
+      <w:tblPr>
+        <w:tblW w:type="pct" w:w="100%"/>
+        <w:tblBorders>
+          <w:top w:val="single" w:color="auto" w:sz="4"/>
+          <w:left w:val="single" w:color="auto" w:sz="4"/>
+          <w:bottom w:val="single" w:color="auto" w:sz="4"/>
+          <w:right w:val="single" w:color="auto" w:sz="4"/>
+          <w:insideH w:val="single" w:color="auto" w:sz="4"/>
+          <w:insideV w:val="single" w:color="auto" w:sz="4"/>
+        </w:tblBorders>
+      </w:tblPr>
+      <w:tblGrid>
+        <w:gridCol w:w="100"/>
+      </w:tblGrid>
+      <w:tr>
+        <w:tc>
+          <w:tcPr>
+            <w:tcBorders>
+              <w:top w:val="single" w:color="D9E0EA" w:sz="2"/>
+              <w:left w:val="single" w:color="D9E0EA" w:sz="2"/>
+              <w:bottom w:val="single" w:color="D9E0EA" w:sz="2"/>
+              <w:right w:val="single" w:color="D9E0EA" w:sz="2"/>
+            </w:tcBorders>
+            <w:shd w:fill="F8FAFC" w:val="clear"/>
+            <w:tcMar>
+              <w:top w:type="dxa" w:w="130"/>
+              <w:left w:type="dxa" w:w="160"/>
+              <w:bottom w:type="dxa" w:w="130"/>
+              <w:right w:type="dxa" w:w="160"/>
+            </w:tcMar>
+          </w:tcPr>
+          <w:p>
+            <w:pPr>
+              <w:spacing w:after="120" w:line="300"/>
+            </w:pPr>
+            <w:r>
+              <w:rPr>
+                <w:b/>
+                <w:bCs/>
+                <w:color w:val="263A67"/>
+              </w:rPr>
+              <w:t xml:space="preserve">ARCHITECTURAL BLUEPRINT</w:t>
+            </w:r>
+          </w:p>
+          <w:p>
+            <w:pPr>
+              <w:jc w:val="center"/>
+            </w:pPr>
+            <w:r>
+              <w:drawing>
+                <wp:inline distT="0" distB="0" distL="0" distR="0">
+                  <wp:extent cx="5334000" cy="3552825"/>
+                  <wp:effectExtent t="0" r="0" b="0" l="0"/>
+                  <wp:docPr id="1" name="Three numbered stages show score being read as 10, increased by 5 and assigned the result 15." descr="Three numbered stages show score being read as 10, increased by 5 and assigned the result 15." title="Three numbered stages show score being read as 10, increased by 5 and assigned the result 15."/>
+                  <wp:cNvGraphicFramePr>
+                    <a:graphicFrameLocks xmlns:a="http://schemas.openxmlformats.org/drawingml/2006/main" noChangeAspect="1"/>
+                  </wp:cNvGraphicFramePr>
+                  <a:graphic xmlns:a="http://schemas.openxmlformats.org/drawingml/2006/main">
+                    <a:graphicData uri="http://schemas.openxmlformats.org/drawingml/2006/picture">
+                      <pic:pic xmlns:pic="http://schemas.openxmlformats.org/drawingml/2006/picture">
+                        <pic:nvPicPr>
+                          <pic:cNvPr id="0" name="" descr=""/>
+                          <pic:cNvPicPr>
+                            <a:picLocks noChangeAspect="1" noChangeArrowheads="1"/>
+                          </pic:cNvPicPr>
+                        </pic:nvPicPr>
+                        <pic:blipFill>
+                          <a:blip r:embed="rId16" cstate="none"/>
+                          <a:srcRect/>
+                          <a:stretch>
+                            <a:fillRect/>
+                          </a:stretch>
+                        </pic:blipFill>
+                        <pic:spPr bwMode="auto">
+                          <a:xfrm>
+                            <a:off x="0" y="0"/>
+                            <a:ext cx="5334000" cy="3552825"/>
+                          </a:xfrm>
+                          <a:prstGeom prst="rect">
+                            <a:avLst/>
+                          </a:prstGeom>
+                        </pic:spPr>
+                      </pic:pic>
+                    </a:graphicData>
+                  </a:graphic>
+                </wp:inline>
+              </w:drawing>
+            </w:r>
+          </w:p>
+          <w:p>
+            <w:pPr>
+              <w:spacing w:after="120" w:line="300"/>
+              <w:jc w:val="center"/>
+            </w:pPr>
+            <w:r>
+              <w:rPr>
+                <w:i/>
+                <w:iCs/>
+                <w:color w:val="5B6575"/>
+                <w:sz w:val="19"/>
+                <w:szCs w:val="19"/>
+              </w:rPr>
+              <w:t xml:space="preserve">Python finishes the right side before changing the left side.</w:t>
+            </w:r>
+          </w:p>
+          <w:p>
+            <w:pPr>
+              <w:spacing w:after="120" w:line="300"/>
+            </w:pPr>
+            <w:r>
+              <w:rPr>
+                <w:b/>
+                <w:bCs/>
+                <w:color w:val="4659A7"/>
+              </w:rPr>
+              <w:t xml:space="preserve">1  </w:t>
+            </w:r>
+            <w:r>
+              <w:t xml:space="preserve">Read the current value of </w:t>
+            </w:r>
+            <w:r>
+              <w:rPr>
+                <w:rFonts w:ascii="Consolas" w:cs="Consolas" w:eastAsia="Consolas" w:hAnsi="Consolas"/>
+                <w:color w:val="4659A7"/>
+                <w:shd w:fill="EEF1FA" w:val="clear"/>
+              </w:rPr>
+              <w:t xml:space="preserve">score</w:t>
+            </w:r>
+            <w:r>
+              <w:t xml:space="preserve">: 10.</w:t>
+            </w:r>
+          </w:p>
+          <w:p>
+            <w:pPr>
+              <w:spacing w:after="120" w:line="300"/>
+            </w:pPr>
+            <w:r>
+              <w:rPr>
+                <w:b/>
+                <w:bCs/>
+                <w:color w:val="4659A7"/>
+              </w:rPr>
+              <w:t xml:space="preserve">2  </w:t>
+            </w:r>
+            <w:r>
+              <w:t xml:space="preserve">Calculate </w:t>
+            </w:r>
+            <w:r>
+              <w:rPr>
+                <w:rFonts w:ascii="Consolas" w:cs="Consolas" w:eastAsia="Consolas" w:hAnsi="Consolas"/>
+                <w:color w:val="4659A7"/>
+                <w:shd w:fill="EEF1FA" w:val="clear"/>
+              </w:rPr>
+              <w:t xml:space="preserve">10 + 5</w:t>
+            </w:r>
+            <w:r>
+              <w:t xml:space="preserve">: the result is 15.</w:t>
+            </w:r>
+          </w:p>
+          <w:p>
+            <w:pPr>
+              <w:spacing w:after="120" w:line="300"/>
+            </w:pPr>
+            <w:r>
+              <w:rPr>
+                <w:b/>
+                <w:bCs/>
+                <w:color w:val="4659A7"/>
+              </w:rPr>
+              <w:t xml:space="preserve">3  </w:t>
+            </w:r>
+            <w:r>
+              <w:t xml:space="preserve">Assign 15 back to the name </w:t>
+            </w:r>
+            <w:r>
+              <w:rPr>
+                <w:rFonts w:ascii="Consolas" w:cs="Consolas" w:eastAsia="Consolas" w:hAnsi="Consolas"/>
+                <w:color w:val="4659A7"/>
+                <w:shd w:fill="EEF1FA" w:val="clear"/>
+              </w:rPr>
+              <w:t xml:space="preserve">score</w:t>
+            </w:r>
+            <w:r>
+              <w:t xml:space="preserve">.</w:t>
+            </w:r>
+          </w:p>
+        </w:tc>
+      </w:tr>
+    </w:tbl>
     <w:tbl>
       <w:tblPr>
         <w:tblW w:type="pct" w:w="100%"/>
@@ -8781,7 +9117,7 @@
       </w:r>
     </w:p>
     <w:p>
-      <w:hyperlink w:history="1" r:id="rIdnnakgigiooqllaaq2xu1a">
+      <w:hyperlink w:history="1" r:id="rIdwig2e8cblat9fkfxt3smz">
         <w:r>
           <w:rPr>
             <w:rStyle w:val="Hyperlink"/>
@@ -8799,7 +9135,7 @@
       </w:r>
     </w:p>
     <w:p>
-      <w:hyperlink w:history="1" r:id="rIde5bizuzbphap78fpx_kzc">
+      <w:hyperlink w:history="1" r:id="rIdkogu6yywft3rjbjlbhqfo">
         <w:r>
           <w:rPr>
             <w:rStyle w:val="Hyperlink"/>
@@ -8899,185 +9235,233 @@
         <w:t xml:space="preserve">Meet strings, integers, floats and booleans—and see why type changes what Python can do.</w:t>
       </w:r>
     </w:p>
-    <w:p>
-      <w:pPr>
-        <w:jc w:val="center"/>
-      </w:pPr>
-      <w:r>
-        <w:drawing>
-          <wp:inline distT="0" distB="0" distL="0" distR="0">
-            <wp:extent cx="5334000" cy="3552825"/>
-            <wp:effectExtent t="0" r="0" b="0" l="0"/>
-            <wp:docPr id="1" name="A memory hub connects to cards for text, whole numbers, decimals and true-or-false values." descr="A memory hub connects to cards for text, whole numbers, decimals and true-or-false values." title="A memory hub connects to cards for text, whole numbers, decimals and true-or-false values."/>
-            <wp:cNvGraphicFramePr>
-              <a:graphicFrameLocks xmlns:a="http://schemas.openxmlformats.org/drawingml/2006/main" noChangeAspect="1"/>
-            </wp:cNvGraphicFramePr>
-            <a:graphic xmlns:a="http://schemas.openxmlformats.org/drawingml/2006/main">
-              <a:graphicData uri="http://schemas.openxmlformats.org/drawingml/2006/picture">
-                <pic:pic xmlns:pic="http://schemas.openxmlformats.org/drawingml/2006/picture">
-                  <pic:nvPicPr>
-                    <pic:cNvPr id="0" name="" descr=""/>
-                    <pic:cNvPicPr>
-                      <a:picLocks noChangeAspect="1" noChangeArrowheads="1"/>
-                    </pic:cNvPicPr>
-                  </pic:nvPicPr>
-                  <pic:blipFill>
-                    <a:blip r:embed="rId17" cstate="none"/>
-                    <a:srcRect/>
-                    <a:stretch>
-                      <a:fillRect/>
-                    </a:stretch>
-                  </pic:blipFill>
-                  <pic:spPr bwMode="auto">
-                    <a:xfrm>
-                      <a:off x="0" y="0"/>
-                      <a:ext cx="5334000" cy="3552825"/>
-                    </a:xfrm>
-                    <a:prstGeom prst="rect">
-                      <a:avLst/>
-                    </a:prstGeom>
-                  </pic:spPr>
-                </pic:pic>
-              </a:graphicData>
-            </a:graphic>
-          </wp:inline>
-        </w:drawing>
-      </w:r>
-    </w:p>
-    <w:p>
-      <w:pPr>
-        <w:spacing w:after="120" w:line="300"/>
-        <w:jc w:val="center"/>
-      </w:pPr>
-      <w:r>
-        <w:rPr>
-          <w:i/>
-          <w:iCs/>
-          <w:color w:val="5B6575"/>
-          <w:sz w:val="19"/>
-          <w:szCs w:val="19"/>
-        </w:rPr>
-        <w:t xml:space="preserve">A type tells Python what kind of value it is handling.</w:t>
-      </w:r>
-    </w:p>
-    <w:p>
-      <w:pPr>
-        <w:spacing w:after="120" w:line="300"/>
-      </w:pPr>
-      <w:r>
-        <w:rPr>
-          <w:b/>
-          <w:bCs/>
-          <w:color w:val="4659A7"/>
-        </w:rPr>
-        <w:t xml:space="preserve">1  </w:t>
-      </w:r>
-      <w:r>
-        <w:rPr>
-          <w:rFonts w:ascii="Consolas" w:cs="Consolas" w:eastAsia="Consolas" w:hAnsi="Consolas"/>
-          <w:color w:val="4659A7"/>
-          <w:shd w:fill="EEF1FA" w:val="clear"/>
-        </w:rPr>
-        <w:t xml:space="preserve">str</w:t>
-      </w:r>
-      <w:r>
-        <w:t xml:space="preserve"> stores text.</w:t>
-      </w:r>
-    </w:p>
-    <w:p>
-      <w:pPr>
-        <w:spacing w:after="120" w:line="300"/>
-      </w:pPr>
-      <w:r>
-        <w:rPr>
-          <w:b/>
-          <w:bCs/>
-          <w:color w:val="4659A7"/>
-        </w:rPr>
-        <w:t xml:space="preserve">2  </w:t>
-      </w:r>
-      <w:r>
-        <w:rPr>
-          <w:rFonts w:ascii="Consolas" w:cs="Consolas" w:eastAsia="Consolas" w:hAnsi="Consolas"/>
-          <w:color w:val="4659A7"/>
-          <w:shd w:fill="EEF1FA" w:val="clear"/>
-        </w:rPr>
-        <w:t xml:space="preserve">int</w:t>
-      </w:r>
-      <w:r>
-        <w:t xml:space="preserve"> stores whole numbers.</w:t>
-      </w:r>
-    </w:p>
-    <w:p>
-      <w:pPr>
-        <w:spacing w:after="120" w:line="300"/>
-      </w:pPr>
-      <w:r>
-        <w:rPr>
-          <w:b/>
-          <w:bCs/>
-          <w:color w:val="4659A7"/>
-        </w:rPr>
-        <w:t xml:space="preserve">3  </w:t>
-      </w:r>
-      <w:r>
-        <w:rPr>
-          <w:rFonts w:ascii="Consolas" w:cs="Consolas" w:eastAsia="Consolas" w:hAnsi="Consolas"/>
-          <w:color w:val="4659A7"/>
-          <w:shd w:fill="EEF1FA" w:val="clear"/>
-        </w:rPr>
-        <w:t xml:space="preserve">float</w:t>
-      </w:r>
-      <w:r>
-        <w:t xml:space="preserve"> stores decimal numbers.</w:t>
-      </w:r>
-    </w:p>
-    <w:p>
-      <w:pPr>
-        <w:spacing w:after="120" w:line="300"/>
-      </w:pPr>
-      <w:r>
-        <w:rPr>
-          <w:b/>
-          <w:bCs/>
-          <w:color w:val="4659A7"/>
-        </w:rPr>
-        <w:t xml:space="preserve">4  </w:t>
-      </w:r>
-      <w:r>
-        <w:rPr>
-          <w:rFonts w:ascii="Consolas" w:cs="Consolas" w:eastAsia="Consolas" w:hAnsi="Consolas"/>
-          <w:color w:val="4659A7"/>
-          <w:shd w:fill="EEF1FA" w:val="clear"/>
-        </w:rPr>
-        <w:t xml:space="preserve">bool</w:t>
-      </w:r>
-      <w:r>
-        <w:t xml:space="preserve"> stores </w:t>
-      </w:r>
-      <w:r>
-        <w:rPr>
-          <w:rFonts w:ascii="Consolas" w:cs="Consolas" w:eastAsia="Consolas" w:hAnsi="Consolas"/>
-          <w:color w:val="4659A7"/>
-          <w:shd w:fill="EEF1FA" w:val="clear"/>
-        </w:rPr>
-        <w:t xml:space="preserve">True</w:t>
-      </w:r>
-      <w:r>
-        <w:t xml:space="preserve"> or </w:t>
-      </w:r>
-      <w:r>
-        <w:rPr>
-          <w:rFonts w:ascii="Consolas" w:cs="Consolas" w:eastAsia="Consolas" w:hAnsi="Consolas"/>
-          <w:color w:val="4659A7"/>
-          <w:shd w:fill="EEF1FA" w:val="clear"/>
-        </w:rPr>
-        <w:t xml:space="preserve">False</w:t>
-      </w:r>
-      <w:r>
-        <w:t xml:space="preserve">.</w:t>
-      </w:r>
-    </w:p>
+    <w:tbl>
+      <w:tblPr>
+        <w:tblW w:type="pct" w:w="100%"/>
+        <w:tblBorders>
+          <w:top w:val="single" w:color="auto" w:sz="4"/>
+          <w:left w:val="single" w:color="auto" w:sz="4"/>
+          <w:bottom w:val="single" w:color="auto" w:sz="4"/>
+          <w:right w:val="single" w:color="auto" w:sz="4"/>
+          <w:insideH w:val="single" w:color="auto" w:sz="4"/>
+          <w:insideV w:val="single" w:color="auto" w:sz="4"/>
+        </w:tblBorders>
+      </w:tblPr>
+      <w:tblGrid>
+        <w:gridCol w:w="100"/>
+      </w:tblGrid>
+      <w:tr>
+        <w:tc>
+          <w:tcPr>
+            <w:tcBorders>
+              <w:top w:val="single" w:color="D9E0EA" w:sz="2"/>
+              <w:left w:val="single" w:color="D9E0EA" w:sz="2"/>
+              <w:bottom w:val="single" w:color="D9E0EA" w:sz="2"/>
+              <w:right w:val="single" w:color="D9E0EA" w:sz="2"/>
+            </w:tcBorders>
+            <w:shd w:fill="F8FAFC" w:val="clear"/>
+            <w:tcMar>
+              <w:top w:type="dxa" w:w="130"/>
+              <w:left w:type="dxa" w:w="160"/>
+              <w:bottom w:type="dxa" w:w="130"/>
+              <w:right w:type="dxa" w:w="160"/>
+            </w:tcMar>
+          </w:tcPr>
+          <w:p>
+            <w:pPr>
+              <w:spacing w:after="120" w:line="300"/>
+            </w:pPr>
+            <w:r>
+              <w:rPr>
+                <w:b/>
+                <w:bCs/>
+                <w:color w:val="263A67"/>
+              </w:rPr>
+              <w:t xml:space="preserve">ARCHITECTURAL BLUEPRINT</w:t>
+            </w:r>
+          </w:p>
+          <w:p>
+            <w:pPr>
+              <w:jc w:val="center"/>
+            </w:pPr>
+            <w:r>
+              <w:drawing>
+                <wp:inline distT="0" distB="0" distL="0" distR="0">
+                  <wp:extent cx="5334000" cy="3552825"/>
+                  <wp:effectExtent t="0" r="0" b="0" l="0"/>
+                  <wp:docPr id="1" name="A memory hub connects to cards for text, whole numbers, decimals and true-or-false values." descr="A memory hub connects to cards for text, whole numbers, decimals and true-or-false values." title="A memory hub connects to cards for text, whole numbers, decimals and true-or-false values."/>
+                  <wp:cNvGraphicFramePr>
+                    <a:graphicFrameLocks xmlns:a="http://schemas.openxmlformats.org/drawingml/2006/main" noChangeAspect="1"/>
+                  </wp:cNvGraphicFramePr>
+                  <a:graphic xmlns:a="http://schemas.openxmlformats.org/drawingml/2006/main">
+                    <a:graphicData uri="http://schemas.openxmlformats.org/drawingml/2006/picture">
+                      <pic:pic xmlns:pic="http://schemas.openxmlformats.org/drawingml/2006/picture">
+                        <pic:nvPicPr>
+                          <pic:cNvPr id="0" name="" descr=""/>
+                          <pic:cNvPicPr>
+                            <a:picLocks noChangeAspect="1" noChangeArrowheads="1"/>
+                          </pic:cNvPicPr>
+                        </pic:nvPicPr>
+                        <pic:blipFill>
+                          <a:blip r:embed="rId17" cstate="none"/>
+                          <a:srcRect/>
+                          <a:stretch>
+                            <a:fillRect/>
+                          </a:stretch>
+                        </pic:blipFill>
+                        <pic:spPr bwMode="auto">
+                          <a:xfrm>
+                            <a:off x="0" y="0"/>
+                            <a:ext cx="5334000" cy="3552825"/>
+                          </a:xfrm>
+                          <a:prstGeom prst="rect">
+                            <a:avLst/>
+                          </a:prstGeom>
+                        </pic:spPr>
+                      </pic:pic>
+                    </a:graphicData>
+                  </a:graphic>
+                </wp:inline>
+              </w:drawing>
+            </w:r>
+          </w:p>
+          <w:p>
+            <w:pPr>
+              <w:spacing w:after="120" w:line="300"/>
+              <w:jc w:val="center"/>
+            </w:pPr>
+            <w:r>
+              <w:rPr>
+                <w:i/>
+                <w:iCs/>
+                <w:color w:val="5B6575"/>
+                <w:sz w:val="19"/>
+                <w:szCs w:val="19"/>
+              </w:rPr>
+              <w:t xml:space="preserve">A type tells Python what kind of value it is handling.</w:t>
+            </w:r>
+          </w:p>
+          <w:p>
+            <w:pPr>
+              <w:spacing w:after="120" w:line="300"/>
+            </w:pPr>
+            <w:r>
+              <w:rPr>
+                <w:b/>
+                <w:bCs/>
+                <w:color w:val="4659A7"/>
+              </w:rPr>
+              <w:t xml:space="preserve">1  </w:t>
+            </w:r>
+            <w:r>
+              <w:rPr>
+                <w:rFonts w:ascii="Consolas" w:cs="Consolas" w:eastAsia="Consolas" w:hAnsi="Consolas"/>
+                <w:color w:val="4659A7"/>
+                <w:shd w:fill="EEF1FA" w:val="clear"/>
+              </w:rPr>
+              <w:t xml:space="preserve">str</w:t>
+            </w:r>
+            <w:r>
+              <w:t xml:space="preserve"> stores text.</w:t>
+            </w:r>
+          </w:p>
+          <w:p>
+            <w:pPr>
+              <w:spacing w:after="120" w:line="300"/>
+            </w:pPr>
+            <w:r>
+              <w:rPr>
+                <w:b/>
+                <w:bCs/>
+                <w:color w:val="4659A7"/>
+              </w:rPr>
+              <w:t xml:space="preserve">2  </w:t>
+            </w:r>
+            <w:r>
+              <w:rPr>
+                <w:rFonts w:ascii="Consolas" w:cs="Consolas" w:eastAsia="Consolas" w:hAnsi="Consolas"/>
+                <w:color w:val="4659A7"/>
+                <w:shd w:fill="EEF1FA" w:val="clear"/>
+              </w:rPr>
+              <w:t xml:space="preserve">int</w:t>
+            </w:r>
+            <w:r>
+              <w:t xml:space="preserve"> stores whole numbers.</w:t>
+            </w:r>
+          </w:p>
+          <w:p>
+            <w:pPr>
+              <w:spacing w:after="120" w:line="300"/>
+            </w:pPr>
+            <w:r>
+              <w:rPr>
+                <w:b/>
+                <w:bCs/>
+                <w:color w:val="4659A7"/>
+              </w:rPr>
+              <w:t xml:space="preserve">3  </w:t>
+            </w:r>
+            <w:r>
+              <w:rPr>
+                <w:rFonts w:ascii="Consolas" w:cs="Consolas" w:eastAsia="Consolas" w:hAnsi="Consolas"/>
+                <w:color w:val="4659A7"/>
+                <w:shd w:fill="EEF1FA" w:val="clear"/>
+              </w:rPr>
+              <w:t xml:space="preserve">float</w:t>
+            </w:r>
+            <w:r>
+              <w:t xml:space="preserve"> stores decimal numbers.</w:t>
+            </w:r>
+          </w:p>
+          <w:p>
+            <w:pPr>
+              <w:spacing w:after="120" w:line="300"/>
+            </w:pPr>
+            <w:r>
+              <w:rPr>
+                <w:b/>
+                <w:bCs/>
+                <w:color w:val="4659A7"/>
+              </w:rPr>
+              <w:t xml:space="preserve">4  </w:t>
+            </w:r>
+            <w:r>
+              <w:rPr>
+                <w:rFonts w:ascii="Consolas" w:cs="Consolas" w:eastAsia="Consolas" w:hAnsi="Consolas"/>
+                <w:color w:val="4659A7"/>
+                <w:shd w:fill="EEF1FA" w:val="clear"/>
+              </w:rPr>
+              <w:t xml:space="preserve">bool</w:t>
+            </w:r>
+            <w:r>
+              <w:t xml:space="preserve"> stores </w:t>
+            </w:r>
+            <w:r>
+              <w:rPr>
+                <w:rFonts w:ascii="Consolas" w:cs="Consolas" w:eastAsia="Consolas" w:hAnsi="Consolas"/>
+                <w:color w:val="4659A7"/>
+                <w:shd w:fill="EEF1FA" w:val="clear"/>
+              </w:rPr>
+              <w:t xml:space="preserve">True</w:t>
+            </w:r>
+            <w:r>
+              <w:t xml:space="preserve"> or </w:t>
+            </w:r>
+            <w:r>
+              <w:rPr>
+                <w:rFonts w:ascii="Consolas" w:cs="Consolas" w:eastAsia="Consolas" w:hAnsi="Consolas"/>
+                <w:color w:val="4659A7"/>
+                <w:shd w:fill="EEF1FA" w:val="clear"/>
+              </w:rPr>
+              <w:t xml:space="preserve">False</w:t>
+            </w:r>
+            <w:r>
+              <w:t xml:space="preserve">.</w:t>
+            </w:r>
+          </w:p>
+        </w:tc>
+      </w:tr>
+    </w:tbl>
     <w:tbl>
       <w:tblPr>
         <w:tblW w:type="pct" w:w="100%"/>
@@ -9494,165 +9878,213 @@
         <w:t xml:space="preserve"> symbol enough context to choose the operation.</w:t>
       </w:r>
     </w:p>
-    <w:p>
-      <w:pPr>
-        <w:jc w:val="center"/>
-      </w:pPr>
-      <w:r>
-        <w:drawing>
-          <wp:inline distT="0" distB="0" distL="0" distR="0">
-            <wp:extent cx="5334000" cy="3552825"/>
-            <wp:effectExtent t="0" r="0" b="0" l="0"/>
-            <wp:docPr id="1" name="Two lanes compare integer addition with string joining using the plus symbol." descr="Two lanes compare integer addition with string joining using the plus symbol." title="Two lanes compare integer addition with string joining using the plus symbol."/>
-            <wp:cNvGraphicFramePr>
-              <a:graphicFrameLocks xmlns:a="http://schemas.openxmlformats.org/drawingml/2006/main" noChangeAspect="1"/>
-            </wp:cNvGraphicFramePr>
-            <a:graphic xmlns:a="http://schemas.openxmlformats.org/drawingml/2006/main">
-              <a:graphicData uri="http://schemas.openxmlformats.org/drawingml/2006/picture">
-                <pic:pic xmlns:pic="http://schemas.openxmlformats.org/drawingml/2006/picture">
-                  <pic:nvPicPr>
-                    <pic:cNvPr id="0" name="" descr=""/>
-                    <pic:cNvPicPr>
-                      <a:picLocks noChangeAspect="1" noChangeArrowheads="1"/>
-                    </pic:cNvPicPr>
-                  </pic:nvPicPr>
-                  <pic:blipFill>
-                    <a:blip r:embed="rId18" cstate="none"/>
-                    <a:srcRect/>
-                    <a:stretch>
-                      <a:fillRect/>
-                    </a:stretch>
-                  </pic:blipFill>
-                  <pic:spPr bwMode="auto">
-                    <a:xfrm>
-                      <a:off x="0" y="0"/>
-                      <a:ext cx="5334000" cy="3552825"/>
-                    </a:xfrm>
-                    <a:prstGeom prst="rect">
-                      <a:avLst/>
-                    </a:prstGeom>
-                  </pic:spPr>
-                </pic:pic>
-              </a:graphicData>
-            </a:graphic>
-          </wp:inline>
-        </w:drawing>
-      </w:r>
-    </w:p>
-    <w:p>
-      <w:pPr>
-        <w:spacing w:after="120" w:line="300"/>
-        <w:jc w:val="center"/>
-      </w:pPr>
-      <w:r>
-        <w:rPr>
-          <w:i/>
-          <w:iCs/>
-          <w:color w:val="5B6575"/>
-          <w:sz w:val="19"/>
-          <w:szCs w:val="19"/>
-        </w:rPr>
-        <w:t xml:space="preserve">The type changes what the plus sign does.</w:t>
-      </w:r>
-    </w:p>
-    <w:p>
-      <w:pPr>
-        <w:spacing w:after="120" w:line="300"/>
-      </w:pPr>
-      <w:r>
-        <w:rPr>
-          <w:b/>
-          <w:bCs/>
-          <w:color w:val="4659A7"/>
-        </w:rPr>
-        <w:t xml:space="preserve">1  </w:t>
-      </w:r>
-      <w:r>
-        <w:t xml:space="preserve">Numbers use </w:t>
-      </w:r>
-      <w:r>
-        <w:rPr>
-          <w:rFonts w:ascii="Consolas" w:cs="Consolas" w:eastAsia="Consolas" w:hAnsi="Consolas"/>
-          <w:color w:val="4659A7"/>
-          <w:shd w:fill="EEF1FA" w:val="clear"/>
-        </w:rPr>
-        <w:t xml:space="preserve">+</w:t>
-      </w:r>
-      <w:r>
-        <w:t xml:space="preserve"> for addition: </w:t>
-      </w:r>
-      <w:r>
-        <w:rPr>
-          <w:rFonts w:ascii="Consolas" w:cs="Consolas" w:eastAsia="Consolas" w:hAnsi="Consolas"/>
-          <w:color w:val="4659A7"/>
-          <w:shd w:fill="EEF1FA" w:val="clear"/>
-        </w:rPr>
-        <w:t xml:space="preserve">3 + 4</w:t>
-      </w:r>
-      <w:r>
-        <w:t xml:space="preserve"> becomes </w:t>
-      </w:r>
-      <w:r>
-        <w:rPr>
-          <w:rFonts w:ascii="Consolas" w:cs="Consolas" w:eastAsia="Consolas" w:hAnsi="Consolas"/>
-          <w:color w:val="4659A7"/>
-          <w:shd w:fill="EEF1FA" w:val="clear"/>
-        </w:rPr>
-        <w:t xml:space="preserve">7</w:t>
-      </w:r>
-      <w:r>
-        <w:t xml:space="preserve">.</w:t>
-      </w:r>
-    </w:p>
-    <w:p>
-      <w:pPr>
-        <w:spacing w:after="120" w:line="300"/>
-      </w:pPr>
-      <w:r>
-        <w:rPr>
-          <w:b/>
-          <w:bCs/>
-          <w:color w:val="4659A7"/>
-        </w:rPr>
-        <w:t xml:space="preserve">2  </w:t>
-      </w:r>
-      <w:r>
-        <w:t xml:space="preserve">Strings use </w:t>
-      </w:r>
-      <w:r>
-        <w:rPr>
-          <w:rFonts w:ascii="Consolas" w:cs="Consolas" w:eastAsia="Consolas" w:hAnsi="Consolas"/>
-          <w:color w:val="4659A7"/>
-          <w:shd w:fill="EEF1FA" w:val="clear"/>
-        </w:rPr>
-        <w:t xml:space="preserve">+</w:t>
-      </w:r>
-      <w:r>
-        <w:t xml:space="preserve"> for joining: </w:t>
-      </w:r>
-      <w:r>
-        <w:rPr>
-          <w:rFonts w:ascii="Consolas" w:cs="Consolas" w:eastAsia="Consolas" w:hAnsi="Consolas"/>
-          <w:color w:val="4659A7"/>
-          <w:shd w:fill="EEF1FA" w:val="clear"/>
-        </w:rPr>
-        <w:t xml:space="preserve">"3" + "4"</w:t>
-      </w:r>
-      <w:r>
-        <w:t xml:space="preserve"> becomes </w:t>
-      </w:r>
-      <w:r>
-        <w:rPr>
-          <w:rFonts w:ascii="Consolas" w:cs="Consolas" w:eastAsia="Consolas" w:hAnsi="Consolas"/>
-          <w:color w:val="4659A7"/>
-          <w:shd w:fill="EEF1FA" w:val="clear"/>
-        </w:rPr>
-        <w:t xml:space="preserve">"34"</w:t>
-      </w:r>
-      <w:r>
-        <w:t xml:space="preserve">.</w:t>
-      </w:r>
-    </w:p>
+    <w:tbl>
+      <w:tblPr>
+        <w:tblW w:type="pct" w:w="100%"/>
+        <w:tblBorders>
+          <w:top w:val="single" w:color="auto" w:sz="4"/>
+          <w:left w:val="single" w:color="auto" w:sz="4"/>
+          <w:bottom w:val="single" w:color="auto" w:sz="4"/>
+          <w:right w:val="single" w:color="auto" w:sz="4"/>
+          <w:insideH w:val="single" w:color="auto" w:sz="4"/>
+          <w:insideV w:val="single" w:color="auto" w:sz="4"/>
+        </w:tblBorders>
+      </w:tblPr>
+      <w:tblGrid>
+        <w:gridCol w:w="100"/>
+      </w:tblGrid>
+      <w:tr>
+        <w:tc>
+          <w:tcPr>
+            <w:tcBorders>
+              <w:top w:val="single" w:color="D9E0EA" w:sz="2"/>
+              <w:left w:val="single" w:color="D9E0EA" w:sz="2"/>
+              <w:bottom w:val="single" w:color="D9E0EA" w:sz="2"/>
+              <w:right w:val="single" w:color="D9E0EA" w:sz="2"/>
+            </w:tcBorders>
+            <w:shd w:fill="F8FAFC" w:val="clear"/>
+            <w:tcMar>
+              <w:top w:type="dxa" w:w="130"/>
+              <w:left w:type="dxa" w:w="160"/>
+              <w:bottom w:type="dxa" w:w="130"/>
+              <w:right w:type="dxa" w:w="160"/>
+            </w:tcMar>
+          </w:tcPr>
+          <w:p>
+            <w:pPr>
+              <w:spacing w:after="120" w:line="300"/>
+            </w:pPr>
+            <w:r>
+              <w:rPr>
+                <w:b/>
+                <w:bCs/>
+                <w:color w:val="263A67"/>
+              </w:rPr>
+              <w:t xml:space="preserve">ARCHITECTURAL BLUEPRINT</w:t>
+            </w:r>
+          </w:p>
+          <w:p>
+            <w:pPr>
+              <w:jc w:val="center"/>
+            </w:pPr>
+            <w:r>
+              <w:drawing>
+                <wp:inline distT="0" distB="0" distL="0" distR="0">
+                  <wp:extent cx="5334000" cy="3552825"/>
+                  <wp:effectExtent t="0" r="0" b="0" l="0"/>
+                  <wp:docPr id="1" name="Two lanes compare integer addition with string joining using the plus symbol." descr="Two lanes compare integer addition with string joining using the plus symbol." title="Two lanes compare integer addition with string joining using the plus symbol."/>
+                  <wp:cNvGraphicFramePr>
+                    <a:graphicFrameLocks xmlns:a="http://schemas.openxmlformats.org/drawingml/2006/main" noChangeAspect="1"/>
+                  </wp:cNvGraphicFramePr>
+                  <a:graphic xmlns:a="http://schemas.openxmlformats.org/drawingml/2006/main">
+                    <a:graphicData uri="http://schemas.openxmlformats.org/drawingml/2006/picture">
+                      <pic:pic xmlns:pic="http://schemas.openxmlformats.org/drawingml/2006/picture">
+                        <pic:nvPicPr>
+                          <pic:cNvPr id="0" name="" descr=""/>
+                          <pic:cNvPicPr>
+                            <a:picLocks noChangeAspect="1" noChangeArrowheads="1"/>
+                          </pic:cNvPicPr>
+                        </pic:nvPicPr>
+                        <pic:blipFill>
+                          <a:blip r:embed="rId18" cstate="none"/>
+                          <a:srcRect/>
+                          <a:stretch>
+                            <a:fillRect/>
+                          </a:stretch>
+                        </pic:blipFill>
+                        <pic:spPr bwMode="auto">
+                          <a:xfrm>
+                            <a:off x="0" y="0"/>
+                            <a:ext cx="5334000" cy="3552825"/>
+                          </a:xfrm>
+                          <a:prstGeom prst="rect">
+                            <a:avLst/>
+                          </a:prstGeom>
+                        </pic:spPr>
+                      </pic:pic>
+                    </a:graphicData>
+                  </a:graphic>
+                </wp:inline>
+              </w:drawing>
+            </w:r>
+          </w:p>
+          <w:p>
+            <w:pPr>
+              <w:spacing w:after="120" w:line="300"/>
+              <w:jc w:val="center"/>
+            </w:pPr>
+            <w:r>
+              <w:rPr>
+                <w:i/>
+                <w:iCs/>
+                <w:color w:val="5B6575"/>
+                <w:sz w:val="19"/>
+                <w:szCs w:val="19"/>
+              </w:rPr>
+              <w:t xml:space="preserve">The type changes what the plus sign does.</w:t>
+            </w:r>
+          </w:p>
+          <w:p>
+            <w:pPr>
+              <w:spacing w:after="120" w:line="300"/>
+            </w:pPr>
+            <w:r>
+              <w:rPr>
+                <w:b/>
+                <w:bCs/>
+                <w:color w:val="4659A7"/>
+              </w:rPr>
+              <w:t xml:space="preserve">1  </w:t>
+            </w:r>
+            <w:r>
+              <w:t xml:space="preserve">Numbers use </w:t>
+            </w:r>
+            <w:r>
+              <w:rPr>
+                <w:rFonts w:ascii="Consolas" w:cs="Consolas" w:eastAsia="Consolas" w:hAnsi="Consolas"/>
+                <w:color w:val="4659A7"/>
+                <w:shd w:fill="EEF1FA" w:val="clear"/>
+              </w:rPr>
+              <w:t xml:space="preserve">+</w:t>
+            </w:r>
+            <w:r>
+              <w:t xml:space="preserve"> for addition: </w:t>
+            </w:r>
+            <w:r>
+              <w:rPr>
+                <w:rFonts w:ascii="Consolas" w:cs="Consolas" w:eastAsia="Consolas" w:hAnsi="Consolas"/>
+                <w:color w:val="4659A7"/>
+                <w:shd w:fill="EEF1FA" w:val="clear"/>
+              </w:rPr>
+              <w:t xml:space="preserve">3 + 4</w:t>
+            </w:r>
+            <w:r>
+              <w:t xml:space="preserve"> becomes </w:t>
+            </w:r>
+            <w:r>
+              <w:rPr>
+                <w:rFonts w:ascii="Consolas" w:cs="Consolas" w:eastAsia="Consolas" w:hAnsi="Consolas"/>
+                <w:color w:val="4659A7"/>
+                <w:shd w:fill="EEF1FA" w:val="clear"/>
+              </w:rPr>
+              <w:t xml:space="preserve">7</w:t>
+            </w:r>
+            <w:r>
+              <w:t xml:space="preserve">.</w:t>
+            </w:r>
+          </w:p>
+          <w:p>
+            <w:pPr>
+              <w:spacing w:after="120" w:line="300"/>
+            </w:pPr>
+            <w:r>
+              <w:rPr>
+                <w:b/>
+                <w:bCs/>
+                <w:color w:val="4659A7"/>
+              </w:rPr>
+              <w:t xml:space="preserve">2  </w:t>
+            </w:r>
+            <w:r>
+              <w:t xml:space="preserve">Strings use </w:t>
+            </w:r>
+            <w:r>
+              <w:rPr>
+                <w:rFonts w:ascii="Consolas" w:cs="Consolas" w:eastAsia="Consolas" w:hAnsi="Consolas"/>
+                <w:color w:val="4659A7"/>
+                <w:shd w:fill="EEF1FA" w:val="clear"/>
+              </w:rPr>
+              <w:t xml:space="preserve">+</w:t>
+            </w:r>
+            <w:r>
+              <w:t xml:space="preserve"> for joining: </w:t>
+            </w:r>
+            <w:r>
+              <w:rPr>
+                <w:rFonts w:ascii="Consolas" w:cs="Consolas" w:eastAsia="Consolas" w:hAnsi="Consolas"/>
+                <w:color w:val="4659A7"/>
+                <w:shd w:fill="EEF1FA" w:val="clear"/>
+              </w:rPr>
+              <w:t xml:space="preserve">"3" + "4"</w:t>
+            </w:r>
+            <w:r>
+              <w:t xml:space="preserve"> becomes </w:t>
+            </w:r>
+            <w:r>
+              <w:rPr>
+                <w:rFonts w:ascii="Consolas" w:cs="Consolas" w:eastAsia="Consolas" w:hAnsi="Consolas"/>
+                <w:color w:val="4659A7"/>
+                <w:shd w:fill="EEF1FA" w:val="clear"/>
+              </w:rPr>
+              <w:t xml:space="preserve">"34"</w:t>
+            </w:r>
+            <w:r>
+              <w:t xml:space="preserve">.</w:t>
+            </w:r>
+          </w:p>
+        </w:tc>
+      </w:tr>
+    </w:tbl>
     <w:tbl>
       <w:tblPr>
         <w:tblW w:type="pct" w:w="100%"/>
@@ -11456,7 +11888,7 @@
       </w:r>
     </w:p>
     <w:p>
-      <w:hyperlink w:history="1" r:id="rIdag7rpyh44jmztjhwtbrus">
+      <w:hyperlink w:history="1" r:id="rIdznjc3utvvr0t_luiwwufp">
         <w:r>
           <w:rPr>
             <w:rStyle w:val="Hyperlink"/>

</xml_diff>

<commit_message>
Implement split grid layout placing mission images around text and architectural images alongside text in modern UI boxes
Co-authored-by: arena-agent <297053741+arena-agent@users.noreply.github.com>
</commit_message>
<xml_diff>
--- a/public/books/python-absolute-beginners/edition-01/Python-for-Absolute-Beginners-The-First-Code-Series-Book-1.docx
+++ b/public/books/python-absolute-beginners/edition-01/Python-for-Absolute-Beginners-The-First-Code-Series-Book-1.docx
@@ -773,7 +773,7 @@
       </w:r>
     </w:p>
     <w:p>
-      <w:hyperlink w:history="1" r:id="rIdwe-zhmf44po0fa3friroz">
+      <w:hyperlink w:history="1" r:id="rIdfhavvqnccvbjz3s8hid22">
         <w:r>
           <w:rPr>
             <w:rStyle w:val="Hyperlink"/>
@@ -791,7 +791,7 @@
       </w:r>
     </w:p>
     <w:p>
-      <w:hyperlink w:history="1" r:id="rIdk1zxhga5pa6jyq6re3otz">
+      <w:hyperlink w:history="1" r:id="rIdmnydnejxtuvqoxhu6devm">
         <w:r>
           <w:rPr>
             <w:rStyle w:val="Hyperlink"/>
@@ -3140,7 +3140,7 @@
       </w:r>
     </w:p>
     <w:p>
-      <w:hyperlink w:history="1" r:id="rIdnuhvsp8yhkzyjldzonmfl">
+      <w:hyperlink w:history="1" r:id="rId955undkruman39cggnpys">
         <w:r>
           <w:rPr>
             <w:rStyle w:val="Hyperlink"/>
@@ -3158,7 +3158,7 @@
       </w:r>
     </w:p>
     <w:p>
-      <w:hyperlink w:history="1" r:id="rIdnurj_1_zbtwfs8enmylvu">
+      <w:hyperlink w:history="1" r:id="rIdcgkzpl8uwrfsyyi_kisv3">
         <w:r>
           <w:rPr>
             <w:rStyle w:val="Hyperlink"/>
@@ -7027,7 +7027,7 @@
       </w:r>
     </w:p>
     <w:p>
-      <w:hyperlink w:history="1" r:id="rIdq6olt6avwckzysb_0r2fc">
+      <w:hyperlink w:history="1" r:id="rId-bfnrfipzyhmuy4jhqxxa">
         <w:r>
           <w:rPr>
             <w:rStyle w:val="Hyperlink"/>
@@ -7045,7 +7045,7 @@
       </w:r>
     </w:p>
     <w:p>
-      <w:hyperlink w:history="1" r:id="rIdfghakxm75-uaczkowtnbl">
+      <w:hyperlink w:history="1" r:id="rIdwbew3kyx5mmjcondtnfnn">
         <w:r>
           <w:rPr>
             <w:rStyle w:val="Hyperlink"/>
@@ -7063,7 +7063,7 @@
       </w:r>
     </w:p>
     <w:p>
-      <w:hyperlink w:history="1" r:id="rId-nmuzf87pwc7jg47mlj8g">
+      <w:hyperlink w:history="1" r:id="rIderpves8mc-bvhrzq-slx6">
         <w:r>
           <w:rPr>
             <w:rStyle w:val="Hyperlink"/>
@@ -9117,7 +9117,7 @@
       </w:r>
     </w:p>
     <w:p>
-      <w:hyperlink w:history="1" r:id="rIdwig2e8cblat9fkfxt3smz">
+      <w:hyperlink w:history="1" r:id="rIdkdlrf0wk2j_r-z9nktfim">
         <w:r>
           <w:rPr>
             <w:rStyle w:val="Hyperlink"/>
@@ -9135,7 +9135,7 @@
       </w:r>
     </w:p>
     <w:p>
-      <w:hyperlink w:history="1" r:id="rIdkogu6yywft3rjbjlbhqfo">
+      <w:hyperlink w:history="1" r:id="rIdqqh8laoiufisj1d-906qh">
         <w:r>
           <w:rPr>
             <w:rStyle w:val="Hyperlink"/>
@@ -11888,7 +11888,7 @@
       </w:r>
     </w:p>
     <w:p>
-      <w:hyperlink w:history="1" r:id="rIdznjc3utvvr0t_luiwwufp">
+      <w:hyperlink w:history="1" r:id="rIdtmirpgbs5m0r3jtvhh2bw">
         <w:r>
           <w:rPr>
             <w:rStyle w:val="Hyperlink"/>

</xml_diff>

<commit_message>
Optimize float wrap layout for mission images and modern UI concept boxes
Co-authored-by: arena-agent <297053741+arena-agent@users.noreply.github.com>
</commit_message>
<xml_diff>
--- a/public/books/python-absolute-beginners/edition-01/Python-for-Absolute-Beginners-The-First-Code-Series-Book-1.docx
+++ b/public/books/python-absolute-beginners/edition-01/Python-for-Absolute-Beginners-The-First-Code-Series-Book-1.docx
@@ -773,7 +773,7 @@
       </w:r>
     </w:p>
     <w:p>
-      <w:hyperlink w:history="1" r:id="rIdfhavvqnccvbjz3s8hid22">
+      <w:hyperlink w:history="1" r:id="rId4g-w3i37gfklso95bkjvt">
         <w:r>
           <w:rPr>
             <w:rStyle w:val="Hyperlink"/>
@@ -791,7 +791,7 @@
       </w:r>
     </w:p>
     <w:p>
-      <w:hyperlink w:history="1" r:id="rIdmnydnejxtuvqoxhu6devm">
+      <w:hyperlink w:history="1" r:id="rIdfnaarxbw_3jifxmqw0o3u">
         <w:r>
           <w:rPr>
             <w:rStyle w:val="Hyperlink"/>
@@ -3140,7 +3140,7 @@
       </w:r>
     </w:p>
     <w:p>
-      <w:hyperlink w:history="1" r:id="rId955undkruman39cggnpys">
+      <w:hyperlink w:history="1" r:id="rId-ou9su1cucfmtcvzsr3ob">
         <w:r>
           <w:rPr>
             <w:rStyle w:val="Hyperlink"/>
@@ -3158,7 +3158,7 @@
       </w:r>
     </w:p>
     <w:p>
-      <w:hyperlink w:history="1" r:id="rIdcgkzpl8uwrfsyyi_kisv3">
+      <w:hyperlink w:history="1" r:id="rId914igribn7mdh-il6ouwp">
         <w:r>
           <w:rPr>
             <w:rStyle w:val="Hyperlink"/>
@@ -7027,7 +7027,7 @@
       </w:r>
     </w:p>
     <w:p>
-      <w:hyperlink w:history="1" r:id="rId-bfnrfipzyhmuy4jhqxxa">
+      <w:hyperlink w:history="1" r:id="rIdanfmbyuqk1qdepmj6mdoc">
         <w:r>
           <w:rPr>
             <w:rStyle w:val="Hyperlink"/>
@@ -7045,7 +7045,7 @@
       </w:r>
     </w:p>
     <w:p>
-      <w:hyperlink w:history="1" r:id="rIdwbew3kyx5mmjcondtnfnn">
+      <w:hyperlink w:history="1" r:id="rIdkxbzcege_h0au5-cnx4yd">
         <w:r>
           <w:rPr>
             <w:rStyle w:val="Hyperlink"/>
@@ -7063,7 +7063,7 @@
       </w:r>
     </w:p>
     <w:p>
-      <w:hyperlink w:history="1" r:id="rIderpves8mc-bvhrzq-slx6">
+      <w:hyperlink w:history="1" r:id="rIdujoifkyo2dunpbqwxac4v">
         <w:r>
           <w:rPr>
             <w:rStyle w:val="Hyperlink"/>
@@ -9117,7 +9117,7 @@
       </w:r>
     </w:p>
     <w:p>
-      <w:hyperlink w:history="1" r:id="rIdkdlrf0wk2j_r-z9nktfim">
+      <w:hyperlink w:history="1" r:id="rIdyjjiljuw1ldmmbtxob4xs">
         <w:r>
           <w:rPr>
             <w:rStyle w:val="Hyperlink"/>
@@ -9135,7 +9135,7 @@
       </w:r>
     </w:p>
     <w:p>
-      <w:hyperlink w:history="1" r:id="rIdqqh8laoiufisj1d-906qh">
+      <w:hyperlink w:history="1" r:id="rId6wpnuftou-fxzmhm1emvq">
         <w:r>
           <w:rPr>
             <w:rStyle w:val="Hyperlink"/>
@@ -11888,7 +11888,7 @@
       </w:r>
     </w:p>
     <w:p>
-      <w:hyperlink w:history="1" r:id="rIdtmirpgbs5m0r3jtvhh2bw">
+      <w:hyperlink w:history="1" r:id="rId-hj24hg-olyct09kdgzm9">
         <w:r>
           <w:rPr>
             <w:rStyle w:val="Hyperlink"/>

</xml_diff>

<commit_message>
chore: sync public files
Co-authored-by: arena-agent <297053741+arena-agent@users.noreply.github.com>
</commit_message>
<xml_diff>
--- a/public/books/python-absolute-beginners/edition-01/Python-for-Absolute-Beginners-The-First-Code-Series-Book-1.docx
+++ b/public/books/python-absolute-beginners/edition-01/Python-for-Absolute-Beginners-The-First-Code-Series-Book-1.docx
@@ -773,7 +773,7 @@
       </w:r>
     </w:p>
     <w:p>
-      <w:hyperlink w:history="1" r:id="rIda9izhk_oteskylabdq52q">
+      <w:hyperlink w:history="1" r:id="rIdu5i5jemn-wkmcwaga6iqf">
         <w:r>
           <w:rPr>
             <w:rStyle w:val="Hyperlink"/>
@@ -791,7 +791,7 @@
       </w:r>
     </w:p>
     <w:p>
-      <w:hyperlink w:history="1" r:id="rIdxsi0qovwoesonukawhagx">
+      <w:hyperlink w:history="1" r:id="rIdvs15k5dd1u22ogdcuvhuw">
         <w:r>
           <w:rPr>
             <w:rStyle w:val="Hyperlink"/>
@@ -3140,7 +3140,7 @@
       </w:r>
     </w:p>
     <w:p>
-      <w:hyperlink w:history="1" r:id="rIdpo4bcsrknkb8qje9u5c7n">
+      <w:hyperlink w:history="1" r:id="rIdxlm0tbcuzgkr8zgruhhtl">
         <w:r>
           <w:rPr>
             <w:rStyle w:val="Hyperlink"/>
@@ -3158,7 +3158,7 @@
       </w:r>
     </w:p>
     <w:p>
-      <w:hyperlink w:history="1" r:id="rIdccpzrtmr7gj_38j7byztd">
+      <w:hyperlink w:history="1" r:id="rIdms4x-sbj4mcateu5dlg7n">
         <w:r>
           <w:rPr>
             <w:rStyle w:val="Hyperlink"/>
@@ -7027,7 +7027,7 @@
       </w:r>
     </w:p>
     <w:p>
-      <w:hyperlink w:history="1" r:id="rIdlbfem-gzmxynqf4ipdquo">
+      <w:hyperlink w:history="1" r:id="rIdoeyd8d38obr7b3p_yxaiq">
         <w:r>
           <w:rPr>
             <w:rStyle w:val="Hyperlink"/>
@@ -7045,7 +7045,7 @@
       </w:r>
     </w:p>
     <w:p>
-      <w:hyperlink w:history="1" r:id="rIdahu0txo7ntenx4jenvijd">
+      <w:hyperlink w:history="1" r:id="rId3xqzlynhd_niaijxcuyln">
         <w:r>
           <w:rPr>
             <w:rStyle w:val="Hyperlink"/>
@@ -7063,7 +7063,7 @@
       </w:r>
     </w:p>
     <w:p>
-      <w:hyperlink w:history="1" r:id="rIddilivc6g8zsj6bnw4ckxh">
+      <w:hyperlink w:history="1" r:id="rId8cjepszidml49okbzxc9o">
         <w:r>
           <w:rPr>
             <w:rStyle w:val="Hyperlink"/>
@@ -9117,7 +9117,7 @@
       </w:r>
     </w:p>
     <w:p>
-      <w:hyperlink w:history="1" r:id="rId223drkpxaxcziwchlf0tt">
+      <w:hyperlink w:history="1" r:id="rIdb15lsg8iuzvybqtdvipsi">
         <w:r>
           <w:rPr>
             <w:rStyle w:val="Hyperlink"/>
@@ -9135,7 +9135,7 @@
       </w:r>
     </w:p>
     <w:p>
-      <w:hyperlink w:history="1" r:id="rIdrxwzfaiixkskthcce2iro">
+      <w:hyperlink w:history="1" r:id="rIdadrp1kgtufmlcpxvz5fq2">
         <w:r>
           <w:rPr>
             <w:rStyle w:val="Hyperlink"/>
@@ -11888,7 +11888,7 @@
       </w:r>
     </w:p>
     <w:p>
-      <w:hyperlink w:history="1" r:id="rId3byduqcdg8jvmi8wn--tt">
+      <w:hyperlink w:history="1" r:id="rIdo9yftwf_paecr5lvobpdi">
         <w:r>
           <w:rPr>
             <w:rStyle w:val="Hyperlink"/>

</xml_diff>